<commit_message>
feat: update portfolio details including experience, skills, and projects
</commit_message>
<xml_diff>
--- a/public/OdayTarek.docx
+++ b/public/OdayTarek.docx
@@ -5,14 +5,17 @@
     <w:p>
       <w:pPr>
         <w:pStyle w:val="Heading1"/>
-        <w:rPr>
-          <w:rFonts w:ascii="Calibri" w:eastAsia="Times New Roman" w:hAnsi="Calibri" w:cs="Calibri"/>
-          <w:lang w:val="en"/>
-        </w:rPr>
-      </w:pPr>
-      <w:r>
-        <w:rPr>
-          <w:rFonts w:ascii="Calibri" w:eastAsia="Times New Roman" w:hAnsi="Calibri" w:cs="Calibri"/>
+        <w:jc w:val="center"/>
+        <w:rPr>
+          <w:rFonts w:ascii="Calibri" w:eastAsia="Times New Roman" w:hAnsi="Calibri" w:cs="Calibri"/>
+          <w:sz w:val="44"/>
+          <w:lang w:val="en"/>
+        </w:rPr>
+      </w:pPr>
+      <w:r>
+        <w:rPr>
+          <w:rFonts w:ascii="Calibri" w:eastAsia="Times New Roman" w:hAnsi="Calibri" w:cs="Calibri"/>
+          <w:sz w:val="44"/>
           <w:lang w:val="en"/>
         </w:rPr>
         <w:t>ODAY TAREK HANAFI</w:t>
@@ -20,6 +23,8 @@
     </w:p>
     <w:p>
       <w:pPr>
+        <w:spacing w:after="40"/>
+        <w:jc w:val="center"/>
         <w:divId w:val="2106685271"/>
         <w:rPr>
           <w:rFonts w:ascii="Calibri" w:eastAsia="Times New Roman" w:hAnsi="Calibri" w:cs="Calibri"/>
@@ -27,7 +32,7 @@
           <w:bCs/>
           <w:color w:val="1D4E89"/>
           <w:spacing w:val="6"/>
-          <w:sz w:val="23"/>
+          <w:sz w:val="25"/>
           <w:szCs w:val="23"/>
           <w:lang w:val="en"/>
         </w:rPr>
@@ -39,7 +44,7 @@
           <w:bCs/>
           <w:color w:val="1D4E89"/>
           <w:spacing w:val="6"/>
-          <w:sz w:val="23"/>
+          <w:sz w:val="25"/>
           <w:szCs w:val="23"/>
           <w:lang w:val="en"/>
         </w:rPr>
@@ -48,11 +53,12 @@
     </w:p>
     <w:p>
       <w:pPr>
+        <w:jc w:val="center"/>
         <w:divId w:val="2117868967"/>
         <w:rPr>
           <w:rFonts w:ascii="Calibri" w:eastAsia="Times New Roman" w:hAnsi="Calibri" w:cs="Calibri"/>
           <w:color w:val="3E4C59"/>
-          <w:sz w:val="19"/>
+          <w:sz w:val="20"/>
           <w:szCs w:val="19"/>
           <w:lang w:val="en"/>
         </w:rPr>
@@ -61,7 +67,7 @@
         <w:rPr>
           <w:rFonts w:ascii="Calibri" w:eastAsia="Times New Roman" w:hAnsi="Calibri" w:cs="Calibri"/>
           <w:color w:val="3E4C59"/>
-          <w:sz w:val="19"/>
+          <w:sz w:val="20"/>
           <w:szCs w:val="19"/>
           <w:lang w:val="en"/>
         </w:rPr>
@@ -71,7 +77,7 @@
         <w:rPr>
           <w:rStyle w:val="sep2"/>
           <w:rFonts w:ascii="Calibri" w:eastAsia="Times New Roman" w:hAnsi="Calibri" w:cs="Calibri"/>
-          <w:sz w:val="19"/>
+          <w:sz w:val="20"/>
           <w:szCs w:val="19"/>
           <w:lang w:val="en"/>
         </w:rPr>
@@ -81,7 +87,7 @@
         <w:rPr>
           <w:rFonts w:ascii="Calibri" w:eastAsia="Times New Roman" w:hAnsi="Calibri" w:cs="Calibri"/>
           <w:color w:val="3E4C59"/>
-          <w:sz w:val="19"/>
+          <w:sz w:val="20"/>
           <w:szCs w:val="19"/>
           <w:lang w:val="en"/>
         </w:rPr>
@@ -91,7 +97,7 @@
         <w:rPr>
           <w:rStyle w:val="sep2"/>
           <w:rFonts w:ascii="Calibri" w:eastAsia="Times New Roman" w:hAnsi="Calibri" w:cs="Calibri"/>
-          <w:sz w:val="19"/>
+          <w:sz w:val="20"/>
           <w:szCs w:val="19"/>
           <w:lang w:val="en"/>
         </w:rPr>
@@ -101,7 +107,7 @@
         <w:rPr>
           <w:rFonts w:ascii="Calibri" w:eastAsia="Times New Roman" w:hAnsi="Calibri" w:cs="Calibri"/>
           <w:color w:val="3E4C59"/>
-          <w:sz w:val="19"/>
+          <w:sz w:val="20"/>
           <w:szCs w:val="19"/>
           <w:lang w:val="en"/>
         </w:rPr>
@@ -111,7 +117,7 @@
         <w:rPr>
           <w:rStyle w:val="sep2"/>
           <w:rFonts w:ascii="Calibri" w:eastAsia="Times New Roman" w:hAnsi="Calibri" w:cs="Calibri"/>
-          <w:sz w:val="19"/>
+          <w:sz w:val="20"/>
           <w:szCs w:val="19"/>
           <w:lang w:val="en"/>
         </w:rPr>
@@ -121,18 +127,18 @@
         <w:rPr>
           <w:rFonts w:ascii="Calibri" w:eastAsia="Times New Roman" w:hAnsi="Calibri" w:cs="Calibri"/>
           <w:color w:val="3E4C59"/>
-          <w:sz w:val="19"/>
+          <w:sz w:val="20"/>
           <w:szCs w:val="19"/>
           <w:lang w:val="en"/>
         </w:rPr>
         <w:t xml:space="preserve"> </w:t>
       </w:r>
-      <w:hyperlink r:id="rId5" w:history="1">
+      <w:hyperlink r:id="rId7" w:history="1">
         <w:r>
           <w:rPr>
             <w:rStyle w:val="Hyperlink"/>
             <w:rFonts w:ascii="Calibri" w:eastAsia="Times New Roman" w:hAnsi="Calibri" w:cs="Calibri"/>
-            <w:sz w:val="19"/>
+            <w:sz w:val="20"/>
             <w:szCs w:val="19"/>
             <w:lang w:val="en"/>
           </w:rPr>
@@ -143,7 +149,7 @@
         <w:rPr>
           <w:rFonts w:ascii="Calibri" w:eastAsia="Times New Roman" w:hAnsi="Calibri" w:cs="Calibri"/>
           <w:color w:val="3E4C59"/>
-          <w:sz w:val="19"/>
+          <w:sz w:val="20"/>
           <w:szCs w:val="19"/>
           <w:lang w:val="en"/>
         </w:rPr>
@@ -152,21 +158,23 @@
     </w:p>
     <w:p>
       <w:pPr>
+        <w:spacing w:after="80"/>
+        <w:jc w:val="center"/>
         <w:divId w:val="360320661"/>
         <w:rPr>
           <w:rFonts w:ascii="Calibri" w:eastAsia="Times New Roman" w:hAnsi="Calibri" w:cs="Calibri"/>
           <w:color w:val="1F2933"/>
-          <w:sz w:val="19"/>
-          <w:szCs w:val="19"/>
-          <w:lang w:val="en"/>
-        </w:rPr>
-      </w:pPr>
-      <w:hyperlink r:id="rId6" w:history="1">
+          <w:sz w:val="20"/>
+          <w:szCs w:val="19"/>
+          <w:lang w:val="en"/>
+        </w:rPr>
+      </w:pPr>
+      <w:hyperlink r:id="rId8" w:history="1">
         <w:r>
           <w:rPr>
             <w:rStyle w:val="Hyperlink"/>
             <w:rFonts w:ascii="Calibri" w:eastAsia="Times New Roman" w:hAnsi="Calibri" w:cs="Calibri"/>
-            <w:sz w:val="19"/>
+            <w:sz w:val="20"/>
             <w:szCs w:val="19"/>
             <w:lang w:val="en"/>
           </w:rPr>
@@ -176,8 +184,8 @@
       <w:r>
         <w:rPr>
           <w:rFonts w:ascii="Calibri" w:eastAsia="Times New Roman" w:hAnsi="Calibri" w:cs="Calibri"/>
-          <w:color w:val="1F2933"/>
-          <w:sz w:val="19"/>
+          <w:color w:val="9AA5B1"/>
+          <w:sz w:val="20"/>
           <w:szCs w:val="19"/>
           <w:lang w:val="en"/>
         </w:rPr>
@@ -187,8 +195,8 @@
         <w:rPr>
           <w:rStyle w:val="sep3"/>
           <w:rFonts w:ascii="Calibri" w:eastAsia="Times New Roman" w:hAnsi="Calibri" w:cs="Calibri"/>
-          <w:color w:val="1F2933"/>
-          <w:sz w:val="19"/>
+          <w:color w:val="9AA5B1"/>
+          <w:sz w:val="20"/>
           <w:szCs w:val="19"/>
           <w:lang w:val="en"/>
         </w:rPr>
@@ -197,953 +205,1950 @@
       <w:r>
         <w:rPr>
           <w:rFonts w:ascii="Calibri" w:eastAsia="Times New Roman" w:hAnsi="Calibri" w:cs="Calibri"/>
-          <w:color w:val="1F2933"/>
-          <w:sz w:val="19"/>
+          <w:color w:val="9AA5B1"/>
+          <w:sz w:val="20"/>
           <w:szCs w:val="19"/>
           <w:lang w:val="en"/>
         </w:rPr>
         <w:t xml:space="preserve"> </w:t>
-      </w:r>
-      <w:hyperlink r:id="rId7" w:history="1">
-        <w:r>
-          <w:rPr>
-            <w:rStyle w:val="Hyperlink"/>
-            <w:rFonts w:ascii="Calibri" w:eastAsia="Times New Roman" w:hAnsi="Calibri" w:cs="Calibri"/>
-            <w:sz w:val="19"/>
-            <w:szCs w:val="19"/>
-            <w:lang w:val="en"/>
-          </w:rPr>
-          <w:t>linkedin.com/in/odaytarek</w:t>
-        </w:r>
-      </w:hyperlink>
-      <w:r>
-        <w:rPr>
-          <w:rFonts w:ascii="Calibri" w:eastAsia="Times New Roman" w:hAnsi="Calibri" w:cs="Calibri"/>
-          <w:color w:val="1F2933"/>
-          <w:sz w:val="19"/>
-          <w:szCs w:val="19"/>
-          <w:lang w:val="en"/>
-        </w:rPr>
-        <w:t xml:space="preserve"> </w:t>
-      </w:r>
-      <w:r>
-        <w:rPr>
-          <w:rStyle w:val="sep3"/>
-          <w:rFonts w:ascii="Calibri" w:eastAsia="Times New Roman" w:hAnsi="Calibri" w:cs="Calibri"/>
-          <w:color w:val="1F2933"/>
-          <w:sz w:val="19"/>
-          <w:szCs w:val="19"/>
-          <w:lang w:val="en"/>
-        </w:rPr>
-        <w:t>|</w:t>
-      </w:r>
-      <w:r>
-        <w:rPr>
-          <w:rFonts w:ascii="Calibri" w:eastAsia="Times New Roman" w:hAnsi="Calibri" w:cs="Calibri"/>
-          <w:color w:val="1F2933"/>
-          <w:sz w:val="19"/>
-          <w:szCs w:val="19"/>
-          <w:lang w:val="en"/>
-        </w:rPr>
-        <w:t xml:space="preserve"> </w:t>
-      </w:r>
-      <w:hyperlink r:id="rId8" w:history="1">
-        <w:r>
-          <w:rPr>
-            <w:rStyle w:val="Hyperlink"/>
-            <w:rFonts w:ascii="Calibri" w:eastAsia="Times New Roman" w:hAnsi="Calibri" w:cs="Calibri"/>
-            <w:sz w:val="19"/>
-            <w:szCs w:val="19"/>
-            <w:lang w:val="en"/>
-          </w:rPr>
-          <w:t>Portfolio</w:t>
-        </w:r>
-      </w:hyperlink>
-      <w:r>
-        <w:rPr>
-          <w:rFonts w:ascii="Calibri" w:eastAsia="Times New Roman" w:hAnsi="Calibri" w:cs="Calibri"/>
-          <w:color w:val="1F2933"/>
-          <w:sz w:val="19"/>
-          <w:szCs w:val="19"/>
-          <w:lang w:val="en"/>
-        </w:rPr>
-        <w:t xml:space="preserve"> </w:t>
-      </w:r>
-    </w:p>
-    <w:p>
-      <w:pPr>
-        <w:pStyle w:val="Heading2"/>
-        <w:rPr>
-          <w:rFonts w:ascii="Calibri" w:eastAsia="Times New Roman" w:hAnsi="Calibri" w:cs="Calibri"/>
-          <w:lang w:val="en"/>
-        </w:rPr>
-      </w:pPr>
-      <w:r>
-        <w:rPr>
-          <w:rFonts w:ascii="Calibri" w:eastAsia="Times New Roman" w:hAnsi="Calibri" w:cs="Calibri"/>
-          <w:lang w:val="en"/>
-        </w:rPr>
-        <w:t>Summary</w:t>
-      </w:r>
-    </w:p>
-    <w:p>
-      <w:pPr>
-        <w:pStyle w:val="NormalWeb"/>
-        <w:rPr>
-          <w:rFonts w:ascii="Calibri" w:hAnsi="Calibri" w:cs="Calibri"/>
-          <w:color w:val="1F2933"/>
-          <w:sz w:val="19"/>
-          <w:szCs w:val="19"/>
-          <w:lang w:val="en"/>
-        </w:rPr>
-      </w:pPr>
-      <w:r>
-        <w:rPr>
-          <w:rFonts w:ascii="Calibri" w:hAnsi="Calibri" w:cs="Calibri"/>
-          <w:color w:val="1F2933"/>
-          <w:sz w:val="19"/>
-          <w:szCs w:val="19"/>
-          <w:lang w:val="en"/>
-        </w:rPr>
-        <w:t>Full-stack developer with 2+ years building cloud-native web applications across the JavaScript/TypeScript stack (React, Next.js, Vue, Node.js, NestJS). Specialized in event-driven microservices with RabbitMQ and Kafka, GraphQL/REST API design, and GCP/AWS deployments using Docker, Kubernetes, and CI/CD. Cut API response times up to 40% through Redis caching and query optimization.</w:t>
-      </w:r>
-    </w:p>
-    <w:p>
-      <w:pPr>
-        <w:pStyle w:val="Heading2"/>
-        <w:rPr>
-          <w:rFonts w:ascii="Calibri" w:eastAsia="Times New Roman" w:hAnsi="Calibri" w:cs="Calibri"/>
-          <w:lang w:val="en"/>
-        </w:rPr>
-      </w:pPr>
-      <w:r>
-        <w:rPr>
-          <w:rFonts w:ascii="Calibri" w:eastAsia="Times New Roman" w:hAnsi="Calibri" w:cs="Calibri"/>
-          <w:lang w:val="en"/>
-        </w:rPr>
-        <w:t>Skills</w:t>
-      </w:r>
-    </w:p>
-    <w:p>
-      <w:pPr>
-        <w:divId w:val="666781"/>
-        <w:rPr>
-          <w:rFonts w:ascii="Calibri" w:eastAsia="Times New Roman" w:hAnsi="Calibri" w:cs="Calibri"/>
-          <w:color w:val="1F2933"/>
-          <w:sz w:val="19"/>
-          <w:szCs w:val="19"/>
-          <w:lang w:val="en"/>
-        </w:rPr>
-      </w:pPr>
-      <w:r>
-        <w:rPr>
-          <w:rStyle w:val="label2"/>
-          <w:rFonts w:ascii="Calibri" w:eastAsia="Times New Roman" w:hAnsi="Calibri" w:cs="Calibri"/>
-          <w:sz w:val="19"/>
-          <w:szCs w:val="19"/>
-          <w:lang w:val="en"/>
-        </w:rPr>
-        <w:t>Languages:</w:t>
-      </w:r>
-      <w:r>
-        <w:rPr>
-          <w:rFonts w:ascii="Calibri" w:eastAsia="Times New Roman" w:hAnsi="Calibri" w:cs="Calibri"/>
-          <w:color w:val="1F2933"/>
-          <w:sz w:val="19"/>
-          <w:szCs w:val="19"/>
-          <w:lang w:val="en"/>
-        </w:rPr>
-        <w:t xml:space="preserve"> JavaScript, TypeScript, Go (working knowledge)</w:t>
-      </w:r>
-    </w:p>
-    <w:p>
-      <w:pPr>
-        <w:divId w:val="322010301"/>
-        <w:rPr>
-          <w:rFonts w:ascii="Calibri" w:eastAsia="Times New Roman" w:hAnsi="Calibri" w:cs="Calibri"/>
-          <w:color w:val="1F2933"/>
-          <w:sz w:val="19"/>
-          <w:szCs w:val="19"/>
-          <w:lang w:val="en"/>
-        </w:rPr>
-      </w:pPr>
-      <w:r>
-        <w:rPr>
-          <w:rStyle w:val="label2"/>
-          <w:rFonts w:ascii="Calibri" w:eastAsia="Times New Roman" w:hAnsi="Calibri" w:cs="Calibri"/>
-          <w:sz w:val="19"/>
-          <w:szCs w:val="19"/>
-          <w:lang w:val="en"/>
-        </w:rPr>
-        <w:t>Frontend:</w:t>
-      </w:r>
-      <w:r>
-        <w:rPr>
-          <w:rFonts w:ascii="Calibri" w:eastAsia="Times New Roman" w:hAnsi="Calibri" w:cs="Calibri"/>
-          <w:color w:val="1F2933"/>
-          <w:sz w:val="19"/>
-          <w:szCs w:val="19"/>
-          <w:lang w:val="en"/>
-        </w:rPr>
-        <w:t xml:space="preserve"> </w:t>
-      </w:r>
-      <w:r>
-        <w:rPr>
-          <w:rFonts w:ascii="Calibri" w:eastAsia="Times New Roman" w:hAnsi="Calibri" w:cs="Calibri"/>
-          <w:color w:val="1F2933"/>
-          <w:sz w:val="19"/>
-          <w:szCs w:val="19"/>
-          <w:lang w:val="en"/>
-        </w:rPr>
-        <w:t>React, Next.js, Vue, Nuxt, Redux, Tailwind CSS, TanStack</w:t>
-      </w:r>
-    </w:p>
-    <w:p>
-      <w:pPr>
-        <w:divId w:val="2136828915"/>
-        <w:rPr>
-          <w:rFonts w:ascii="Calibri" w:eastAsia="Times New Roman" w:hAnsi="Calibri" w:cs="Calibri"/>
-          <w:color w:val="1F2933"/>
-          <w:sz w:val="19"/>
-          <w:szCs w:val="19"/>
-          <w:lang w:val="en"/>
-        </w:rPr>
-      </w:pPr>
-      <w:r>
-        <w:rPr>
-          <w:rStyle w:val="label2"/>
-          <w:rFonts w:ascii="Calibri" w:eastAsia="Times New Roman" w:hAnsi="Calibri" w:cs="Calibri"/>
-          <w:sz w:val="19"/>
-          <w:szCs w:val="19"/>
-          <w:lang w:val="en"/>
-        </w:rPr>
-        <w:t>Backend:</w:t>
-      </w:r>
-      <w:r>
-        <w:rPr>
-          <w:rFonts w:ascii="Calibri" w:eastAsia="Times New Roman" w:hAnsi="Calibri" w:cs="Calibri"/>
-          <w:color w:val="1F2933"/>
-          <w:sz w:val="19"/>
-          <w:szCs w:val="19"/>
-          <w:lang w:val="en"/>
-        </w:rPr>
-        <w:t xml:space="preserve"> Node.js, NestJS, GraphQL, REST APIs, Microservices, RabbitMQ, Kafka, WebSockets/Socket.io</w:t>
-      </w:r>
-    </w:p>
-    <w:p>
-      <w:pPr>
-        <w:divId w:val="2039309649"/>
-        <w:rPr>
-          <w:rFonts w:ascii="Calibri" w:eastAsia="Times New Roman" w:hAnsi="Calibri" w:cs="Calibri"/>
-          <w:color w:val="1F2933"/>
-          <w:sz w:val="19"/>
-          <w:szCs w:val="19"/>
-          <w:lang w:val="en"/>
-        </w:rPr>
-      </w:pPr>
-      <w:r>
-        <w:rPr>
-          <w:rStyle w:val="label2"/>
-          <w:rFonts w:ascii="Calibri" w:eastAsia="Times New Roman" w:hAnsi="Calibri" w:cs="Calibri"/>
-          <w:sz w:val="19"/>
-          <w:szCs w:val="19"/>
-          <w:lang w:val="en"/>
-        </w:rPr>
-        <w:t>Databases:</w:t>
-      </w:r>
-      <w:r>
-        <w:rPr>
-          <w:rFonts w:ascii="Calibri" w:eastAsia="Times New Roman" w:hAnsi="Calibri" w:cs="Calibri"/>
-          <w:color w:val="1F2933"/>
-          <w:sz w:val="19"/>
-          <w:szCs w:val="19"/>
-          <w:lang w:val="en"/>
-        </w:rPr>
-        <w:t xml:space="preserve"> PostgreSQL, MongoDB, Redis</w:t>
-      </w:r>
-    </w:p>
-    <w:p>
-      <w:pPr>
-        <w:divId w:val="1991906828"/>
-        <w:rPr>
-          <w:rFonts w:ascii="Calibri" w:eastAsia="Times New Roman" w:hAnsi="Calibri" w:cs="Calibri"/>
-          <w:color w:val="1F2933"/>
-          <w:sz w:val="19"/>
-          <w:szCs w:val="19"/>
-          <w:lang w:val="en"/>
-        </w:rPr>
-      </w:pPr>
-      <w:r>
-        <w:rPr>
-          <w:rStyle w:val="label2"/>
-          <w:rFonts w:ascii="Calibri" w:eastAsia="Times New Roman" w:hAnsi="Calibri" w:cs="Calibri"/>
-          <w:sz w:val="19"/>
-          <w:szCs w:val="19"/>
-          <w:lang w:val="en"/>
-        </w:rPr>
-        <w:t>Cloud &amp; DevOps:</w:t>
-      </w:r>
-      <w:r>
-        <w:rPr>
-          <w:rFonts w:ascii="Calibri" w:eastAsia="Times New Roman" w:hAnsi="Calibri" w:cs="Calibri"/>
-          <w:color w:val="1F2933"/>
-          <w:sz w:val="19"/>
-          <w:szCs w:val="19"/>
-          <w:lang w:val="en"/>
-        </w:rPr>
-        <w:t xml:space="preserve"> Google Cloud Platform (GCP), AWS, Docker, Kubernetes, Nginx, CI/CD, Turborepo</w:t>
-      </w:r>
-    </w:p>
-    <w:p>
-      <w:pPr>
-        <w:divId w:val="1477407143"/>
-        <w:rPr>
-          <w:rFonts w:ascii="Calibri" w:eastAsia="Times New Roman" w:hAnsi="Calibri" w:cs="Calibri"/>
-          <w:color w:val="1F2933"/>
-          <w:sz w:val="19"/>
-          <w:szCs w:val="19"/>
-          <w:lang w:val="en"/>
-        </w:rPr>
-      </w:pPr>
-      <w:r>
-        <w:rPr>
-          <w:rStyle w:val="label2"/>
-          <w:rFonts w:ascii="Calibri" w:eastAsia="Times New Roman" w:hAnsi="Calibri" w:cs="Calibri"/>
-          <w:sz w:val="19"/>
-          <w:szCs w:val="19"/>
-          <w:lang w:val="en"/>
-        </w:rPr>
-        <w:t>Testing &amp; Observability:</w:t>
-      </w:r>
-      <w:r>
-        <w:rPr>
-          <w:rFonts w:ascii="Calibri" w:eastAsia="Times New Roman" w:hAnsi="Calibri" w:cs="Calibri"/>
-          <w:color w:val="1F2933"/>
-          <w:sz w:val="19"/>
-          <w:szCs w:val="19"/>
-          <w:lang w:val="en"/>
-        </w:rPr>
-        <w:t xml:space="preserve"> Jest, Vitest, Sentry, Prometheus, Grafana</w:t>
-      </w:r>
-    </w:p>
-    <w:p>
-      <w:pPr>
-        <w:divId w:val="1210610357"/>
-        <w:rPr>
-          <w:rFonts w:ascii="Calibri" w:eastAsia="Times New Roman" w:hAnsi="Calibri" w:cs="Calibri"/>
-          <w:color w:val="1F2933"/>
-          <w:sz w:val="19"/>
-          <w:szCs w:val="19"/>
-          <w:lang w:val="en"/>
-        </w:rPr>
-      </w:pPr>
-      <w:r>
-        <w:rPr>
-          <w:rStyle w:val="label2"/>
-          <w:rFonts w:ascii="Calibri" w:eastAsia="Times New Roman" w:hAnsi="Calibri" w:cs="Calibri"/>
-          <w:sz w:val="19"/>
-          <w:szCs w:val="19"/>
-          <w:lang w:val="en"/>
-        </w:rPr>
-        <w:t>Tools &amp; Integrations:</w:t>
-      </w:r>
-      <w:r>
-        <w:rPr>
-          <w:rFonts w:ascii="Calibri" w:eastAsia="Times New Roman" w:hAnsi="Calibri" w:cs="Calibri"/>
-          <w:color w:val="1F2933"/>
-          <w:sz w:val="19"/>
-          <w:szCs w:val="19"/>
-          <w:lang w:val="en"/>
-        </w:rPr>
-        <w:t xml:space="preserve"> Git, Stripe, Paymob, Hostex, Linear</w:t>
-      </w:r>
-    </w:p>
-    <w:p>
-      <w:pPr>
-        <w:pStyle w:val="Heading2"/>
-        <w:rPr>
-          <w:rFonts w:ascii="Calibri" w:eastAsia="Times New Roman" w:hAnsi="Calibri" w:cs="Calibri"/>
-          <w:lang w:val="en"/>
-        </w:rPr>
-      </w:pPr>
-      <w:r>
-        <w:rPr>
-          <w:rFonts w:ascii="Calibri" w:eastAsia="Times New Roman" w:hAnsi="Calibri" w:cs="Calibri"/>
-          <w:lang w:val="en"/>
-        </w:rPr>
-        <w:t>Professional Experience</w:t>
-      </w:r>
-    </w:p>
-    <w:p>
-      <w:pPr>
-        <w:divId w:val="920871238"/>
-        <w:rPr>
-          <w:rFonts w:ascii="Calibri" w:eastAsia="Times New Roman" w:hAnsi="Calibri" w:cs="Calibri"/>
-          <w:color w:val="1F2933"/>
-          <w:sz w:val="19"/>
-          <w:szCs w:val="19"/>
-          <w:lang w:val="en"/>
-        </w:rPr>
-      </w:pPr>
-      <w:r>
-        <w:rPr>
-          <w:rStyle w:val="company2"/>
-          <w:rFonts w:ascii="Calibri" w:eastAsia="Times New Roman" w:hAnsi="Calibri" w:cs="Calibri"/>
-          <w:color w:val="243B53"/>
-          <w:sz w:val="20"/>
-          <w:szCs w:val="20"/>
-          <w:lang w:val="en"/>
-        </w:rPr>
-        <w:t>Circle360</w:t>
-      </w:r>
-      <w:r>
-        <w:rPr>
-          <w:rStyle w:val="role1"/>
-          <w:rFonts w:ascii="Calibri" w:eastAsia="Times New Roman" w:hAnsi="Calibri" w:cs="Calibri"/>
-          <w:lang w:val="en"/>
-        </w:rPr>
-        <w:t xml:space="preserve"> — Full-Stack Developer</w:t>
-      </w:r>
-      <w:r>
-        <w:rPr>
-          <w:rFonts w:ascii="Calibri" w:eastAsia="Times New Roman" w:hAnsi="Calibri" w:cs="Calibri"/>
-          <w:color w:val="1F2933"/>
-          <w:sz w:val="19"/>
-          <w:szCs w:val="19"/>
-          <w:lang w:val="en"/>
-        </w:rPr>
-        <w:t xml:space="preserve"> </w:t>
-      </w:r>
-      <w:r>
-        <w:rPr>
-          <w:rStyle w:val="dates1"/>
-          <w:rFonts w:ascii="Calibri" w:eastAsia="Times New Roman" w:hAnsi="Calibri" w:cs="Calibri"/>
-          <w:lang w:val="en"/>
-        </w:rPr>
-        <w:t>May 2026 – Present</w:t>
-      </w:r>
-      <w:r>
-        <w:rPr>
-          <w:rFonts w:ascii="Calibri" w:eastAsia="Times New Roman" w:hAnsi="Calibri" w:cs="Calibri"/>
-          <w:color w:val="1F2933"/>
-          <w:sz w:val="19"/>
-          <w:szCs w:val="19"/>
-          <w:lang w:val="en"/>
-        </w:rPr>
-        <w:t xml:space="preserve"> </w:t>
-      </w:r>
-    </w:p>
-    <w:p>
-      <w:pPr>
-        <w:numPr>
-          <w:ilvl w:val="0"/>
-          <w:numId w:val="1"/>
-        </w:numPr>
-        <w:spacing w:before="15" w:after="15"/>
-        <w:divId w:val="225066477"/>
-        <w:rPr>
-          <w:rFonts w:ascii="Calibri" w:eastAsia="Times New Roman" w:hAnsi="Calibri" w:cs="Calibri"/>
-          <w:color w:val="1F2933"/>
-          <w:sz w:val="19"/>
-          <w:szCs w:val="19"/>
-          <w:lang w:val="en"/>
-        </w:rPr>
-      </w:pPr>
-      <w:r>
-        <w:rPr>
-          <w:rFonts w:ascii="Calibri" w:eastAsia="Times New Roman" w:hAnsi="Calibri" w:cs="Calibri"/>
-          <w:color w:val="1F2933"/>
-          <w:sz w:val="19"/>
-          <w:szCs w:val="19"/>
-          <w:lang w:val="en"/>
-        </w:rPr>
-        <w:t>Angular micro-frontend platform work on large-scale digital transformation projects — custom software and secure system integration for regulated industries.</w:t>
-      </w:r>
-    </w:p>
-    <w:p>
-      <w:pPr>
-        <w:divId w:val="1473795313"/>
-        <w:rPr>
-          <w:rFonts w:ascii="Calibri" w:eastAsia="Times New Roman" w:hAnsi="Calibri" w:cs="Calibri"/>
-          <w:color w:val="1F2933"/>
-          <w:sz w:val="19"/>
-          <w:szCs w:val="19"/>
-          <w:lang w:val="en"/>
-        </w:rPr>
-      </w:pPr>
-      <w:r>
-        <w:rPr>
-          <w:rStyle w:val="company2"/>
-          <w:rFonts w:ascii="Calibri" w:eastAsia="Times New Roman" w:hAnsi="Calibri" w:cs="Calibri"/>
-          <w:color w:val="243B53"/>
-          <w:sz w:val="20"/>
-          <w:szCs w:val="20"/>
-          <w:lang w:val="en"/>
-        </w:rPr>
-        <w:t>Mantaray Digital Solutions</w:t>
-      </w:r>
-      <w:r>
-        <w:rPr>
-          <w:rStyle w:val="role1"/>
-          <w:rFonts w:ascii="Calibri" w:eastAsia="Times New Roman" w:hAnsi="Calibri" w:cs="Calibri"/>
-          <w:lang w:val="en"/>
-        </w:rPr>
-        <w:t xml:space="preserve"> — Full-Stack Developer</w:t>
-      </w:r>
-      <w:r>
-        <w:rPr>
-          <w:rFonts w:ascii="Calibri" w:eastAsia="Times New Roman" w:hAnsi="Calibri" w:cs="Calibri"/>
-          <w:color w:val="1F2933"/>
-          <w:sz w:val="19"/>
-          <w:szCs w:val="19"/>
-          <w:lang w:val="en"/>
-        </w:rPr>
-        <w:t xml:space="preserve"> </w:t>
-      </w:r>
-      <w:r>
-        <w:rPr>
-          <w:rStyle w:val="dates1"/>
-          <w:rFonts w:ascii="Calibri" w:eastAsia="Times New Roman" w:hAnsi="Calibri" w:cs="Calibri"/>
-          <w:lang w:val="en"/>
-        </w:rPr>
-        <w:t>Jun 2024 – May 2026</w:t>
-      </w:r>
-      <w:r>
-        <w:rPr>
-          <w:rFonts w:ascii="Calibri" w:eastAsia="Times New Roman" w:hAnsi="Calibri" w:cs="Calibri"/>
-          <w:color w:val="1F2933"/>
-          <w:sz w:val="19"/>
-          <w:szCs w:val="19"/>
-          <w:lang w:val="en"/>
-        </w:rPr>
-        <w:t xml:space="preserve"> </w:t>
-      </w:r>
-    </w:p>
-    <w:p>
-      <w:pPr>
-        <w:numPr>
-          <w:ilvl w:val="0"/>
-          <w:numId w:val="2"/>
-        </w:numPr>
-        <w:spacing w:before="15" w:after="15"/>
-        <w:divId w:val="90397243"/>
-        <w:rPr>
-          <w:rFonts w:ascii="Calibri" w:eastAsia="Times New Roman" w:hAnsi="Calibri" w:cs="Calibri"/>
-          <w:color w:val="1F2933"/>
-          <w:sz w:val="19"/>
-          <w:szCs w:val="19"/>
-          <w:lang w:val="en"/>
-        </w:rPr>
-      </w:pPr>
-      <w:r>
-        <w:rPr>
-          <w:rFonts w:ascii="Calibri" w:eastAsia="Times New Roman" w:hAnsi="Calibri" w:cs="Calibri"/>
-          <w:color w:val="1F2933"/>
-          <w:sz w:val="19"/>
-          <w:szCs w:val="19"/>
-          <w:lang w:val="en"/>
-        </w:rPr>
-        <w:t>Shipped multiple full-stack products end-to-end — owning architecture, API design, and deployment — using NestJS, React/Next.js, RabbitMQ, and GCP.</w:t>
-      </w:r>
-    </w:p>
-    <w:p>
-      <w:pPr>
-        <w:numPr>
-          <w:ilvl w:val="0"/>
-          <w:numId w:val="2"/>
-        </w:numPr>
-        <w:spacing w:before="15" w:after="15"/>
-        <w:divId w:val="90397243"/>
-        <w:rPr>
-          <w:rFonts w:ascii="Calibri" w:eastAsia="Times New Roman" w:hAnsi="Calibri" w:cs="Calibri"/>
-          <w:color w:val="1F2933"/>
-          <w:sz w:val="19"/>
-          <w:szCs w:val="19"/>
-          <w:lang w:val="en"/>
-        </w:rPr>
-      </w:pPr>
-      <w:r>
-        <w:rPr>
-          <w:rFonts w:ascii="Calibri" w:eastAsia="Times New Roman" w:hAnsi="Calibri" w:cs="Calibri"/>
-          <w:color w:val="1F2933"/>
-          <w:sz w:val="19"/>
-          <w:szCs w:val="19"/>
-          <w:lang w:val="en"/>
-        </w:rPr>
-        <w:t>Designed resilient, event-driven microservices with RabbitMQ to power asynchronous workflows such as billing, notifications, and real-time updates at scale.</w:t>
-      </w:r>
-    </w:p>
-    <w:p>
-      <w:pPr>
-        <w:numPr>
-          <w:ilvl w:val="0"/>
-          <w:numId w:val="2"/>
-        </w:numPr>
-        <w:spacing w:before="15" w:after="15"/>
-        <w:divId w:val="90397243"/>
-        <w:rPr>
-          <w:rFonts w:ascii="Calibri" w:eastAsia="Times New Roman" w:hAnsi="Calibri" w:cs="Calibri"/>
-          <w:color w:val="1F2933"/>
-          <w:sz w:val="19"/>
-          <w:szCs w:val="19"/>
-          <w:lang w:val="en"/>
-        </w:rPr>
-      </w:pPr>
-      <w:r>
-        <w:rPr>
-          <w:rFonts w:ascii="Calibri" w:eastAsia="Times New Roman" w:hAnsi="Calibri" w:cs="Calibri"/>
-          <w:color w:val="1F2933"/>
-          <w:sz w:val="19"/>
-          <w:szCs w:val="19"/>
-          <w:lang w:val="en"/>
-        </w:rPr>
-        <w:t>Deployed and managed containerized applications on GCP using Docker and Kubernetes for auto-scaling and high availability.</w:t>
-      </w:r>
-    </w:p>
-    <w:p>
-      <w:pPr>
-        <w:numPr>
-          <w:ilvl w:val="0"/>
-          <w:numId w:val="2"/>
-        </w:numPr>
-        <w:spacing w:before="15" w:after="15"/>
-        <w:divId w:val="90397243"/>
-        <w:rPr>
-          <w:rFonts w:ascii="Calibri" w:eastAsia="Times New Roman" w:hAnsi="Calibri" w:cs="Calibri"/>
-          <w:color w:val="1F2933"/>
-          <w:sz w:val="19"/>
-          <w:szCs w:val="19"/>
-          <w:lang w:val="en"/>
-        </w:rPr>
-      </w:pPr>
-      <w:r>
-        <w:rPr>
-          <w:rFonts w:ascii="Calibri" w:eastAsia="Times New Roman" w:hAnsi="Calibri" w:cs="Calibri"/>
-          <w:color w:val="1F2933"/>
-          <w:sz w:val="19"/>
-          <w:szCs w:val="19"/>
-          <w:lang w:val="en"/>
-        </w:rPr>
-        <w:t>Cut average API response time by introducing Redis caching and optimizing hot-path database queries.</w:t>
-      </w:r>
-    </w:p>
-    <w:p>
-      <w:pPr>
-        <w:numPr>
-          <w:ilvl w:val="0"/>
-          <w:numId w:val="2"/>
-        </w:numPr>
-        <w:spacing w:before="15" w:after="15"/>
-        <w:divId w:val="90397243"/>
-        <w:rPr>
-          <w:rFonts w:ascii="Calibri" w:eastAsia="Times New Roman" w:hAnsi="Calibri" w:cs="Calibri"/>
-          <w:color w:val="1F2933"/>
-          <w:sz w:val="19"/>
-          <w:szCs w:val="19"/>
-          <w:lang w:val="en"/>
-        </w:rPr>
-      </w:pPr>
-      <w:r>
-        <w:rPr>
-          <w:rFonts w:ascii="Calibri" w:eastAsia="Times New Roman" w:hAnsi="Calibri" w:cs="Calibri"/>
-          <w:color w:val="1F2933"/>
-          <w:sz w:val="19"/>
-          <w:szCs w:val="19"/>
-          <w:lang w:val="en"/>
-        </w:rPr>
-        <w:t>Implemented a Turborepo monorepo, Git Conventional Commits, and CI/CD pipelines, improving build times, collaboration, and release management.</w:t>
-      </w:r>
-    </w:p>
-    <w:p>
-      <w:pPr>
-        <w:divId w:val="562370232"/>
-        <w:rPr>
-          <w:rFonts w:ascii="Calibri" w:eastAsia="Times New Roman" w:hAnsi="Calibri" w:cs="Calibri"/>
-          <w:color w:val="1F2933"/>
-          <w:sz w:val="19"/>
-          <w:szCs w:val="19"/>
-          <w:lang w:val="en"/>
-        </w:rPr>
-      </w:pPr>
-      <w:r>
-        <w:rPr>
-          <w:rStyle w:val="company2"/>
-          <w:rFonts w:ascii="Calibri" w:eastAsia="Times New Roman" w:hAnsi="Calibri" w:cs="Calibri"/>
-          <w:color w:val="243B53"/>
-          <w:sz w:val="20"/>
-          <w:szCs w:val="20"/>
-          <w:lang w:val="en"/>
-        </w:rPr>
-        <w:t>Freelance (Concurrent)</w:t>
-      </w:r>
-      <w:r>
-        <w:rPr>
-          <w:rStyle w:val="role1"/>
-          <w:rFonts w:ascii="Calibri" w:eastAsia="Times New Roman" w:hAnsi="Calibri" w:cs="Calibri"/>
-          <w:lang w:val="en"/>
-        </w:rPr>
-        <w:t xml:space="preserve"> — Full-Stack Developer</w:t>
-      </w:r>
-      <w:r>
-        <w:rPr>
-          <w:rFonts w:ascii="Calibri" w:eastAsia="Times New Roman" w:hAnsi="Calibri" w:cs="Calibri"/>
-          <w:color w:val="1F2933"/>
-          <w:sz w:val="19"/>
-          <w:szCs w:val="19"/>
-          <w:lang w:val="en"/>
-        </w:rPr>
-        <w:t xml:space="preserve"> </w:t>
-      </w:r>
-      <w:r>
-        <w:rPr>
-          <w:rStyle w:val="dates1"/>
-          <w:rFonts w:ascii="Calibri" w:eastAsia="Times New Roman" w:hAnsi="Calibri" w:cs="Calibri"/>
-          <w:lang w:val="en"/>
-        </w:rPr>
-        <w:t>2023 – Present</w:t>
-      </w:r>
-      <w:r>
-        <w:rPr>
-          <w:rFonts w:ascii="Calibri" w:eastAsia="Times New Roman" w:hAnsi="Calibri" w:cs="Calibri"/>
-          <w:color w:val="1F2933"/>
-          <w:sz w:val="19"/>
-          <w:szCs w:val="19"/>
-          <w:lang w:val="en"/>
-        </w:rPr>
-        <w:t xml:space="preserve"> </w:t>
-      </w:r>
-    </w:p>
-    <w:p>
-      <w:pPr>
-        <w:numPr>
-          <w:ilvl w:val="0"/>
-          <w:numId w:val="3"/>
-        </w:numPr>
-        <w:spacing w:before="15" w:after="15"/>
-        <w:divId w:val="1573075446"/>
-        <w:rPr>
-          <w:rFonts w:ascii="Calibri" w:eastAsia="Times New Roman" w:hAnsi="Calibri" w:cs="Calibri"/>
-          <w:color w:val="1F2933"/>
-          <w:sz w:val="19"/>
-          <w:szCs w:val="19"/>
-          <w:lang w:val="en"/>
-        </w:rPr>
-      </w:pPr>
-      <w:r>
-        <w:rPr>
-          <w:rFonts w:ascii="Calibri" w:eastAsia="Times New Roman" w:hAnsi="Calibri" w:cs="Calibri"/>
-          <w:color w:val="1F2933"/>
-          <w:sz w:val="19"/>
-          <w:szCs w:val="19"/>
-          <w:lang w:val="en"/>
-        </w:rPr>
-        <w:t>Built YallaMed, a multi-branch clinic management platform for the Egyptian healthcare market, using Vue, Express, MongoDB, and Socket.io.</w:t>
-      </w:r>
-    </w:p>
-    <w:p>
-      <w:pPr>
-        <w:numPr>
-          <w:ilvl w:val="0"/>
-          <w:numId w:val="3"/>
-        </w:numPr>
-        <w:spacing w:before="15" w:after="15"/>
-        <w:divId w:val="1573075446"/>
-        <w:rPr>
-          <w:rFonts w:ascii="Calibri" w:eastAsia="Times New Roman" w:hAnsi="Calibri" w:cs="Calibri"/>
-          <w:color w:val="1F2933"/>
-          <w:sz w:val="19"/>
-          <w:szCs w:val="19"/>
-          <w:lang w:val="en"/>
-        </w:rPr>
-      </w:pPr>
-      <w:r>
-        <w:rPr>
-          <w:rFonts w:ascii="Calibri" w:eastAsia="Times New Roman" w:hAnsi="Calibri" w:cs="Calibri"/>
-          <w:color w:val="1F2933"/>
-          <w:sz w:val="19"/>
-          <w:szCs w:val="19"/>
-          <w:lang w:val="en"/>
-        </w:rPr>
-        <w:t>Implemented coded clinical records (ICD-10 / LOINC), canvas prescriptions rendered to branded PDFs with Puppeteer, and a specialty MS disease registry.</w:t>
-      </w:r>
-    </w:p>
-    <w:p>
-      <w:pPr>
-        <w:numPr>
-          <w:ilvl w:val="0"/>
-          <w:numId w:val="3"/>
-        </w:numPr>
-        <w:spacing w:before="15" w:after="15"/>
-        <w:divId w:val="1573075446"/>
-        <w:rPr>
-          <w:rFonts w:ascii="Calibri" w:eastAsia="Times New Roman" w:hAnsi="Calibri" w:cs="Calibri"/>
-          <w:color w:val="1F2933"/>
-          <w:sz w:val="19"/>
-          <w:szCs w:val="19"/>
-          <w:lang w:val="en"/>
-        </w:rPr>
-      </w:pPr>
-      <w:r>
-        <w:rPr>
-          <w:rFonts w:ascii="Calibri" w:eastAsia="Times New Roman" w:hAnsi="Calibri" w:cs="Calibri"/>
-          <w:color w:val="1F2933"/>
-          <w:sz w:val="19"/>
-          <w:szCs w:val="19"/>
-          <w:lang w:val="en"/>
-        </w:rPr>
-        <w:t>Developed booking and scheduling with online patient requests, inventory management, EGP billing, and granular team roles, with full Arabic (RTL) support and asset storage on AWS S3.</w:t>
-      </w:r>
-    </w:p>
-    <w:p>
-      <w:pPr>
-        <w:numPr>
-          <w:ilvl w:val="0"/>
-          <w:numId w:val="3"/>
-        </w:numPr>
-        <w:spacing w:before="15" w:after="15"/>
-        <w:divId w:val="1573075446"/>
-        <w:rPr>
-          <w:rFonts w:ascii="Calibri" w:eastAsia="Times New Roman" w:hAnsi="Calibri" w:cs="Calibri"/>
-          <w:color w:val="1F2933"/>
-          <w:sz w:val="19"/>
-          <w:szCs w:val="19"/>
-          <w:lang w:val="en"/>
-        </w:rPr>
-      </w:pPr>
-      <w:r>
-        <w:rPr>
-          <w:rFonts w:ascii="Calibri" w:eastAsia="Times New Roman" w:hAnsi="Calibri" w:cs="Calibri"/>
-          <w:color w:val="1F2933"/>
-          <w:sz w:val="19"/>
-          <w:szCs w:val="19"/>
-          <w:lang w:val="en"/>
-        </w:rPr>
-        <w:t xml:space="preserve">Live: </w:t>
       </w:r>
       <w:hyperlink r:id="rId9" w:history="1">
         <w:r>
           <w:rPr>
             <w:rStyle w:val="Hyperlink"/>
             <w:rFonts w:ascii="Calibri" w:eastAsia="Times New Roman" w:hAnsi="Calibri" w:cs="Calibri"/>
-            <w:sz w:val="19"/>
+            <w:sz w:val="20"/>
             <w:szCs w:val="19"/>
             <w:lang w:val="en"/>
           </w:rPr>
-          <w:t>yallamed.uk</w:t>
+          <w:t>linkedin.com/in/</w:t>
         </w:r>
+        <w:proofErr w:type="spellStart"/>
+        <w:r>
+          <w:rPr>
+            <w:rStyle w:val="Hyperlink"/>
+            <w:rFonts w:ascii="Calibri" w:eastAsia="Times New Roman" w:hAnsi="Calibri" w:cs="Calibri"/>
+            <w:sz w:val="20"/>
+            <w:szCs w:val="19"/>
+            <w:lang w:val="en"/>
+          </w:rPr>
+          <w:t>odaytarek</w:t>
+        </w:r>
+        <w:proofErr w:type="spellEnd"/>
       </w:hyperlink>
-    </w:p>
-    <w:p>
-      <w:pPr>
-        <w:pStyle w:val="Heading2"/>
-        <w:rPr>
-          <w:rFonts w:ascii="Calibri" w:eastAsia="Times New Roman" w:hAnsi="Calibri" w:cs="Calibri"/>
-          <w:lang w:val="en"/>
-        </w:rPr>
-      </w:pPr>
-      <w:r>
-        <w:rPr>
-          <w:rFonts w:ascii="Calibri" w:eastAsia="Times New Roman" w:hAnsi="Calibri" w:cs="Calibri"/>
-          <w:lang w:val="en"/>
-        </w:rPr>
-        <w:t>Projects</w:t>
-      </w:r>
-    </w:p>
-    <w:p>
-      <w:pPr>
-        <w:divId w:val="1020007317"/>
-        <w:rPr>
-          <w:rFonts w:ascii="Calibri" w:eastAsia="Times New Roman" w:hAnsi="Calibri" w:cs="Calibri"/>
-          <w:b/>
-          <w:bCs/>
-          <w:color w:val="243B53"/>
-          <w:sz w:val="19"/>
-          <w:szCs w:val="19"/>
-          <w:lang w:val="en"/>
-        </w:rPr>
-      </w:pPr>
-      <w:r>
-        <w:rPr>
-          <w:rFonts w:ascii="Calibri" w:eastAsia="Times New Roman" w:hAnsi="Calibri" w:cs="Calibri"/>
-          <w:b/>
-          <w:bCs/>
-          <w:color w:val="243B53"/>
-          <w:sz w:val="19"/>
-          <w:szCs w:val="19"/>
-          <w:lang w:val="en"/>
-        </w:rPr>
-        <w:t xml:space="preserve">Plato — All-in-One Restaurant Operations Platform </w:t>
-      </w:r>
-      <w:r>
-        <w:rPr>
-          <w:rStyle w:val="meta2"/>
-          <w:rFonts w:ascii="Calibri" w:eastAsia="Times New Roman" w:hAnsi="Calibri" w:cs="Calibri"/>
-          <w:sz w:val="19"/>
-          <w:szCs w:val="19"/>
-          <w:lang w:val="en"/>
-        </w:rPr>
-        <w:t>| Next.js, Convex, TypeScript, Tailwind CSS, Recharts | 2026</w:t>
-      </w:r>
-    </w:p>
-    <w:p>
-      <w:pPr>
-        <w:numPr>
-          <w:ilvl w:val="0"/>
-          <w:numId w:val="4"/>
-        </w:numPr>
-        <w:spacing w:before="15" w:after="15"/>
-        <w:divId w:val="1076517953"/>
-        <w:rPr>
-          <w:rFonts w:ascii="Calibri" w:eastAsia="Times New Roman" w:hAnsi="Calibri" w:cs="Calibri"/>
-          <w:color w:val="1F2933"/>
-          <w:sz w:val="19"/>
-          <w:szCs w:val="19"/>
-          <w:lang w:val="en"/>
-        </w:rPr>
-      </w:pPr>
-      <w:r>
-        <w:rPr>
-          <w:rFonts w:ascii="Calibri" w:eastAsia="Times New Roman" w:hAnsi="Calibri" w:cs="Calibri"/>
-          <w:color w:val="1F2933"/>
-          <w:sz w:val="19"/>
-          <w:szCs w:val="19"/>
-          <w:lang w:val="en"/>
-        </w:rPr>
-        <w:t>Built a restaurant operations platform covering POS, kitchen display, inventory and recipe costing, finance/accounting, loyalty, payroll, and multi-branch management, with AI menu-engineering insights and full Arabic (RTL) support.</w:t>
-      </w:r>
-    </w:p>
-    <w:p>
-      <w:pPr>
-        <w:numPr>
-          <w:ilvl w:val="0"/>
-          <w:numId w:val="4"/>
-        </w:numPr>
-        <w:spacing w:before="15" w:after="15"/>
-        <w:divId w:val="1076517953"/>
-        <w:rPr>
-          <w:rFonts w:ascii="Calibri" w:eastAsia="Times New Roman" w:hAnsi="Calibri" w:cs="Calibri"/>
-          <w:color w:val="1F2933"/>
-          <w:sz w:val="19"/>
-          <w:szCs w:val="19"/>
-          <w:lang w:val="en"/>
-        </w:rPr>
-      </w:pPr>
-      <w:r>
-        <w:rPr>
-          <w:rFonts w:ascii="Calibri" w:eastAsia="Times New Roman" w:hAnsi="Calibri" w:cs="Calibri"/>
-          <w:color w:val="1F2933"/>
-          <w:sz w:val="19"/>
-          <w:szCs w:val="19"/>
-          <w:lang w:val="en"/>
-        </w:rPr>
-        <w:t xml:space="preserve">Website: </w:t>
+      <w:r>
+        <w:rPr>
+          <w:rFonts w:ascii="Calibri" w:eastAsia="Times New Roman" w:hAnsi="Calibri" w:cs="Calibri"/>
+          <w:color w:val="9AA5B1"/>
+          <w:sz w:val="20"/>
+          <w:szCs w:val="19"/>
+          <w:lang w:val="en"/>
+        </w:rPr>
+        <w:t xml:space="preserve"> </w:t>
+      </w:r>
+      <w:r>
+        <w:rPr>
+          <w:rStyle w:val="sep3"/>
+          <w:rFonts w:ascii="Calibri" w:eastAsia="Times New Roman" w:hAnsi="Calibri" w:cs="Calibri"/>
+          <w:color w:val="9AA5B1"/>
+          <w:sz w:val="20"/>
+          <w:szCs w:val="19"/>
+          <w:lang w:val="en"/>
+        </w:rPr>
+        <w:t>|</w:t>
+      </w:r>
+      <w:r>
+        <w:rPr>
+          <w:rFonts w:ascii="Calibri" w:eastAsia="Times New Roman" w:hAnsi="Calibri" w:cs="Calibri"/>
+          <w:color w:val="9AA5B1"/>
+          <w:sz w:val="20"/>
+          <w:szCs w:val="19"/>
+          <w:lang w:val="en"/>
+        </w:rPr>
+        <w:t xml:space="preserve"> </w:t>
       </w:r>
       <w:hyperlink r:id="rId10" w:history="1">
         <w:r>
           <w:rPr>
             <w:rStyle w:val="Hyperlink"/>
             <w:rFonts w:ascii="Calibri" w:eastAsia="Times New Roman" w:hAnsi="Calibri" w:cs="Calibri"/>
-            <w:sz w:val="19"/>
+            <w:sz w:val="20"/>
+            <w:szCs w:val="19"/>
+            <w:lang w:val="en"/>
+          </w:rPr>
+          <w:t>akira0169.github.io/portfolio-</w:t>
+        </w:r>
+        <w:proofErr w:type="spellStart"/>
+        <w:r>
+          <w:rPr>
+            <w:rStyle w:val="Hyperlink"/>
+            <w:rFonts w:ascii="Calibri" w:eastAsia="Times New Roman" w:hAnsi="Calibri" w:cs="Calibri"/>
+            <w:sz w:val="20"/>
+            <w:szCs w:val="19"/>
+            <w:lang w:val="en"/>
+          </w:rPr>
+          <w:t>oday</w:t>
+        </w:r>
+        <w:proofErr w:type="spellEnd"/>
+        <w:r>
+          <w:rPr>
+            <w:rStyle w:val="Hyperlink"/>
+            <w:rFonts w:ascii="Calibri" w:eastAsia="Times New Roman" w:hAnsi="Calibri" w:cs="Calibri"/>
+            <w:sz w:val="20"/>
+            <w:szCs w:val="19"/>
+            <w:lang w:val="en"/>
+          </w:rPr>
+          <w:t>-</w:t>
+        </w:r>
+        <w:proofErr w:type="spellStart"/>
+        <w:r>
+          <w:rPr>
+            <w:rStyle w:val="Hyperlink"/>
+            <w:rFonts w:ascii="Calibri" w:eastAsia="Times New Roman" w:hAnsi="Calibri" w:cs="Calibri"/>
+            <w:sz w:val="20"/>
+            <w:szCs w:val="19"/>
+            <w:lang w:val="en"/>
+          </w:rPr>
+          <w:t>tarek</w:t>
+        </w:r>
+        <w:proofErr w:type="spellEnd"/>
+      </w:hyperlink>
+      <w:r>
+        <w:rPr>
+          <w:rFonts w:ascii="Calibri" w:eastAsia="Times New Roman" w:hAnsi="Calibri" w:cs="Calibri"/>
+          <w:color w:val="1F2933"/>
+          <w:sz w:val="20"/>
+          <w:szCs w:val="19"/>
+          <w:lang w:val="en"/>
+        </w:rPr>
+        <w:t xml:space="preserve"> </w:t>
+      </w:r>
+    </w:p>
+    <w:p>
+      <w:pPr>
+        <w:pStyle w:val="Heading2"/>
+        <w:spacing w:before="200" w:after="80"/>
+        <w:rPr>
+          <w:rFonts w:ascii="Calibri" w:eastAsia="Times New Roman" w:hAnsi="Calibri" w:cs="Calibri"/>
+          <w:sz w:val="24"/>
+          <w:lang w:val="en"/>
+        </w:rPr>
+      </w:pPr>
+      <w:r>
+        <w:rPr>
+          <w:rFonts w:ascii="Calibri" w:hAnsi="Calibri" w:cs="Calibri"/>
+          <w:spacing w:val="10"/>
+          <w:sz w:val="23"/>
+          <w:szCs w:val="23"/>
+        </w:rPr>
+        <w:t>SUMMARY</w:t>
+      </w:r>
+    </w:p>
+    <w:p>
+      <w:pPr>
+        <w:pStyle w:val="NormalWeb"/>
+        <w:spacing w:after="30" w:line="250" w:lineRule="auto"/>
+        <w:rPr>
+          <w:rFonts w:ascii="Calibri" w:hAnsi="Calibri" w:cs="Calibri"/>
+          <w:color w:val="1F2933"/>
+          <w:sz w:val="20"/>
+          <w:szCs w:val="19"/>
+          <w:lang w:val="en"/>
+        </w:rPr>
+      </w:pPr>
+      <w:r>
+        <w:rPr>
+          <w:rFonts w:ascii="Calibri" w:hAnsi="Calibri" w:cs="Calibri"/>
+          <w:color w:val="1F2933"/>
+          <w:sz w:val="20"/>
+          <w:szCs w:val="19"/>
+          <w:lang w:val="en"/>
+        </w:rPr>
+        <w:t xml:space="preserve">Full-stack developer with </w:t>
+      </w:r>
+      <w:r>
+        <w:rPr>
+          <w:rFonts w:ascii="Calibri" w:hAnsi="Calibri" w:cs="Calibri"/>
+          <w:color w:val="1F2933"/>
+          <w:sz w:val="20"/>
+          <w:szCs w:val="19"/>
+          <w:lang w:val="en"/>
+        </w:rPr>
+        <w:t>3</w:t>
+      </w:r>
+      <w:r>
+        <w:rPr>
+          <w:rFonts w:ascii="Calibri" w:hAnsi="Calibri" w:cs="Calibri"/>
+          <w:color w:val="1F2933"/>
+          <w:sz w:val="20"/>
+          <w:szCs w:val="19"/>
+          <w:lang w:val="en"/>
+        </w:rPr>
+        <w:t xml:space="preserve">+ years building cloud-native web applications across the JavaScript/TypeScript stack (React, Next.js, Vue, Node.js, </w:t>
+      </w:r>
+      <w:proofErr w:type="spellStart"/>
+      <w:r>
+        <w:rPr>
+          <w:rFonts w:ascii="Calibri" w:hAnsi="Calibri" w:cs="Calibri"/>
+          <w:color w:val="1F2933"/>
+          <w:sz w:val="20"/>
+          <w:szCs w:val="19"/>
+          <w:lang w:val="en"/>
+        </w:rPr>
+        <w:t>NestJS</w:t>
+      </w:r>
+      <w:proofErr w:type="spellEnd"/>
+      <w:r>
+        <w:rPr>
+          <w:rFonts w:ascii="Calibri" w:hAnsi="Calibri" w:cs="Calibri"/>
+          <w:color w:val="1F2933"/>
+          <w:sz w:val="20"/>
+          <w:szCs w:val="19"/>
+          <w:lang w:val="en"/>
+        </w:rPr>
+        <w:t xml:space="preserve">). Specialized in event-driven microservices with RabbitMQ and Kafka, </w:t>
+      </w:r>
+      <w:proofErr w:type="spellStart"/>
+      <w:r>
+        <w:rPr>
+          <w:rFonts w:ascii="Calibri" w:hAnsi="Calibri" w:cs="Calibri"/>
+          <w:color w:val="1F2933"/>
+          <w:sz w:val="20"/>
+          <w:szCs w:val="19"/>
+          <w:lang w:val="en"/>
+        </w:rPr>
+        <w:t>GraphQL</w:t>
+      </w:r>
+      <w:proofErr w:type="spellEnd"/>
+      <w:r>
+        <w:rPr>
+          <w:rFonts w:ascii="Calibri" w:hAnsi="Calibri" w:cs="Calibri"/>
+          <w:color w:val="1F2933"/>
+          <w:sz w:val="20"/>
+          <w:szCs w:val="19"/>
+          <w:lang w:val="en"/>
+        </w:rPr>
+        <w:t>/REST API design, and GCP/AWS deployments using Docker, Kubernetes, and CI/CD. Cut API response times up to 40% through Redis caching and query optimization.</w:t>
+      </w:r>
+      <w:r>
+        <w:rPr>
+          <w:rFonts w:ascii="Calibri" w:hAnsi="Calibri" w:cs="Calibri"/>
+          <w:color w:val="1F2933"/>
+          <w:sz w:val="20"/>
+          <w:szCs w:val="19"/>
+          <w:lang w:val="en"/>
+        </w:rPr>
+        <w:t xml:space="preserve"> </w:t>
+      </w:r>
+      <w:r>
+        <w:rPr>
+          <w:rFonts w:ascii="Calibri" w:hAnsi="Calibri" w:cs="Calibri"/>
+          <w:color w:val="1F2933"/>
+          <w:sz w:val="20"/>
+          <w:szCs w:val="19"/>
+          <w:lang w:val="en"/>
+        </w:rPr>
+        <w:t>Experienced in Agile/Scrum, system design,</w:t>
+      </w:r>
+      <w:r>
+        <w:rPr>
+          <w:rFonts w:ascii="Calibri" w:hAnsi="Calibri" w:cs="Calibri"/>
+          <w:color w:val="1F2933"/>
+          <w:sz w:val="20"/>
+          <w:szCs w:val="19"/>
+          <w:lang w:val="en"/>
+        </w:rPr>
+        <w:t xml:space="preserve"> and code review. </w:t>
+      </w:r>
+      <w:r>
+        <w:rPr>
+          <w:rFonts w:ascii="Calibri" w:hAnsi="Calibri" w:cs="Calibri"/>
+          <w:color w:val="1F2933"/>
+          <w:sz w:val="20"/>
+          <w:szCs w:val="19"/>
+          <w:lang w:val="en"/>
+        </w:rPr>
+        <w:t>Now</w:t>
+      </w:r>
+      <w:r>
+        <w:rPr>
+          <w:rFonts w:ascii="Calibri" w:hAnsi="Calibri" w:cs="Calibri"/>
+          <w:color w:val="1F2933"/>
+          <w:sz w:val="20"/>
+          <w:szCs w:val="19"/>
+          <w:lang w:val="en"/>
+        </w:rPr>
+        <w:t xml:space="preserve"> building Angular and .NET (C#) apps for Saudi government platforms at Circle360.</w:t>
+      </w:r>
+    </w:p>
+    <w:p>
+      <w:pPr>
+        <w:pStyle w:val="Heading2"/>
+        <w:spacing w:before="200" w:after="80"/>
+        <w:rPr>
+          <w:rFonts w:ascii="Calibri" w:eastAsia="Times New Roman" w:hAnsi="Calibri" w:cs="Calibri"/>
+          <w:sz w:val="24"/>
+          <w:lang w:val="en"/>
+        </w:rPr>
+      </w:pPr>
+      <w:r>
+        <w:rPr>
+          <w:rFonts w:ascii="Calibri" w:hAnsi="Calibri" w:cs="Calibri"/>
+          <w:spacing w:val="10"/>
+          <w:sz w:val="23"/>
+          <w:szCs w:val="23"/>
+        </w:rPr>
+        <w:t>SKILLS</w:t>
+      </w:r>
+    </w:p>
+    <w:p>
+      <w:pPr>
+        <w:spacing w:after="30" w:line="250" w:lineRule="auto"/>
+        <w:divId w:val="666781"/>
+        <w:rPr>
+          <w:rFonts w:ascii="Calibri" w:eastAsia="Times New Roman" w:hAnsi="Calibri" w:cs="Calibri"/>
+          <w:color w:val="1F2933"/>
+          <w:sz w:val="20"/>
+          <w:szCs w:val="19"/>
+          <w:lang w:val="en"/>
+        </w:rPr>
+      </w:pPr>
+      <w:r>
+        <w:rPr>
+          <w:rStyle w:val="label2"/>
+          <w:rFonts w:ascii="Calibri" w:eastAsia="Times New Roman" w:hAnsi="Calibri" w:cs="Calibri"/>
+          <w:color w:val="1F2933"/>
+          <w:sz w:val="20"/>
+          <w:szCs w:val="19"/>
+          <w:lang w:val="en"/>
+        </w:rPr>
+        <w:t>Languages:</w:t>
+      </w:r>
+      <w:r>
+        <w:rPr>
+          <w:rFonts w:ascii="Calibri" w:eastAsia="Times New Roman" w:hAnsi="Calibri" w:cs="Calibri"/>
+          <w:color w:val="1F2933"/>
+          <w:sz w:val="20"/>
+          <w:szCs w:val="19"/>
+          <w:lang w:val="en"/>
+        </w:rPr>
+        <w:t xml:space="preserve"> JavaScript, TypeScript, </w:t>
+      </w:r>
+      <w:r>
+        <w:rPr>
+          <w:rFonts w:ascii="Calibri" w:eastAsia="Times New Roman" w:hAnsi="Calibri" w:cs="Calibri"/>
+          <w:color w:val="1F2933"/>
+          <w:sz w:val="20"/>
+          <w:szCs w:val="19"/>
+          <w:lang w:val="en"/>
+        </w:rPr>
+        <w:t xml:space="preserve">C#, </w:t>
+      </w:r>
+      <w:proofErr w:type="gramStart"/>
+      <w:r>
+        <w:rPr>
+          <w:rFonts w:ascii="Calibri" w:eastAsia="Times New Roman" w:hAnsi="Calibri" w:cs="Calibri"/>
+          <w:color w:val="1F2933"/>
+          <w:sz w:val="20"/>
+          <w:szCs w:val="19"/>
+          <w:lang w:val="en"/>
+        </w:rPr>
+        <w:t>Go</w:t>
+      </w:r>
+      <w:proofErr w:type="gramEnd"/>
+      <w:r>
+        <w:rPr>
+          <w:rFonts w:ascii="Calibri" w:eastAsia="Times New Roman" w:hAnsi="Calibri" w:cs="Calibri"/>
+          <w:color w:val="1F2933"/>
+          <w:sz w:val="20"/>
+          <w:szCs w:val="19"/>
+          <w:lang w:val="en"/>
+        </w:rPr>
+        <w:t xml:space="preserve"> (working knowledge)</w:t>
+      </w:r>
+    </w:p>
+    <w:p>
+      <w:pPr>
+        <w:spacing w:after="30" w:line="250" w:lineRule="auto"/>
+        <w:divId w:val="322010301"/>
+        <w:rPr>
+          <w:rFonts w:ascii="Calibri" w:eastAsia="Times New Roman" w:hAnsi="Calibri" w:cs="Calibri"/>
+          <w:color w:val="1F2933"/>
+          <w:sz w:val="20"/>
+          <w:szCs w:val="19"/>
+          <w:lang w:val="en"/>
+        </w:rPr>
+      </w:pPr>
+      <w:r>
+        <w:rPr>
+          <w:rStyle w:val="label2"/>
+          <w:rFonts w:ascii="Calibri" w:eastAsia="Times New Roman" w:hAnsi="Calibri" w:cs="Calibri"/>
+          <w:color w:val="1F2933"/>
+          <w:sz w:val="20"/>
+          <w:szCs w:val="19"/>
+          <w:lang w:val="en"/>
+        </w:rPr>
+        <w:t>Frontend:</w:t>
+      </w:r>
+      <w:r>
+        <w:rPr>
+          <w:rFonts w:ascii="Calibri" w:eastAsia="Times New Roman" w:hAnsi="Calibri" w:cs="Calibri"/>
+          <w:color w:val="1F2933"/>
+          <w:sz w:val="20"/>
+          <w:szCs w:val="19"/>
+          <w:lang w:val="en"/>
+        </w:rPr>
+        <w:t xml:space="preserve"> React, Next.js, </w:t>
+      </w:r>
+      <w:r>
+        <w:rPr>
+          <w:rFonts w:ascii="Calibri" w:eastAsia="Times New Roman" w:hAnsi="Calibri" w:cs="Calibri"/>
+          <w:color w:val="1F2933"/>
+          <w:sz w:val="20"/>
+          <w:szCs w:val="19"/>
+          <w:lang w:val="en"/>
+        </w:rPr>
+        <w:t xml:space="preserve">Angular, </w:t>
+      </w:r>
+      <w:proofErr w:type="spellStart"/>
+      <w:r>
+        <w:rPr>
+          <w:rFonts w:ascii="Calibri" w:eastAsia="Times New Roman" w:hAnsi="Calibri" w:cs="Calibri"/>
+          <w:color w:val="1F2933"/>
+          <w:sz w:val="20"/>
+          <w:szCs w:val="19"/>
+          <w:lang w:val="en"/>
+        </w:rPr>
+        <w:t>RxJS</w:t>
+      </w:r>
+      <w:proofErr w:type="spellEnd"/>
+      <w:r>
+        <w:rPr>
+          <w:rFonts w:ascii="Calibri" w:eastAsia="Times New Roman" w:hAnsi="Calibri" w:cs="Calibri"/>
+          <w:color w:val="1F2933"/>
+          <w:sz w:val="20"/>
+          <w:szCs w:val="19"/>
+          <w:lang w:val="en"/>
+        </w:rPr>
+        <w:t xml:space="preserve">, </w:t>
+      </w:r>
+      <w:r>
+        <w:rPr>
+          <w:rFonts w:ascii="Calibri" w:eastAsia="Times New Roman" w:hAnsi="Calibri" w:cs="Calibri"/>
+          <w:color w:val="1F2933"/>
+          <w:sz w:val="20"/>
+          <w:szCs w:val="19"/>
+          <w:lang w:val="en"/>
+        </w:rPr>
+        <w:t xml:space="preserve">Vue, </w:t>
+      </w:r>
+      <w:proofErr w:type="spellStart"/>
+      <w:r>
+        <w:rPr>
+          <w:rFonts w:ascii="Calibri" w:eastAsia="Times New Roman" w:hAnsi="Calibri" w:cs="Calibri"/>
+          <w:color w:val="1F2933"/>
+          <w:sz w:val="20"/>
+          <w:szCs w:val="19"/>
+          <w:lang w:val="en"/>
+        </w:rPr>
+        <w:t>Nuxt</w:t>
+      </w:r>
+      <w:proofErr w:type="spellEnd"/>
+      <w:r>
+        <w:rPr>
+          <w:rFonts w:ascii="Calibri" w:eastAsia="Times New Roman" w:hAnsi="Calibri" w:cs="Calibri"/>
+          <w:color w:val="1F2933"/>
+          <w:sz w:val="20"/>
+          <w:szCs w:val="19"/>
+          <w:lang w:val="en"/>
+        </w:rPr>
+        <w:t xml:space="preserve">, Redux, Tailwind CSS, </w:t>
+      </w:r>
+      <w:proofErr w:type="spellStart"/>
+      <w:r>
+        <w:rPr>
+          <w:rFonts w:ascii="Calibri" w:eastAsia="Times New Roman" w:hAnsi="Calibri" w:cs="Calibri"/>
+          <w:color w:val="1F2933"/>
+          <w:sz w:val="20"/>
+          <w:szCs w:val="19"/>
+          <w:lang w:val="en"/>
+        </w:rPr>
+        <w:t>TanStack</w:t>
+      </w:r>
+      <w:proofErr w:type="spellEnd"/>
+    </w:p>
+    <w:p>
+      <w:pPr>
+        <w:spacing w:after="30" w:line="250" w:lineRule="auto"/>
+        <w:divId w:val="2136828915"/>
+        <w:rPr>
+          <w:rFonts w:ascii="Calibri" w:eastAsia="Times New Roman" w:hAnsi="Calibri" w:cs="Calibri"/>
+          <w:color w:val="1F2933"/>
+          <w:sz w:val="20"/>
+          <w:szCs w:val="19"/>
+          <w:lang w:val="en"/>
+        </w:rPr>
+      </w:pPr>
+      <w:r>
+        <w:rPr>
+          <w:rStyle w:val="label2"/>
+          <w:rFonts w:ascii="Calibri" w:eastAsia="Times New Roman" w:hAnsi="Calibri" w:cs="Calibri"/>
+          <w:color w:val="1F2933"/>
+          <w:sz w:val="20"/>
+          <w:szCs w:val="19"/>
+          <w:lang w:val="en"/>
+        </w:rPr>
+        <w:t>Backend:</w:t>
+      </w:r>
+      <w:r>
+        <w:rPr>
+          <w:rFonts w:ascii="Calibri" w:eastAsia="Times New Roman" w:hAnsi="Calibri" w:cs="Calibri"/>
+          <w:color w:val="1F2933"/>
+          <w:sz w:val="20"/>
+          <w:szCs w:val="19"/>
+          <w:lang w:val="en"/>
+        </w:rPr>
+        <w:t xml:space="preserve"> Node.js, </w:t>
+      </w:r>
+      <w:proofErr w:type="spellStart"/>
+      <w:r>
+        <w:rPr>
+          <w:rFonts w:ascii="Calibri" w:eastAsia="Times New Roman" w:hAnsi="Calibri" w:cs="Calibri"/>
+          <w:color w:val="1F2933"/>
+          <w:sz w:val="20"/>
+          <w:szCs w:val="19"/>
+          <w:lang w:val="en"/>
+        </w:rPr>
+        <w:t>NestJS</w:t>
+      </w:r>
+      <w:proofErr w:type="spellEnd"/>
+      <w:r>
+        <w:rPr>
+          <w:rFonts w:ascii="Calibri" w:eastAsia="Times New Roman" w:hAnsi="Calibri" w:cs="Calibri"/>
+          <w:color w:val="1F2933"/>
+          <w:sz w:val="20"/>
+          <w:szCs w:val="19"/>
+          <w:lang w:val="en"/>
+        </w:rPr>
+        <w:t xml:space="preserve">, </w:t>
+      </w:r>
+      <w:r>
+        <w:rPr>
+          <w:rFonts w:ascii="Calibri" w:eastAsia="Times New Roman" w:hAnsi="Calibri" w:cs="Calibri"/>
+          <w:color w:val="1F2933"/>
+          <w:sz w:val="20"/>
+          <w:szCs w:val="19"/>
+          <w:lang w:val="en"/>
+        </w:rPr>
+        <w:t xml:space="preserve">Express, </w:t>
+      </w:r>
+      <w:r>
+        <w:rPr>
+          <w:rFonts w:ascii="Calibri" w:eastAsia="Times New Roman" w:hAnsi="Calibri" w:cs="Calibri"/>
+          <w:color w:val="1F2933"/>
+          <w:sz w:val="20"/>
+          <w:szCs w:val="19"/>
+          <w:lang w:val="en"/>
+        </w:rPr>
+        <w:t xml:space="preserve">.NET / ASP.NET Core, </w:t>
+      </w:r>
+      <w:proofErr w:type="spellStart"/>
+      <w:r>
+        <w:rPr>
+          <w:rFonts w:ascii="Calibri" w:eastAsia="Times New Roman" w:hAnsi="Calibri" w:cs="Calibri"/>
+          <w:color w:val="1F2933"/>
+          <w:sz w:val="20"/>
+          <w:szCs w:val="19"/>
+          <w:lang w:val="en"/>
+        </w:rPr>
+        <w:t>GraphQL</w:t>
+      </w:r>
+      <w:proofErr w:type="spellEnd"/>
+      <w:r>
+        <w:rPr>
+          <w:rFonts w:ascii="Calibri" w:eastAsia="Times New Roman" w:hAnsi="Calibri" w:cs="Calibri"/>
+          <w:color w:val="1F2933"/>
+          <w:sz w:val="20"/>
+          <w:szCs w:val="19"/>
+          <w:lang w:val="en"/>
+        </w:rPr>
+        <w:t>, REST APIs, Microservices, RabbitMQ, Kafka, Socket.io</w:t>
+      </w:r>
+    </w:p>
+    <w:p>
+      <w:pPr>
+        <w:spacing w:after="30" w:line="250" w:lineRule="auto"/>
+        <w:divId w:val="2039309649"/>
+        <w:rPr>
+          <w:rFonts w:ascii="Calibri" w:eastAsia="Times New Roman" w:hAnsi="Calibri" w:cs="Calibri"/>
+          <w:color w:val="1F2933"/>
+          <w:sz w:val="20"/>
+          <w:szCs w:val="19"/>
+          <w:lang w:val="en"/>
+        </w:rPr>
+      </w:pPr>
+      <w:r>
+        <w:rPr>
+          <w:rStyle w:val="label2"/>
+          <w:rFonts w:ascii="Calibri" w:eastAsia="Times New Roman" w:hAnsi="Calibri" w:cs="Calibri"/>
+          <w:color w:val="1F2933"/>
+          <w:sz w:val="20"/>
+          <w:szCs w:val="19"/>
+          <w:lang w:val="en"/>
+        </w:rPr>
+        <w:t>Databases:</w:t>
+      </w:r>
+      <w:r>
+        <w:rPr>
+          <w:rFonts w:ascii="Calibri" w:eastAsia="Times New Roman" w:hAnsi="Calibri" w:cs="Calibri"/>
+          <w:color w:val="1F2933"/>
+          <w:sz w:val="20"/>
+          <w:szCs w:val="19"/>
+          <w:lang w:val="en"/>
+        </w:rPr>
+        <w:t xml:space="preserve"> PostgreSQL, MongoDB, Redis</w:t>
+      </w:r>
+      <w:r>
+        <w:rPr>
+          <w:rFonts w:ascii="Calibri" w:eastAsia="Times New Roman" w:hAnsi="Calibri" w:cs="Calibri"/>
+          <w:color w:val="1F2933"/>
+          <w:sz w:val="20"/>
+          <w:szCs w:val="19"/>
+          <w:lang w:val="en"/>
+        </w:rPr>
+        <w:t xml:space="preserve">, </w:t>
+      </w:r>
+      <w:proofErr w:type="spellStart"/>
+      <w:r>
+        <w:rPr>
+          <w:rFonts w:ascii="Calibri" w:eastAsia="Times New Roman" w:hAnsi="Calibri" w:cs="Calibri"/>
+          <w:color w:val="1F2933"/>
+          <w:sz w:val="20"/>
+          <w:szCs w:val="19"/>
+          <w:lang w:val="en"/>
+        </w:rPr>
+        <w:t>TypeORM</w:t>
+      </w:r>
+      <w:proofErr w:type="spellEnd"/>
+    </w:p>
+    <w:p>
+      <w:pPr>
+        <w:spacing w:after="30" w:line="250" w:lineRule="auto"/>
+        <w:divId w:val="1991906828"/>
+        <w:rPr>
+          <w:rFonts w:ascii="Calibri" w:eastAsia="Times New Roman" w:hAnsi="Calibri" w:cs="Calibri"/>
+          <w:color w:val="1F2933"/>
+          <w:sz w:val="20"/>
+          <w:szCs w:val="19"/>
+          <w:lang w:val="en"/>
+        </w:rPr>
+      </w:pPr>
+      <w:r>
+        <w:rPr>
+          <w:rStyle w:val="label2"/>
+          <w:rFonts w:ascii="Calibri" w:eastAsia="Times New Roman" w:hAnsi="Calibri" w:cs="Calibri"/>
+          <w:color w:val="1F2933"/>
+          <w:sz w:val="20"/>
+          <w:szCs w:val="19"/>
+          <w:lang w:val="en"/>
+        </w:rPr>
+        <w:t>Cloud &amp; DevOps:</w:t>
+      </w:r>
+      <w:r>
+        <w:rPr>
+          <w:rFonts w:ascii="Calibri" w:eastAsia="Times New Roman" w:hAnsi="Calibri" w:cs="Calibri"/>
+          <w:color w:val="1F2933"/>
+          <w:sz w:val="20"/>
+          <w:szCs w:val="19"/>
+          <w:lang w:val="en"/>
+        </w:rPr>
+        <w:t xml:space="preserve"> Google Cloud Platform (GCP), AWS, Docker, Kubernetes, Nginx, CI/CD, </w:t>
+      </w:r>
+      <w:proofErr w:type="spellStart"/>
+      <w:r>
+        <w:rPr>
+          <w:rFonts w:ascii="Calibri" w:eastAsia="Times New Roman" w:hAnsi="Calibri" w:cs="Calibri"/>
+          <w:color w:val="1F2933"/>
+          <w:sz w:val="20"/>
+          <w:szCs w:val="19"/>
+          <w:lang w:val="en"/>
+        </w:rPr>
+        <w:t>Turborepo</w:t>
+      </w:r>
+      <w:proofErr w:type="spellEnd"/>
+    </w:p>
+    <w:p>
+      <w:pPr>
+        <w:spacing w:after="30" w:line="250" w:lineRule="auto"/>
+        <w:divId w:val="1477407143"/>
+        <w:rPr>
+          <w:rFonts w:ascii="Calibri" w:eastAsia="Times New Roman" w:hAnsi="Calibri" w:cs="Calibri"/>
+          <w:color w:val="1F2933"/>
+          <w:sz w:val="20"/>
+          <w:szCs w:val="19"/>
+          <w:lang w:val="en"/>
+        </w:rPr>
+      </w:pPr>
+      <w:r>
+        <w:rPr>
+          <w:rStyle w:val="label2"/>
+          <w:rFonts w:ascii="Calibri" w:eastAsia="Times New Roman" w:hAnsi="Calibri" w:cs="Calibri"/>
+          <w:color w:val="1F2933"/>
+          <w:sz w:val="20"/>
+          <w:szCs w:val="19"/>
+          <w:lang w:val="en"/>
+        </w:rPr>
+        <w:t>Testing &amp; Observability:</w:t>
+      </w:r>
+      <w:r>
+        <w:rPr>
+          <w:rFonts w:ascii="Calibri" w:eastAsia="Times New Roman" w:hAnsi="Calibri" w:cs="Calibri"/>
+          <w:color w:val="1F2933"/>
+          <w:sz w:val="20"/>
+          <w:szCs w:val="19"/>
+          <w:lang w:val="en"/>
+        </w:rPr>
+        <w:t xml:space="preserve"> Jest, </w:t>
+      </w:r>
+      <w:proofErr w:type="spellStart"/>
+      <w:r>
+        <w:rPr>
+          <w:rFonts w:ascii="Calibri" w:eastAsia="Times New Roman" w:hAnsi="Calibri" w:cs="Calibri"/>
+          <w:color w:val="1F2933"/>
+          <w:sz w:val="20"/>
+          <w:szCs w:val="19"/>
+          <w:lang w:val="en"/>
+        </w:rPr>
+        <w:t>Vitest</w:t>
+      </w:r>
+      <w:proofErr w:type="spellEnd"/>
+      <w:r>
+        <w:rPr>
+          <w:rFonts w:ascii="Calibri" w:eastAsia="Times New Roman" w:hAnsi="Calibri" w:cs="Calibri"/>
+          <w:color w:val="1F2933"/>
+          <w:sz w:val="20"/>
+          <w:szCs w:val="19"/>
+          <w:lang w:val="en"/>
+        </w:rPr>
+        <w:t>, Sentry, Prometheus, Grafana</w:t>
+      </w:r>
+    </w:p>
+    <w:p>
+      <w:pPr>
+        <w:spacing w:before="23" w:after="30" w:line="250" w:lineRule="auto"/>
+        <w:divId w:val="1210610357"/>
+        <w:rPr>
+          <w:rFonts w:ascii="Calibri" w:eastAsia="Times New Roman" w:hAnsi="Calibri" w:cs="Calibri"/>
+          <w:color w:val="1F2933"/>
+          <w:sz w:val="20"/>
+          <w:szCs w:val="19"/>
+          <w:lang w:val="en"/>
+        </w:rPr>
+      </w:pPr>
+      <w:r>
+        <w:rPr>
+          <w:rStyle w:val="label2"/>
+          <w:rFonts w:ascii="Calibri" w:eastAsia="Times New Roman" w:hAnsi="Calibri" w:cs="Calibri"/>
+          <w:color w:val="1F2933"/>
+          <w:sz w:val="20"/>
+          <w:szCs w:val="19"/>
+          <w:lang w:val="en"/>
+        </w:rPr>
+        <w:t>Tools &amp; Integrations:</w:t>
+      </w:r>
+      <w:r>
+        <w:rPr>
+          <w:rFonts w:ascii="Calibri" w:eastAsia="Times New Roman" w:hAnsi="Calibri" w:cs="Calibri"/>
+          <w:color w:val="1F2933"/>
+          <w:sz w:val="20"/>
+          <w:szCs w:val="19"/>
+          <w:lang w:val="en"/>
+        </w:rPr>
+        <w:t xml:space="preserve"> Git, Stripe, </w:t>
+      </w:r>
+      <w:proofErr w:type="spellStart"/>
+      <w:r>
+        <w:rPr>
+          <w:rFonts w:ascii="Calibri" w:eastAsia="Times New Roman" w:hAnsi="Calibri" w:cs="Calibri"/>
+          <w:color w:val="1F2933"/>
+          <w:sz w:val="20"/>
+          <w:szCs w:val="19"/>
+          <w:lang w:val="en"/>
+        </w:rPr>
+        <w:t>Paymob</w:t>
+      </w:r>
+      <w:proofErr w:type="spellEnd"/>
+      <w:r>
+        <w:rPr>
+          <w:rFonts w:ascii="Calibri" w:eastAsia="Times New Roman" w:hAnsi="Calibri" w:cs="Calibri"/>
+          <w:color w:val="1F2933"/>
+          <w:sz w:val="20"/>
+          <w:szCs w:val="19"/>
+          <w:lang w:val="en"/>
+        </w:rPr>
+        <w:t xml:space="preserve">, </w:t>
+      </w:r>
+      <w:proofErr w:type="spellStart"/>
+      <w:r>
+        <w:rPr>
+          <w:rFonts w:ascii="Calibri" w:eastAsia="Times New Roman" w:hAnsi="Calibri" w:cs="Calibri"/>
+          <w:color w:val="1F2933"/>
+          <w:sz w:val="20"/>
+          <w:szCs w:val="19"/>
+          <w:lang w:val="en"/>
+        </w:rPr>
+        <w:t>Hostex</w:t>
+      </w:r>
+      <w:proofErr w:type="spellEnd"/>
+      <w:r>
+        <w:rPr>
+          <w:rFonts w:ascii="Calibri" w:eastAsia="Times New Roman" w:hAnsi="Calibri" w:cs="Calibri"/>
+          <w:color w:val="1F2933"/>
+          <w:sz w:val="20"/>
+          <w:szCs w:val="19"/>
+          <w:lang w:val="en"/>
+        </w:rPr>
+        <w:t>, Linear</w:t>
+      </w:r>
+    </w:p>
+    <w:p>
+      <w:pPr>
+        <w:spacing w:after="30" w:line="250" w:lineRule="auto"/>
+        <w:divId w:val="1210610357"/>
+        <w:rPr>
+          <w:rFonts w:ascii="Calibri" w:eastAsia="Times New Roman" w:hAnsi="Calibri" w:cs="Calibri"/>
+          <w:color w:val="1F2933"/>
+          <w:sz w:val="20"/>
+          <w:szCs w:val="19"/>
+          <w:lang w:val="en"/>
+        </w:rPr>
+      </w:pPr>
+      <w:r>
+        <w:rPr>
+          <w:rFonts w:ascii="Calibri" w:eastAsia="Times New Roman" w:hAnsi="Calibri" w:cs="Calibri"/>
+          <w:b/>
+          <w:color w:val="1F2933"/>
+          <w:sz w:val="20"/>
+          <w:szCs w:val="19"/>
+          <w:lang w:val="en"/>
+        </w:rPr>
+        <w:t>Practices:</w:t>
+      </w:r>
+      <w:r>
+        <w:rPr>
+          <w:rFonts w:ascii="Calibri" w:eastAsia="Times New Roman" w:hAnsi="Calibri" w:cs="Calibri"/>
+          <w:color w:val="1F2933"/>
+          <w:sz w:val="20"/>
+          <w:szCs w:val="19"/>
+          <w:lang w:val="en"/>
+        </w:rPr>
+        <w:t xml:space="preserve"> </w:t>
+      </w:r>
+      <w:r>
+        <w:rPr>
+          <w:rFonts w:ascii="Calibri" w:eastAsia="Times New Roman" w:hAnsi="Calibri" w:cs="Calibri"/>
+          <w:color w:val="1F2933"/>
+          <w:sz w:val="20"/>
+          <w:szCs w:val="19"/>
+          <w:lang w:val="en"/>
+        </w:rPr>
+        <w:t xml:space="preserve">Agile/Scrum, System Design, Code Review, </w:t>
+      </w:r>
+      <w:r>
+        <w:rPr>
+          <w:rFonts w:ascii="Calibri" w:eastAsia="Times New Roman" w:hAnsi="Calibri" w:cs="Calibri"/>
+          <w:color w:val="1F2933"/>
+          <w:sz w:val="20"/>
+          <w:szCs w:val="19"/>
+          <w:lang w:val="en"/>
+        </w:rPr>
+        <w:t>Event-Driven Architecture, Micro-Frontends, SOLID, Unit Testing</w:t>
+      </w:r>
+    </w:p>
+    <w:p>
+      <w:pPr>
+        <w:pStyle w:val="Heading2"/>
+        <w:spacing w:before="200" w:after="80"/>
+        <w:rPr>
+          <w:rFonts w:ascii="Calibri" w:eastAsia="Times New Roman" w:hAnsi="Calibri" w:cs="Calibri"/>
+          <w:sz w:val="24"/>
+          <w:lang w:val="en"/>
+        </w:rPr>
+      </w:pPr>
+      <w:r>
+        <w:rPr>
+          <w:rFonts w:ascii="Calibri" w:hAnsi="Calibri" w:cs="Calibri"/>
+          <w:spacing w:val="10"/>
+          <w:sz w:val="23"/>
+          <w:szCs w:val="23"/>
+        </w:rPr>
+        <w:t>PROFESSIONAL EXPERIENCE</w:t>
+      </w:r>
+    </w:p>
+    <w:p>
+      <w:pPr>
+        <w:keepNext/>
+        <w:tabs>
+          <w:tab w:val="right" w:pos="10500"/>
+        </w:tabs>
+        <w:spacing w:before="160" w:after="20"/>
+        <w:divId w:val="920871238"/>
+      </w:pPr>
+      <w:r>
+        <w:rPr>
+          <w:rFonts w:ascii="Calibri" w:hAnsi="Calibri" w:cs="Calibri"/>
+          <w:b/>
+          <w:bCs/>
+          <w:color w:val="102A43"/>
+          <w:sz w:val="21"/>
+          <w:szCs w:val="21"/>
+        </w:rPr>
+        <w:t>Circle360</w:t>
+      </w:r>
+      <w:r>
+        <w:rPr>
+          <w:rFonts w:ascii="Calibri" w:hAnsi="Calibri" w:cs="Calibri"/>
+          <w:b/>
+          <w:bCs/>
+          <w:color w:val="334E68"/>
+          <w:sz w:val="21"/>
+          <w:szCs w:val="21"/>
+        </w:rPr>
+        <w:t xml:space="preserve"> — Full-Stack Developer</w:t>
+      </w:r>
+      <w:r>
+        <w:rPr>
+          <w:rFonts w:ascii="Calibri" w:hAnsi="Calibri" w:cs="Calibri"/>
+          <w:color w:val="486581"/>
+          <w:sz w:val="20"/>
+          <w:szCs w:val="20"/>
+        </w:rPr>
+        <w:tab/>
+        <w:t>May 2026 – Present</w:t>
+      </w:r>
+    </w:p>
+    <w:p>
+      <w:pPr>
+        <w:numPr>
+          <w:ilvl w:val="0"/>
+          <w:numId w:val="1"/>
+        </w:numPr>
+        <w:spacing w:after="30" w:line="250" w:lineRule="auto"/>
+        <w:ind w:left="320" w:hanging="220"/>
+        <w:divId w:val="225066477"/>
+        <w:rPr>
+          <w:rFonts w:ascii="Calibri" w:eastAsia="Times New Roman" w:hAnsi="Calibri" w:cs="Calibri"/>
+          <w:color w:val="1F2933"/>
+          <w:sz w:val="20"/>
+          <w:szCs w:val="19"/>
+          <w:lang w:val="en"/>
+        </w:rPr>
+      </w:pPr>
+      <w:r>
+        <w:rPr>
+          <w:rFonts w:ascii="Calibri" w:eastAsia="Times New Roman" w:hAnsi="Calibri" w:cs="Calibri"/>
+          <w:color w:val="1F2933"/>
+          <w:sz w:val="20"/>
+          <w:szCs w:val="19"/>
+          <w:lang w:val="en"/>
+        </w:rPr>
+        <w:t xml:space="preserve">Deliver Angular micro-frontends on .NET (C#) backends for large-scale </w:t>
+      </w:r>
+      <w:r>
+        <w:rPr>
+          <w:rFonts w:ascii="Calibri" w:eastAsia="Times New Roman" w:hAnsi="Calibri" w:cs="Calibri"/>
+          <w:color w:val="1F2933"/>
+          <w:sz w:val="20"/>
+          <w:szCs w:val="19"/>
+          <w:lang w:val="en"/>
+        </w:rPr>
+        <w:t xml:space="preserve">Saudi government </w:t>
+      </w:r>
+      <w:r>
+        <w:rPr>
+          <w:rFonts w:ascii="Calibri" w:eastAsia="Times New Roman" w:hAnsi="Calibri" w:cs="Calibri"/>
+          <w:color w:val="1F2933"/>
+          <w:sz w:val="20"/>
+          <w:szCs w:val="19"/>
+          <w:lang w:val="en"/>
+        </w:rPr>
+        <w:t>digital transformation projects</w:t>
+      </w:r>
+      <w:r>
+        <w:rPr>
+          <w:rFonts w:ascii="Calibri" w:eastAsia="Times New Roman" w:hAnsi="Calibri" w:cs="Calibri"/>
+          <w:color w:val="1F2933"/>
+          <w:sz w:val="20"/>
+          <w:szCs w:val="19"/>
+          <w:lang w:val="en"/>
+        </w:rPr>
+        <w:t>.</w:t>
+      </w:r>
+    </w:p>
+    <w:p>
+      <w:pPr>
+        <w:pStyle w:val="ListParagraph"/>
+        <w:numPr>
+          <w:ilvl w:val="0"/>
+          <w:numId w:val="1"/>
+        </w:numPr>
+        <w:spacing w:after="30" w:line="250" w:lineRule="auto"/>
+        <w:ind w:left="320" w:hanging="220"/>
+        <w:divId w:val="225066477"/>
+        <w:rPr>
+          <w:rFonts w:ascii="Calibri" w:hAnsi="Calibri" w:cs="Calibri"/>
+          <w:color w:val="1F2933"/>
+          <w:sz w:val="20"/>
+        </w:rPr>
+      </w:pPr>
+      <w:r>
+        <w:rPr>
+          <w:rFonts w:ascii="Calibri" w:hAnsi="Calibri" w:cs="Calibri"/>
+          <w:color w:val="1F2933"/>
+          <w:sz w:val="20"/>
+        </w:rPr>
+        <w:t>Build</w:t>
+      </w:r>
+      <w:r>
+        <w:rPr>
+          <w:rFonts w:ascii="Calibri" w:hAnsi="Calibri" w:cs="Calibri"/>
+          <w:color w:val="1F2933"/>
+          <w:sz w:val="20"/>
+        </w:rPr>
+        <w:t xml:space="preserve"> lazy-loaded Angular feature modules with strictly typed models and </w:t>
+      </w:r>
+      <w:proofErr w:type="spellStart"/>
+      <w:r>
+        <w:rPr>
+          <w:rFonts w:ascii="Calibri" w:hAnsi="Calibri" w:cs="Calibri"/>
+          <w:color w:val="1F2933"/>
+          <w:sz w:val="20"/>
+        </w:rPr>
+        <w:t>OnPush</w:t>
+      </w:r>
+      <w:proofErr w:type="spellEnd"/>
+      <w:r>
+        <w:rPr>
+          <w:rFonts w:ascii="Calibri" w:hAnsi="Calibri" w:cs="Calibri"/>
+          <w:color w:val="1F2933"/>
+          <w:sz w:val="20"/>
+        </w:rPr>
+        <w:t xml:space="preserve"> change detection, consuming .NET (C#) REST APIs through a thin, injectable service layer; enforce a smart/presentational component split with </w:t>
+      </w:r>
+      <w:proofErr w:type="spellStart"/>
+      <w:r>
+        <w:rPr>
+          <w:rFonts w:ascii="Calibri" w:hAnsi="Calibri" w:cs="Calibri"/>
+          <w:color w:val="1F2933"/>
+          <w:sz w:val="20"/>
+        </w:rPr>
+        <w:t>RxJS</w:t>
+      </w:r>
+      <w:proofErr w:type="spellEnd"/>
+      <w:r>
+        <w:rPr>
+          <w:rFonts w:ascii="Calibri" w:hAnsi="Calibri" w:cs="Calibri"/>
+          <w:color w:val="1F2933"/>
+          <w:sz w:val="20"/>
+        </w:rPr>
+        <w:t>-driven state to keep feature logic testable.</w:t>
+      </w:r>
+    </w:p>
+    <w:p>
+      <w:pPr>
+        <w:pStyle w:val="ListParagraph"/>
+        <w:numPr>
+          <w:ilvl w:val="0"/>
+          <w:numId w:val="1"/>
+        </w:numPr>
+        <w:spacing w:after="30" w:line="250" w:lineRule="auto"/>
+        <w:ind w:left="320" w:hanging="220"/>
+        <w:divId w:val="225066477"/>
+        <w:rPr>
+          <w:rFonts w:ascii="Calibri" w:hAnsi="Calibri" w:cs="Calibri"/>
+          <w:color w:val="1F2933"/>
+          <w:sz w:val="20"/>
+        </w:rPr>
+      </w:pPr>
+      <w:r>
+        <w:rPr>
+          <w:rFonts w:ascii="Calibri" w:hAnsi="Calibri" w:cs="Calibri"/>
+          <w:color w:val="1F2933"/>
+          <w:sz w:val="20"/>
+        </w:rPr>
+        <w:t xml:space="preserve">Extract shared UI and cross-cutting concerns (auth interceptors, centralized error handling, i18n/RTL) into reusable libraries used across teams, eliminating duplication; </w:t>
+      </w:r>
+      <w:r>
+        <w:rPr>
+          <w:rFonts w:ascii="Calibri" w:hAnsi="Calibri" w:cs="Calibri"/>
+          <w:color w:val="1F2933"/>
+          <w:sz w:val="20"/>
+        </w:rPr>
+        <w:t>apply</w:t>
+      </w:r>
+      <w:r>
+        <w:rPr>
+          <w:rFonts w:ascii="Calibri" w:hAnsi="Calibri" w:cs="Calibri"/>
+          <w:color w:val="1F2933"/>
+          <w:sz w:val="20"/>
+        </w:rPr>
+        <w:t xml:space="preserve"> SOLID boundaries and explicit DTO-to-view-model mapping to keep API contracts out of UI state.</w:t>
+      </w:r>
+    </w:p>
+    <w:p>
+      <w:pPr>
+        <w:pStyle w:val="ListParagraph"/>
+        <w:numPr>
+          <w:ilvl w:val="0"/>
+          <w:numId w:val="1"/>
+        </w:numPr>
+        <w:spacing w:after="30" w:line="250" w:lineRule="auto"/>
+        <w:ind w:left="320" w:hanging="220"/>
+        <w:divId w:val="225066477"/>
+        <w:rPr>
+          <w:rFonts w:ascii="Calibri" w:hAnsi="Calibri" w:cs="Calibri"/>
+          <w:color w:val="1F2933"/>
+          <w:sz w:val="20"/>
+        </w:rPr>
+      </w:pPr>
+      <w:r>
+        <w:rPr>
+          <w:rFonts w:ascii="Calibri" w:hAnsi="Calibri" w:cs="Calibri"/>
+          <w:color w:val="1F2933"/>
+          <w:sz w:val="20"/>
+        </w:rPr>
+        <w:t xml:space="preserve">Maintain code quality across frontend and backend through strict TypeScript and C# typing, single-responsibility design, linting and analyzer rules enforced in CI, unit tests on business logic, </w:t>
+      </w:r>
+      <w:r>
+        <w:rPr>
+          <w:rFonts w:ascii="Calibri" w:hAnsi="Calibri" w:cs="Calibri"/>
+          <w:color w:val="1F2933"/>
+          <w:sz w:val="20"/>
+        </w:rPr>
+        <w:t xml:space="preserve">peer code reviews, </w:t>
+      </w:r>
+      <w:r>
+        <w:rPr>
+          <w:rFonts w:ascii="Calibri" w:hAnsi="Calibri" w:cs="Calibri"/>
+          <w:color w:val="1F2933"/>
+          <w:sz w:val="20"/>
+        </w:rPr>
+        <w:t>and incremental refactoring.</w:t>
+      </w:r>
+    </w:p>
+    <w:p>
+      <w:pPr>
+        <w:keepNext/>
+        <w:tabs>
+          <w:tab w:val="right" w:pos="10500"/>
+        </w:tabs>
+        <w:spacing w:before="160" w:after="20"/>
+        <w:divId w:val="1473795313"/>
+      </w:pPr>
+      <w:proofErr w:type="spellStart"/>
+      <w:r>
+        <w:rPr>
+          <w:rFonts w:ascii="Calibri" w:hAnsi="Calibri" w:cs="Calibri"/>
+          <w:b/>
+          <w:bCs/>
+          <w:color w:val="102A43"/>
+          <w:sz w:val="21"/>
+          <w:szCs w:val="21"/>
+        </w:rPr>
+        <w:t>Mantaray</w:t>
+      </w:r>
+      <w:proofErr w:type="spellEnd"/>
+      <w:r>
+        <w:rPr>
+          <w:rFonts w:ascii="Calibri" w:hAnsi="Calibri" w:cs="Calibri"/>
+          <w:b/>
+          <w:bCs/>
+          <w:color w:val="102A43"/>
+          <w:sz w:val="21"/>
+          <w:szCs w:val="21"/>
+        </w:rPr>
+        <w:t xml:space="preserve"> Digital Solutions</w:t>
+      </w:r>
+      <w:r>
+        <w:rPr>
+          <w:rFonts w:ascii="Calibri" w:hAnsi="Calibri" w:cs="Calibri"/>
+          <w:b/>
+          <w:bCs/>
+          <w:color w:val="334E68"/>
+          <w:sz w:val="21"/>
+          <w:szCs w:val="21"/>
+        </w:rPr>
+        <w:t xml:space="preserve"> — Full-Stack Developer</w:t>
+      </w:r>
+      <w:r>
+        <w:rPr>
+          <w:rFonts w:ascii="Calibri" w:hAnsi="Calibri" w:cs="Calibri"/>
+          <w:color w:val="486581"/>
+          <w:sz w:val="20"/>
+          <w:szCs w:val="20"/>
+        </w:rPr>
+        <w:tab/>
+        <w:t>Jun 2024 – May 2026</w:t>
+      </w:r>
+    </w:p>
+    <w:p>
+      <w:pPr>
+        <w:numPr>
+          <w:ilvl w:val="0"/>
+          <w:numId w:val="2"/>
+        </w:numPr>
+        <w:spacing w:after="30" w:line="250" w:lineRule="auto"/>
+        <w:ind w:left="320" w:hanging="220"/>
+        <w:divId w:val="90397243"/>
+        <w:rPr>
+          <w:rFonts w:ascii="Calibri" w:eastAsia="Times New Roman" w:hAnsi="Calibri" w:cs="Calibri"/>
+          <w:color w:val="1F2933"/>
+          <w:sz w:val="20"/>
+          <w:szCs w:val="19"/>
+          <w:lang w:val="en"/>
+        </w:rPr>
+      </w:pPr>
+      <w:r>
+        <w:rPr>
+          <w:rFonts w:ascii="Calibri" w:eastAsia="Times New Roman" w:hAnsi="Calibri" w:cs="Calibri"/>
+          <w:color w:val="1F2933"/>
+          <w:sz w:val="20"/>
+          <w:szCs w:val="19"/>
+          <w:lang w:val="en"/>
+        </w:rPr>
+        <w:t xml:space="preserve">Shipped multiple full-stack products end-to-end — owning </w:t>
+      </w:r>
+      <w:r>
+        <w:rPr>
+          <w:rFonts w:ascii="Calibri" w:eastAsia="Times New Roman" w:hAnsi="Calibri" w:cs="Calibri"/>
+          <w:color w:val="1F2933"/>
+          <w:sz w:val="20"/>
+          <w:szCs w:val="19"/>
+          <w:lang w:val="en"/>
+        </w:rPr>
+        <w:t>system design</w:t>
+      </w:r>
+      <w:r>
+        <w:rPr>
+          <w:rFonts w:ascii="Calibri" w:eastAsia="Times New Roman" w:hAnsi="Calibri" w:cs="Calibri"/>
+          <w:color w:val="1F2933"/>
+          <w:sz w:val="20"/>
+          <w:szCs w:val="19"/>
+          <w:lang w:val="en"/>
+        </w:rPr>
+        <w:t xml:space="preserve">, API design, and deployment — using </w:t>
+      </w:r>
+      <w:proofErr w:type="spellStart"/>
+      <w:r>
+        <w:rPr>
+          <w:rFonts w:ascii="Calibri" w:eastAsia="Times New Roman" w:hAnsi="Calibri" w:cs="Calibri"/>
+          <w:color w:val="1F2933"/>
+          <w:sz w:val="20"/>
+          <w:szCs w:val="19"/>
+          <w:lang w:val="en"/>
+        </w:rPr>
+        <w:t>NestJS</w:t>
+      </w:r>
+      <w:proofErr w:type="spellEnd"/>
+      <w:r>
+        <w:rPr>
+          <w:rFonts w:ascii="Calibri" w:eastAsia="Times New Roman" w:hAnsi="Calibri" w:cs="Calibri"/>
+          <w:color w:val="1F2933"/>
+          <w:sz w:val="20"/>
+          <w:szCs w:val="19"/>
+          <w:lang w:val="en"/>
+        </w:rPr>
+        <w:t>, React/Next.js, RabbitMQ, and GCP.</w:t>
+      </w:r>
+    </w:p>
+    <w:p>
+      <w:pPr>
+        <w:numPr>
+          <w:ilvl w:val="0"/>
+          <w:numId w:val="2"/>
+        </w:numPr>
+        <w:spacing w:after="30" w:line="250" w:lineRule="auto"/>
+        <w:ind w:left="320" w:hanging="220"/>
+        <w:divId w:val="90397243"/>
+        <w:rPr>
+          <w:rFonts w:ascii="Calibri" w:eastAsia="Times New Roman" w:hAnsi="Calibri" w:cs="Calibri"/>
+          <w:color w:val="1F2933"/>
+          <w:sz w:val="20"/>
+          <w:szCs w:val="19"/>
+          <w:lang w:val="en"/>
+        </w:rPr>
+      </w:pPr>
+      <w:r>
+        <w:rPr>
+          <w:rFonts w:ascii="Calibri" w:eastAsia="Times New Roman" w:hAnsi="Calibri" w:cs="Calibri"/>
+          <w:color w:val="1F2933"/>
+          <w:sz w:val="20"/>
+          <w:szCs w:val="19"/>
+          <w:lang w:val="en"/>
+        </w:rPr>
+        <w:t>Designed resilient, event-driven microservices with RabbitMQ to power asynchronous workflows such as billing, notifications, and real-time updates at scale.</w:t>
+      </w:r>
+    </w:p>
+    <w:p>
+      <w:pPr>
+        <w:numPr>
+          <w:ilvl w:val="0"/>
+          <w:numId w:val="2"/>
+        </w:numPr>
+        <w:spacing w:after="30" w:line="250" w:lineRule="auto"/>
+        <w:ind w:left="320" w:hanging="220"/>
+        <w:divId w:val="90397243"/>
+        <w:rPr>
+          <w:rFonts w:ascii="Calibri" w:eastAsia="Times New Roman" w:hAnsi="Calibri" w:cs="Calibri"/>
+          <w:color w:val="1F2933"/>
+          <w:sz w:val="20"/>
+          <w:szCs w:val="19"/>
+          <w:lang w:val="en"/>
+        </w:rPr>
+      </w:pPr>
+      <w:r>
+        <w:rPr>
+          <w:rFonts w:ascii="Calibri" w:eastAsia="Times New Roman" w:hAnsi="Calibri" w:cs="Calibri"/>
+          <w:color w:val="1F2933"/>
+          <w:sz w:val="20"/>
+          <w:szCs w:val="19"/>
+          <w:lang w:val="en"/>
+        </w:rPr>
+        <w:t>Deployed and managed containerized applications on GCP using Docker and Kubernetes for auto-scaling and high availability.</w:t>
+      </w:r>
+    </w:p>
+    <w:p>
+      <w:pPr>
+        <w:numPr>
+          <w:ilvl w:val="0"/>
+          <w:numId w:val="2"/>
+        </w:numPr>
+        <w:spacing w:after="30" w:line="250" w:lineRule="auto"/>
+        <w:ind w:left="320" w:hanging="220"/>
+        <w:divId w:val="90397243"/>
+        <w:rPr>
+          <w:rFonts w:ascii="Calibri" w:eastAsia="Times New Roman" w:hAnsi="Calibri" w:cs="Calibri"/>
+          <w:color w:val="1F2933"/>
+          <w:sz w:val="20"/>
+          <w:szCs w:val="19"/>
+          <w:lang w:val="en"/>
+        </w:rPr>
+      </w:pPr>
+      <w:r>
+        <w:rPr>
+          <w:rFonts w:ascii="Calibri" w:eastAsia="Times New Roman" w:hAnsi="Calibri" w:cs="Calibri"/>
+          <w:color w:val="1F2933"/>
+          <w:sz w:val="20"/>
+          <w:szCs w:val="19"/>
+          <w:lang w:val="en"/>
+        </w:rPr>
+        <w:t>Cut average API response time by introducing Redis caching and optimizing hot-path database queries.</w:t>
+      </w:r>
+    </w:p>
+    <w:p>
+      <w:pPr>
+        <w:numPr>
+          <w:ilvl w:val="0"/>
+          <w:numId w:val="2"/>
+        </w:numPr>
+        <w:spacing w:after="30" w:line="250" w:lineRule="auto"/>
+        <w:ind w:left="320" w:hanging="220"/>
+        <w:divId w:val="90397243"/>
+        <w:rPr>
+          <w:rFonts w:ascii="Calibri" w:eastAsia="Times New Roman" w:hAnsi="Calibri" w:cs="Calibri"/>
+          <w:color w:val="1F2933"/>
+          <w:sz w:val="20"/>
+          <w:szCs w:val="19"/>
+          <w:lang w:val="en"/>
+        </w:rPr>
+      </w:pPr>
+      <w:r>
+        <w:rPr>
+          <w:rFonts w:ascii="Calibri" w:eastAsia="Times New Roman" w:hAnsi="Calibri" w:cs="Calibri"/>
+          <w:color w:val="1F2933"/>
+          <w:sz w:val="20"/>
+          <w:szCs w:val="19"/>
+          <w:lang w:val="en"/>
+        </w:rPr>
+        <w:t>Set up</w:t>
+      </w:r>
+      <w:r>
+        <w:rPr>
+          <w:rFonts w:ascii="Calibri" w:eastAsia="Times New Roman" w:hAnsi="Calibri" w:cs="Calibri"/>
+          <w:color w:val="1F2933"/>
+          <w:sz w:val="20"/>
+          <w:szCs w:val="19"/>
+          <w:lang w:val="en"/>
+        </w:rPr>
+        <w:t xml:space="preserve"> a </w:t>
+      </w:r>
+      <w:proofErr w:type="spellStart"/>
+      <w:r>
+        <w:rPr>
+          <w:rFonts w:ascii="Calibri" w:eastAsia="Times New Roman" w:hAnsi="Calibri" w:cs="Calibri"/>
+          <w:color w:val="1F2933"/>
+          <w:sz w:val="20"/>
+          <w:szCs w:val="19"/>
+          <w:lang w:val="en"/>
+        </w:rPr>
+        <w:t>Turborepo</w:t>
+      </w:r>
+      <w:proofErr w:type="spellEnd"/>
+      <w:r>
+        <w:rPr>
+          <w:rFonts w:ascii="Calibri" w:eastAsia="Times New Roman" w:hAnsi="Calibri" w:cs="Calibri"/>
+          <w:color w:val="1F2933"/>
+          <w:sz w:val="20"/>
+          <w:szCs w:val="19"/>
+          <w:lang w:val="en"/>
+        </w:rPr>
+        <w:t xml:space="preserve"> </w:t>
+      </w:r>
+      <w:proofErr w:type="spellStart"/>
+      <w:r>
+        <w:rPr>
+          <w:rFonts w:ascii="Calibri" w:eastAsia="Times New Roman" w:hAnsi="Calibri" w:cs="Calibri"/>
+          <w:color w:val="1F2933"/>
+          <w:sz w:val="20"/>
+          <w:szCs w:val="19"/>
+          <w:lang w:val="en"/>
+        </w:rPr>
+        <w:t>monorepo</w:t>
+      </w:r>
+      <w:proofErr w:type="spellEnd"/>
+      <w:r>
+        <w:rPr>
+          <w:rFonts w:ascii="Calibri" w:eastAsia="Times New Roman" w:hAnsi="Calibri" w:cs="Calibri"/>
+          <w:color w:val="1F2933"/>
+          <w:sz w:val="20"/>
+          <w:szCs w:val="19"/>
+          <w:lang w:val="en"/>
+        </w:rPr>
+        <w:t xml:space="preserve">, Git Conventional Commits, and CI/CD pipelines, improving build times, </w:t>
+      </w:r>
+      <w:r>
+        <w:rPr>
+          <w:rFonts w:ascii="Calibri" w:eastAsia="Times New Roman" w:hAnsi="Calibri" w:cs="Calibri"/>
+          <w:color w:val="1F2933"/>
+          <w:sz w:val="20"/>
+          <w:szCs w:val="19"/>
+          <w:lang w:val="en"/>
+        </w:rPr>
+        <w:t>code reviews, and release management across Agile sprints</w:t>
+      </w:r>
+      <w:r>
+        <w:rPr>
+          <w:rFonts w:ascii="Calibri" w:eastAsia="Times New Roman" w:hAnsi="Calibri" w:cs="Calibri"/>
+          <w:color w:val="1F2933"/>
+          <w:sz w:val="20"/>
+          <w:szCs w:val="19"/>
+          <w:lang w:val="en"/>
+        </w:rPr>
+        <w:t>.</w:t>
+      </w:r>
+    </w:p>
+    <w:p>
+      <w:pPr>
+        <w:keepNext/>
+        <w:tabs>
+          <w:tab w:val="right" w:pos="10500"/>
+        </w:tabs>
+        <w:spacing w:before="160" w:after="20"/>
+        <w:divId w:val="562370232"/>
+      </w:pPr>
+      <w:r>
+        <w:rPr>
+          <w:rFonts w:ascii="Calibri" w:hAnsi="Calibri" w:cs="Calibri"/>
+          <w:b/>
+          <w:bCs/>
+          <w:color w:val="102A43"/>
+          <w:sz w:val="21"/>
+          <w:szCs w:val="21"/>
+        </w:rPr>
+        <w:t>Freelance</w:t>
+      </w:r>
+      <w:r>
+        <w:rPr>
+          <w:rFonts w:ascii="Calibri" w:hAnsi="Calibri" w:cs="Calibri"/>
+          <w:b/>
+          <w:bCs/>
+          <w:color w:val="334E68"/>
+          <w:sz w:val="21"/>
+          <w:szCs w:val="21"/>
+        </w:rPr>
+        <w:t xml:space="preserve"> — Full-Stack Developer (Concurrent)</w:t>
+      </w:r>
+      <w:r>
+        <w:rPr>
+          <w:rFonts w:ascii="Calibri" w:hAnsi="Calibri" w:cs="Calibri"/>
+          <w:color w:val="486581"/>
+          <w:sz w:val="20"/>
+          <w:szCs w:val="20"/>
+        </w:rPr>
+        <w:tab/>
+        <w:t>2023 – Present</w:t>
+      </w:r>
+    </w:p>
+    <w:p>
+      <w:pPr>
+        <w:numPr>
+          <w:ilvl w:val="0"/>
+          <w:numId w:val="3"/>
+        </w:numPr>
+        <w:spacing w:after="30" w:line="250" w:lineRule="auto"/>
+        <w:ind w:left="320" w:hanging="220"/>
+        <w:divId w:val="1573075446"/>
+        <w:rPr>
+          <w:rFonts w:ascii="Calibri" w:eastAsia="Times New Roman" w:hAnsi="Calibri" w:cs="Calibri"/>
+          <w:color w:val="1F2933"/>
+          <w:sz w:val="20"/>
+          <w:szCs w:val="19"/>
+          <w:lang w:val="en"/>
+        </w:rPr>
+      </w:pPr>
+      <w:r>
+        <w:rPr>
+          <w:rFonts w:ascii="Calibri" w:eastAsia="Times New Roman" w:hAnsi="Calibri" w:cs="Calibri"/>
+          <w:color w:val="1F2933"/>
+          <w:sz w:val="20"/>
+          <w:szCs w:val="19"/>
+          <w:lang w:val="en"/>
+        </w:rPr>
+        <w:t>Design, build, and deploy full-stack web applications for independent clients, owning requirements, architecture, development, and production deployment</w:t>
+      </w:r>
+      <w:r>
+        <w:rPr>
+          <w:rFonts w:ascii="Calibri" w:eastAsia="Times New Roman" w:hAnsi="Calibri" w:cs="Calibri"/>
+          <w:color w:val="1F2933"/>
+          <w:sz w:val="20"/>
+          <w:szCs w:val="19"/>
+          <w:lang w:val="en"/>
+        </w:rPr>
+        <w:t>.</w:t>
+      </w:r>
+    </w:p>
+    <w:p>
+      <w:pPr>
+        <w:numPr>
+          <w:ilvl w:val="0"/>
+          <w:numId w:val="3"/>
+        </w:numPr>
+        <w:spacing w:after="30" w:line="250" w:lineRule="auto"/>
+        <w:ind w:left="320" w:hanging="220"/>
+        <w:divId w:val="1573075446"/>
+        <w:rPr>
+          <w:rFonts w:ascii="Calibri" w:eastAsia="Times New Roman" w:hAnsi="Calibri" w:cs="Calibri"/>
+          <w:color w:val="1F2933"/>
+          <w:sz w:val="20"/>
+          <w:szCs w:val="19"/>
+          <w:lang w:val="en"/>
+        </w:rPr>
+      </w:pPr>
+      <w:r>
+        <w:rPr>
+          <w:rFonts w:ascii="Calibri" w:eastAsia="Times New Roman" w:hAnsi="Calibri" w:cs="Calibri"/>
+          <w:color w:val="1F2933"/>
+          <w:sz w:val="20"/>
+          <w:szCs w:val="19"/>
+          <w:lang w:val="en"/>
+        </w:rPr>
+        <w:t>Build across Vue, React/Next.js, Node.js/Express, and MongoDB, including real-time features (Socket.io), PDF generation (Puppeteer), Arabic (RTL) interfaces, and AWS S3 storage.</w:t>
+      </w:r>
+    </w:p>
+    <w:p>
+      <w:pPr>
+        <w:pStyle w:val="Heading2"/>
+        <w:spacing w:before="200" w:after="80"/>
+        <w:rPr>
+          <w:rFonts w:ascii="Calibri" w:hAnsi="Calibri" w:cs="Calibri"/>
+          <w:spacing w:val="10"/>
+          <w:sz w:val="23"/>
+          <w:szCs w:val="23"/>
+        </w:rPr>
+      </w:pPr>
+      <w:r>
+        <w:rPr>
+          <w:rFonts w:ascii="Calibri" w:hAnsi="Calibri" w:cs="Calibri"/>
+          <w:spacing w:val="10"/>
+          <w:sz w:val="23"/>
+          <w:szCs w:val="23"/>
+        </w:rPr>
+        <w:lastRenderedPageBreak/>
+        <w:t>PROJECTS</w:t>
+      </w:r>
+    </w:p>
+    <w:p>
+      <w:pPr>
+        <w:keepNext/>
+        <w:tabs>
+          <w:tab w:val="right" w:pos="10500"/>
+        </w:tabs>
+        <w:spacing w:before="160" w:after="20"/>
+      </w:pPr>
+      <w:proofErr w:type="spellStart"/>
+      <w:r>
+        <w:rPr>
+          <w:rFonts w:ascii="Calibri" w:hAnsi="Calibri" w:cs="Calibri"/>
+          <w:b/>
+          <w:bCs/>
+          <w:color w:val="102A43"/>
+          <w:sz w:val="21"/>
+          <w:szCs w:val="21"/>
+        </w:rPr>
+        <w:t>YallaMed</w:t>
+      </w:r>
+      <w:proofErr w:type="spellEnd"/>
+      <w:r>
+        <w:rPr>
+          <w:rFonts w:ascii="Calibri" w:hAnsi="Calibri" w:cs="Calibri"/>
+          <w:b/>
+          <w:bCs/>
+          <w:color w:val="334E68"/>
+          <w:sz w:val="21"/>
+          <w:szCs w:val="21"/>
+        </w:rPr>
+        <w:t xml:space="preserve"> — Clinic Management Platform (Freelance)</w:t>
+      </w:r>
+      <w:r>
+        <w:rPr>
+          <w:rFonts w:ascii="Calibri" w:hAnsi="Calibri" w:cs="Calibri"/>
+          <w:color w:val="486581"/>
+          <w:sz w:val="20"/>
+          <w:szCs w:val="20"/>
+        </w:rPr>
+        <w:tab/>
+        <w:t>2023 – Present</w:t>
+      </w:r>
+    </w:p>
+    <w:p>
+      <w:pPr>
+        <w:keepNext/>
+        <w:spacing w:after="20"/>
+      </w:pPr>
+      <w:r>
+        <w:rPr>
+          <w:rFonts w:ascii="Calibri" w:hAnsi="Calibri" w:cs="Calibri"/>
+          <w:i/>
+          <w:iCs/>
+          <w:color w:val="486581"/>
+          <w:sz w:val="19"/>
+          <w:szCs w:val="19"/>
+        </w:rPr>
+        <w:t>Tech: Vue, Express, MongoDB, Socket.io, Puppeteer, AWS S3</w:t>
+      </w:r>
+    </w:p>
+    <w:p>
+      <w:pPr>
+        <w:pStyle w:val="ListParagraph"/>
+        <w:numPr>
+          <w:ilvl w:val="0"/>
+          <w:numId w:val="4"/>
+        </w:numPr>
+        <w:spacing w:after="30" w:line="250" w:lineRule="auto"/>
+        <w:ind w:left="320" w:hanging="220"/>
+        <w:rPr>
+          <w:rFonts w:ascii="Calibri" w:hAnsi="Calibri" w:cs="Calibri"/>
+          <w:color w:val="1F2933"/>
+          <w:sz w:val="20"/>
+        </w:rPr>
+      </w:pPr>
+      <w:r>
+        <w:rPr>
+          <w:rFonts w:ascii="Calibri" w:hAnsi="Calibri" w:cs="Calibri"/>
+          <w:color w:val="1F2933"/>
+          <w:sz w:val="20"/>
+        </w:rPr>
+        <w:t>Developed</w:t>
+      </w:r>
+      <w:r>
+        <w:rPr>
+          <w:rFonts w:ascii="Calibri" w:hAnsi="Calibri" w:cs="Calibri"/>
+          <w:color w:val="1F2933"/>
+          <w:sz w:val="20"/>
+        </w:rPr>
+        <w:t xml:space="preserve"> multi-branch clinic </w:t>
+      </w:r>
+      <w:r>
+        <w:rPr>
+          <w:rFonts w:ascii="Calibri" w:hAnsi="Calibri" w:cs="Calibri"/>
+          <w:color w:val="1F2933"/>
+          <w:sz w:val="20"/>
+        </w:rPr>
+        <w:t>operations</w:t>
+      </w:r>
+      <w:r>
+        <w:rPr>
+          <w:rFonts w:ascii="Calibri" w:hAnsi="Calibri" w:cs="Calibri"/>
+          <w:color w:val="1F2933"/>
+          <w:sz w:val="20"/>
+        </w:rPr>
+        <w:t xml:space="preserve"> for the Egyptian healthcare market, </w:t>
+      </w:r>
+      <w:r>
+        <w:rPr>
+          <w:rFonts w:ascii="Calibri" w:hAnsi="Calibri" w:cs="Calibri"/>
+          <w:color w:val="1F2933"/>
+          <w:sz w:val="20"/>
+        </w:rPr>
+        <w:t>including</w:t>
+      </w:r>
+      <w:r>
+        <w:rPr>
+          <w:rFonts w:ascii="Calibri" w:hAnsi="Calibri" w:cs="Calibri"/>
+          <w:color w:val="1F2933"/>
+          <w:sz w:val="20"/>
+        </w:rPr>
+        <w:t xml:space="preserve"> booking and scheduling, online patient requests, inventory management, EGP billing, and granular team roles.</w:t>
+      </w:r>
+    </w:p>
+    <w:p>
+      <w:pPr>
+        <w:pStyle w:val="ListParagraph"/>
+        <w:numPr>
+          <w:ilvl w:val="0"/>
+          <w:numId w:val="4"/>
+        </w:numPr>
+        <w:spacing w:after="30" w:line="250" w:lineRule="auto"/>
+        <w:ind w:left="320" w:hanging="220"/>
+        <w:rPr>
+          <w:rFonts w:ascii="Calibri" w:hAnsi="Calibri" w:cs="Calibri"/>
+          <w:color w:val="1F2933"/>
+          <w:sz w:val="20"/>
+        </w:rPr>
+      </w:pPr>
+      <w:r>
+        <w:rPr>
+          <w:rFonts w:ascii="Calibri" w:hAnsi="Calibri" w:cs="Calibri"/>
+          <w:color w:val="1F2933"/>
+          <w:sz w:val="20"/>
+        </w:rPr>
+        <w:t>Model</w:t>
+      </w:r>
+      <w:r>
+        <w:rPr>
+          <w:rFonts w:ascii="Calibri" w:hAnsi="Calibri" w:cs="Calibri"/>
+          <w:color w:val="1F2933"/>
+          <w:sz w:val="20"/>
+        </w:rPr>
+        <w:t>ed coded clinical records (ICD-10 / LOINC), canvas prescriptions rendered to branded PDFs with Puppeteer, and a specialty MS disease registry.</w:t>
+      </w:r>
+    </w:p>
+    <w:p>
+      <w:pPr>
+        <w:pStyle w:val="ListParagraph"/>
+        <w:numPr>
+          <w:ilvl w:val="0"/>
+          <w:numId w:val="4"/>
+        </w:numPr>
+        <w:spacing w:after="30" w:line="250" w:lineRule="auto"/>
+        <w:ind w:left="320" w:hanging="220"/>
+        <w:rPr>
+          <w:rFonts w:ascii="Calibri" w:hAnsi="Calibri" w:cs="Calibri"/>
+          <w:color w:val="1F2933"/>
+          <w:sz w:val="20"/>
+        </w:rPr>
+      </w:pPr>
+      <w:r>
+        <w:rPr>
+          <w:rFonts w:ascii="Calibri" w:hAnsi="Calibri" w:cs="Calibri"/>
+          <w:color w:val="1F2933"/>
+          <w:sz w:val="20"/>
+        </w:rPr>
+        <w:t>Delivered full Arabic (RTL) support, real-time updates via Socket.io, and asset storage on AWS S3.</w:t>
+      </w:r>
+    </w:p>
+    <w:p>
+      <w:pPr>
+        <w:pStyle w:val="ListParagraph"/>
+        <w:numPr>
+          <w:ilvl w:val="0"/>
+          <w:numId w:val="4"/>
+        </w:numPr>
+        <w:spacing w:after="30" w:line="250" w:lineRule="auto"/>
+        <w:ind w:left="320" w:hanging="220"/>
+        <w:rPr>
+          <w:rFonts w:ascii="Calibri" w:hAnsi="Calibri" w:cs="Calibri"/>
+          <w:color w:val="1F2933"/>
+          <w:sz w:val="20"/>
+        </w:rPr>
+      </w:pPr>
+      <w:r>
+        <w:rPr>
+          <w:rFonts w:ascii="Calibri" w:hAnsi="Calibri" w:cs="Calibri"/>
+          <w:color w:val="1F2933"/>
+          <w:sz w:val="20"/>
+        </w:rPr>
+        <w:t xml:space="preserve">Live: </w:t>
+      </w:r>
+      <w:hyperlink r:id="rId11" w:history="1">
+        <w:r>
+          <w:rPr>
+            <w:rFonts w:ascii="Calibri" w:hAnsi="Calibri" w:cs="Calibri"/>
+            <w:color w:val="1D4E89"/>
+            <w:sz w:val="20"/>
+          </w:rPr>
+          <w:t>yallamed.uk</w:t>
+        </w:r>
+      </w:hyperlink>
+    </w:p>
+    <w:p>
+      <w:pPr>
+        <w:keepNext/>
+        <w:tabs>
+          <w:tab w:val="right" w:pos="10500"/>
+        </w:tabs>
+        <w:spacing w:before="160" w:after="20"/>
+        <w:divId w:val="1020007317"/>
+      </w:pPr>
+      <w:r>
+        <w:rPr>
+          <w:rFonts w:ascii="Calibri" w:hAnsi="Calibri" w:cs="Calibri"/>
+          <w:b/>
+          <w:bCs/>
+          <w:color w:val="102A43"/>
+          <w:sz w:val="21"/>
+          <w:szCs w:val="21"/>
+        </w:rPr>
+        <w:t>Plato</w:t>
+      </w:r>
+      <w:r>
+        <w:rPr>
+          <w:rFonts w:ascii="Calibri" w:hAnsi="Calibri" w:cs="Calibri"/>
+          <w:b/>
+          <w:bCs/>
+          <w:color w:val="334E68"/>
+          <w:sz w:val="21"/>
+          <w:szCs w:val="21"/>
+        </w:rPr>
+        <w:t xml:space="preserve"> — All-in-One Restaurant Operations Platform</w:t>
+      </w:r>
+      <w:r>
+        <w:rPr>
+          <w:rFonts w:ascii="Calibri" w:hAnsi="Calibri" w:cs="Calibri"/>
+          <w:color w:val="486581"/>
+          <w:sz w:val="20"/>
+          <w:szCs w:val="20"/>
+        </w:rPr>
+        <w:tab/>
+        <w:t>2026</w:t>
+      </w:r>
+    </w:p>
+    <w:p>
+      <w:pPr>
+        <w:divId w:val="1020007317"/>
+        <w:rPr>
+          <w:rFonts w:ascii="Calibri" w:eastAsia="Times New Roman" w:hAnsi="Calibri" w:cs="Calibri"/>
+          <w:b/>
+          <w:bCs/>
+          <w:color w:val="243B53"/>
+          <w:sz w:val="19"/>
+          <w:szCs w:val="19"/>
+          <w:lang w:val="en"/>
+        </w:rPr>
+      </w:pPr>
+      <w:r>
+        <w:rPr>
+          <w:rFonts w:ascii="Calibri" w:hAnsi="Calibri" w:cs="Calibri"/>
+          <w:i/>
+          <w:iCs/>
+          <w:color w:val="486581"/>
+          <w:sz w:val="19"/>
+          <w:szCs w:val="19"/>
+        </w:rPr>
+        <w:t>Tech: Next.js, Convex, TypeScript, Tailwind CSS, Recharts</w:t>
+      </w:r>
+    </w:p>
+    <w:p>
+      <w:pPr>
+        <w:numPr>
+          <w:ilvl w:val="0"/>
+          <w:numId w:val="4"/>
+        </w:numPr>
+        <w:spacing w:after="30" w:line="250" w:lineRule="auto"/>
+        <w:ind w:left="320" w:hanging="220"/>
+        <w:divId w:val="1076517953"/>
+        <w:rPr>
+          <w:rFonts w:ascii="Calibri" w:eastAsia="Times New Roman" w:hAnsi="Calibri" w:cs="Calibri"/>
+          <w:color w:val="1F2933"/>
+          <w:sz w:val="20"/>
+          <w:szCs w:val="19"/>
+          <w:lang w:val="en"/>
+        </w:rPr>
+      </w:pPr>
+      <w:r>
+        <w:rPr>
+          <w:rFonts w:ascii="Calibri" w:eastAsia="Times New Roman" w:hAnsi="Calibri" w:cs="Calibri"/>
+          <w:color w:val="1F2933"/>
+          <w:sz w:val="20"/>
+          <w:szCs w:val="19"/>
+          <w:lang w:val="en"/>
+        </w:rPr>
+        <w:t>Architected an end-to-end</w:t>
+      </w:r>
+      <w:r>
+        <w:rPr>
+          <w:rFonts w:ascii="Calibri" w:eastAsia="Times New Roman" w:hAnsi="Calibri" w:cs="Calibri"/>
+          <w:color w:val="1F2933"/>
+          <w:sz w:val="20"/>
+          <w:szCs w:val="19"/>
+          <w:lang w:val="en"/>
+        </w:rPr>
+        <w:t xml:space="preserve"> restaurant </w:t>
+      </w:r>
+      <w:r>
+        <w:rPr>
+          <w:rFonts w:ascii="Calibri" w:eastAsia="Times New Roman" w:hAnsi="Calibri" w:cs="Calibri"/>
+          <w:color w:val="1F2933"/>
+          <w:sz w:val="20"/>
+          <w:szCs w:val="19"/>
+          <w:lang w:val="en"/>
+        </w:rPr>
+        <w:t>syste</w:t>
+      </w:r>
+      <w:r>
+        <w:rPr>
+          <w:rFonts w:ascii="Calibri" w:eastAsia="Times New Roman" w:hAnsi="Calibri" w:cs="Calibri"/>
+          <w:color w:val="1F2933"/>
+          <w:sz w:val="20"/>
+          <w:szCs w:val="19"/>
+          <w:lang w:val="en"/>
+        </w:rPr>
+        <w:t>m covering POS, kitchen display, inventory and recipe costing, finance/accounting, loyalty, payroll, and multi-branch management, with AI menu-engineering insights and full Arabic (RTL) support.</w:t>
+      </w:r>
+    </w:p>
+    <w:p>
+      <w:pPr>
+        <w:numPr>
+          <w:ilvl w:val="0"/>
+          <w:numId w:val="4"/>
+        </w:numPr>
+        <w:spacing w:after="30" w:line="250" w:lineRule="auto"/>
+        <w:ind w:left="320" w:hanging="220"/>
+        <w:divId w:val="1076517953"/>
+        <w:rPr>
+          <w:rFonts w:ascii="Calibri" w:eastAsia="Times New Roman" w:hAnsi="Calibri" w:cs="Calibri"/>
+          <w:color w:val="1F2933"/>
+          <w:sz w:val="20"/>
+          <w:szCs w:val="19"/>
+          <w:lang w:val="en"/>
+        </w:rPr>
+      </w:pPr>
+      <w:r>
+        <w:rPr>
+          <w:rFonts w:ascii="Calibri" w:eastAsia="Times New Roman" w:hAnsi="Calibri" w:cs="Calibri"/>
+          <w:color w:val="1F2933"/>
+          <w:sz w:val="20"/>
+          <w:szCs w:val="19"/>
+          <w:lang w:val="en"/>
+        </w:rPr>
+        <w:t xml:space="preserve">Website: </w:t>
+      </w:r>
+      <w:hyperlink r:id="rId12" w:history="1">
+        <w:r>
+          <w:rPr>
+            <w:rStyle w:val="Hyperlink"/>
+            <w:rFonts w:ascii="Calibri" w:eastAsia="Times New Roman" w:hAnsi="Calibri" w:cs="Calibri"/>
+            <w:sz w:val="20"/>
             <w:szCs w:val="19"/>
             <w:lang w:val="en"/>
           </w:rPr>
@@ -1153,19 +2158,49 @@
       <w:r>
         <w:rPr>
           <w:rFonts w:ascii="Calibri" w:eastAsia="Times New Roman" w:hAnsi="Calibri" w:cs="Calibri"/>
-          <w:color w:val="1F2933"/>
-          <w:sz w:val="19"/>
-          <w:szCs w:val="19"/>
-          <w:lang w:val="en"/>
-        </w:rPr>
-        <w:t xml:space="preserve">  |  Dashboard: </w:t>
-      </w:r>
-      <w:hyperlink r:id="rId11" w:history="1">
+          <w:color w:val="9AA5B1"/>
+          <w:sz w:val="20"/>
+          <w:szCs w:val="19"/>
+          <w:lang w:val="en"/>
+        </w:rPr>
+        <w:t xml:space="preserve"> </w:t>
+      </w:r>
+      <w:r>
+        <w:rPr>
+          <w:rFonts w:ascii="Calibri" w:eastAsia="Times New Roman" w:hAnsi="Calibri" w:cs="Calibri"/>
+          <w:color w:val="9AA5B1"/>
+          <w:sz w:val="20"/>
+          <w:szCs w:val="19"/>
+          <w:lang w:val="en"/>
+        </w:rPr>
+        <w:t>|</w:t>
+      </w:r>
+      <w:r>
+        <w:rPr>
+          <w:rFonts w:ascii="Calibri" w:eastAsia="Times New Roman" w:hAnsi="Calibri" w:cs="Calibri"/>
+          <w:color w:val="9AA5B1"/>
+          <w:sz w:val="20"/>
+          <w:szCs w:val="19"/>
+          <w:lang w:val="en"/>
+        </w:rPr>
+        <w:t xml:space="preserve"> </w:t>
+      </w:r>
+      <w:r>
+        <w:rPr>
+          <w:rFonts w:ascii="Calibri" w:eastAsia="Times New Roman" w:hAnsi="Calibri" w:cs="Calibri"/>
+          <w:color w:val="1F2933"/>
+          <w:sz w:val="20"/>
+          <w:szCs w:val="19"/>
+          <w:lang w:val="en"/>
+        </w:rPr>
+        <w:t xml:space="preserve">Dashboard: </w:t>
+      </w:r>
+      <w:hyperlink r:id="rId13" w:history="1">
         <w:r>
           <w:rPr>
             <w:rStyle w:val="Hyperlink"/>
             <w:rFonts w:ascii="Calibri" w:eastAsia="Times New Roman" w:hAnsi="Calibri" w:cs="Calibri"/>
-            <w:sz w:val="19"/>
+            <w:sz w:val="20"/>
             <w:szCs w:val="19"/>
             <w:lang w:val="en"/>
           </w:rPr>
@@ -1175,6 +2210,48 @@
     </w:p>
     <w:p>
       <w:pPr>
+        <w:keepNext/>
+        <w:tabs>
+          <w:tab w:val="right" w:pos="10500"/>
+        </w:tabs>
+        <w:spacing w:before="160" w:after="20"/>
+        <w:divId w:val="1170947052"/>
+      </w:pPr>
+      <w:r>
+        <w:rPr>
+          <w:rFonts w:ascii="Calibri" w:hAnsi="Calibri" w:cs="Calibri"/>
+          <w:b/>
+          <w:bCs/>
+          <w:color w:val="102A43"/>
+          <w:sz w:val="21"/>
+          <w:szCs w:val="21"/>
+        </w:rPr>
+        <w:t>Signature Stays</w:t>
+      </w:r>
+      <w:r>
+        <w:rPr>
+          <w:rFonts w:ascii="Calibri" w:hAnsi="Calibri" w:cs="Calibri"/>
+          <w:b/>
+          <w:bCs/>
+          <w:color w:val="334E68"/>
+          <w:sz w:val="21"/>
+          <w:szCs w:val="21"/>
+        </w:rPr>
+        <w:t xml:space="preserve"> — Luxury Short-Stay Rental Platform</w:t>
+      </w:r>
+      <w:r>
+        <w:rPr>
+          <w:rFonts w:ascii="Calibri" w:hAnsi="Calibri" w:cs="Calibri"/>
+          <w:color w:val="486581"/>
+          <w:sz w:val="20"/>
+          <w:szCs w:val="20"/>
+        </w:rPr>
+        <w:tab/>
+        <w:t>2025</w:t>
+      </w:r>
+    </w:p>
+    <w:p>
+      <w:pPr>
         <w:divId w:val="1170947052"/>
         <w:rPr>
           <w:rFonts w:ascii="Calibri" w:eastAsia="Times New Roman" w:hAnsi="Calibri" w:cs="Calibri"/>
@@ -1188,6 +2265,168 @@
       </w:pPr>
       <w:r>
         <w:rPr>
+          <w:rFonts w:ascii="Calibri" w:hAnsi="Calibri" w:cs="Calibri"/>
+          <w:i/>
+          <w:iCs/>
+          <w:color w:val="486581"/>
+          <w:sz w:val="19"/>
+          <w:szCs w:val="19"/>
+        </w:rPr>
+        <w:t xml:space="preserve">Tech: React, Next.js, </w:t>
+      </w:r>
+      <w:proofErr w:type="spellStart"/>
+      <w:r>
+        <w:rPr>
+          <w:rFonts w:ascii="Calibri" w:hAnsi="Calibri" w:cs="Calibri"/>
+          <w:i/>
+          <w:iCs/>
+          <w:color w:val="486581"/>
+          <w:sz w:val="19"/>
+          <w:szCs w:val="19"/>
+        </w:rPr>
+        <w:t>NestJS</w:t>
+      </w:r>
+      <w:proofErr w:type="spellEnd"/>
+      <w:r>
+        <w:rPr>
+          <w:rFonts w:ascii="Calibri" w:hAnsi="Calibri" w:cs="Calibri"/>
+          <w:i/>
+          <w:iCs/>
+          <w:color w:val="486581"/>
+          <w:sz w:val="19"/>
+          <w:szCs w:val="19"/>
+        </w:rPr>
+        <w:t>, Socket.io, PostgreSQL, Redis</w:t>
+      </w:r>
+    </w:p>
+    <w:p>
+      <w:pPr>
+        <w:numPr>
+          <w:ilvl w:val="0"/>
+          <w:numId w:val="5"/>
+        </w:numPr>
+        <w:spacing w:after="30" w:line="250" w:lineRule="auto"/>
+        <w:ind w:left="320" w:hanging="220"/>
+        <w:divId w:val="2112580895"/>
+        <w:rPr>
+          <w:rFonts w:ascii="Calibri" w:eastAsia="Times New Roman" w:hAnsi="Calibri" w:cs="Calibri"/>
+          <w:color w:val="1F2933"/>
+          <w:sz w:val="20"/>
+          <w:szCs w:val="19"/>
+          <w:lang w:val="en"/>
+        </w:rPr>
+      </w:pPr>
+      <w:r>
+        <w:rPr>
+          <w:rFonts w:ascii="Calibri" w:eastAsia="Times New Roman" w:hAnsi="Calibri" w:cs="Calibri"/>
+          <w:color w:val="1F2933"/>
+          <w:sz w:val="20"/>
+          <w:szCs w:val="19"/>
+          <w:lang w:val="en"/>
+        </w:rPr>
+        <w:t>Developed</w:t>
+      </w:r>
+      <w:r>
+        <w:rPr>
+          <w:rFonts w:ascii="Calibri" w:eastAsia="Times New Roman" w:hAnsi="Calibri" w:cs="Calibri"/>
+          <w:color w:val="1F2933"/>
+          <w:sz w:val="20"/>
+          <w:szCs w:val="19"/>
+          <w:lang w:val="en"/>
+        </w:rPr>
+        <w:t xml:space="preserve"> guest booking and an owner dashboard for full property control; integrated </w:t>
+      </w:r>
+      <w:proofErr w:type="spellStart"/>
+      <w:r>
+        <w:rPr>
+          <w:rFonts w:ascii="Calibri" w:eastAsia="Times New Roman" w:hAnsi="Calibri" w:cs="Calibri"/>
+          <w:color w:val="1F2933"/>
+          <w:sz w:val="20"/>
+          <w:szCs w:val="19"/>
+          <w:lang w:val="en"/>
+        </w:rPr>
+        <w:t>Hostex</w:t>
+      </w:r>
+      <w:proofErr w:type="spellEnd"/>
+      <w:r>
+        <w:rPr>
+          <w:rFonts w:ascii="Calibri" w:eastAsia="Times New Roman" w:hAnsi="Calibri" w:cs="Calibri"/>
+          <w:color w:val="1F2933"/>
+          <w:sz w:val="20"/>
+          <w:szCs w:val="19"/>
+          <w:lang w:val="en"/>
+        </w:rPr>
+        <w:t xml:space="preserve"> payments and </w:t>
+      </w:r>
+      <w:r>
+        <w:rPr>
+          <w:rFonts w:ascii="Calibri" w:eastAsia="Times New Roman" w:hAnsi="Calibri" w:cs="Calibri"/>
+          <w:color w:val="1F2933"/>
+          <w:sz w:val="20"/>
+          <w:szCs w:val="19"/>
+          <w:lang w:val="en"/>
+        </w:rPr>
+        <w:t>cut API response times by 40% with Redis caching</w:t>
+      </w:r>
+      <w:r>
+        <w:rPr>
+          <w:rFonts w:ascii="Calibri" w:eastAsia="Times New Roman" w:hAnsi="Calibri" w:cs="Calibri"/>
+          <w:color w:val="1F2933"/>
+          <w:sz w:val="20"/>
+          <w:szCs w:val="19"/>
+          <w:lang w:val="en"/>
+        </w:rPr>
+        <w:t>.</w:t>
+      </w:r>
+    </w:p>
+    <w:p>
+      <w:pPr>
+        <w:keepNext/>
+        <w:tabs>
+          <w:tab w:val="right" w:pos="10500"/>
+        </w:tabs>
+        <w:spacing w:before="160" w:after="20"/>
+        <w:divId w:val="1687558698"/>
+      </w:pPr>
+      <w:proofErr w:type="spellStart"/>
+      <w:r>
+        <w:rPr>
+          <w:rFonts w:ascii="Calibri" w:hAnsi="Calibri" w:cs="Calibri"/>
+          <w:b/>
+          <w:bCs/>
+          <w:color w:val="102A43"/>
+          <w:sz w:val="21"/>
+          <w:szCs w:val="21"/>
+        </w:rPr>
+        <w:t>Yallapass</w:t>
+      </w:r>
+      <w:proofErr w:type="spellEnd"/>
+      <w:r>
+        <w:rPr>
+          <w:rFonts w:ascii="Calibri" w:hAnsi="Calibri" w:cs="Calibri"/>
+          <w:b/>
+          <w:bCs/>
+          <w:color w:val="334E68"/>
+          <w:sz w:val="21"/>
+          <w:szCs w:val="21"/>
+        </w:rPr>
+        <w:t xml:space="preserve"> — Studio Management Platform</w:t>
+      </w:r>
+      <w:r>
+        <w:rPr>
+          <w:rFonts w:ascii="Calibri" w:hAnsi="Calibri" w:cs="Calibri"/>
+          <w:color w:val="486581"/>
+          <w:sz w:val="20"/>
+          <w:szCs w:val="20"/>
+        </w:rPr>
+        <w:tab/>
+        <w:t>2025</w:t>
+      </w:r>
+    </w:p>
+    <w:p>
+      <w:pPr>
+        <w:divId w:val="1687558698"/>
+        <w:rPr>
           <w:rFonts w:ascii="Calibri" w:eastAsia="Times New Roman" w:hAnsi="Calibri" w:cs="Calibri"/>
           <w:b/>
           <w:bCs/>
@@ -1196,50 +2435,166 @@
           <w:szCs w:val="19"/>
           <w:lang w:val="en"/>
         </w:rPr>
-        <w:t xml:space="preserve">Signature Stays — Luxury Short-Stay Rental Platform </w:t>
-      </w:r>
-      <w:r>
-        <w:rPr>
-          <w:rStyle w:val="meta2"/>
-          <w:rFonts w:ascii="Calibri" w:eastAsia="Times New Roman" w:hAnsi="Calibri" w:cs="Calibri"/>
+      </w:pPr>
+      <w:r>
+        <w:rPr>
+          <w:rFonts w:ascii="Calibri" w:hAnsi="Calibri" w:cs="Calibri"/>
+          <w:i/>
+          <w:iCs/>
+          <w:color w:val="486581"/>
           <w:sz w:val="19"/>
           <w:szCs w:val="19"/>
-          <w:lang w:val="en"/>
-        </w:rPr>
-        <w:t>| React, Next.js, NestJS, Socket.io, PostgreSQL, Redis | 2025</w:t>
+        </w:rPr>
+        <w:t xml:space="preserve">Tech: </w:t>
+      </w:r>
+      <w:proofErr w:type="spellStart"/>
+      <w:r>
+        <w:rPr>
+          <w:rFonts w:ascii="Calibri" w:hAnsi="Calibri" w:cs="Calibri"/>
+          <w:i/>
+          <w:iCs/>
+          <w:color w:val="486581"/>
+          <w:sz w:val="19"/>
+          <w:szCs w:val="19"/>
+        </w:rPr>
+        <w:t>NestJS</w:t>
+      </w:r>
+      <w:proofErr w:type="spellEnd"/>
+      <w:r>
+        <w:rPr>
+          <w:rFonts w:ascii="Calibri" w:hAnsi="Calibri" w:cs="Calibri"/>
+          <w:i/>
+          <w:iCs/>
+          <w:color w:val="486581"/>
+          <w:sz w:val="19"/>
+          <w:szCs w:val="19"/>
+        </w:rPr>
+        <w:t>, Next.js, RabbitMQ, MongoDB, Socket.io, GCP, Docker</w:t>
       </w:r>
     </w:p>
     <w:p>
       <w:pPr>
         <w:numPr>
           <w:ilvl w:val="0"/>
-          <w:numId w:val="5"/>
+          <w:numId w:val="6"/>
         </w:numPr>
-        <w:spacing w:before="15" w:after="15"/>
-        <w:divId w:val="2112580895"/>
-        <w:rPr>
-          <w:rFonts w:ascii="Calibri" w:eastAsia="Times New Roman" w:hAnsi="Calibri" w:cs="Calibri"/>
-          <w:color w:val="1F2933"/>
-          <w:sz w:val="19"/>
-          <w:szCs w:val="19"/>
-          <w:lang w:val="en"/>
-        </w:rPr>
-      </w:pPr>
-      <w:r>
-        <w:rPr>
-          <w:rFonts w:ascii="Calibri" w:eastAsia="Times New Roman" w:hAnsi="Calibri" w:cs="Calibri"/>
-          <w:color w:val="1F2933"/>
-          <w:sz w:val="19"/>
-          <w:szCs w:val="19"/>
-          <w:lang w:val="en"/>
-        </w:rPr>
-        <w:lastRenderedPageBreak/>
-        <w:t>Built a rental platform with guest booking and an owner dashboard for full property control; integrated Hostex payments and optimized API response times by 40%.</w:t>
-      </w:r>
-    </w:p>
-    <w:p>
-      <w:pPr>
-        <w:divId w:val="1687558698"/>
+        <w:spacing w:after="30" w:line="250" w:lineRule="auto"/>
+        <w:ind w:left="320" w:hanging="220"/>
+        <w:divId w:val="267548126"/>
+        <w:rPr>
+          <w:rFonts w:ascii="Calibri" w:eastAsia="Times New Roman" w:hAnsi="Calibri" w:cs="Calibri"/>
+          <w:color w:val="1F2933"/>
+          <w:sz w:val="20"/>
+          <w:szCs w:val="19"/>
+          <w:lang w:val="en"/>
+        </w:rPr>
+      </w:pPr>
+      <w:r>
+        <w:rPr>
+          <w:rFonts w:ascii="Calibri" w:eastAsia="Times New Roman" w:hAnsi="Calibri" w:cs="Calibri"/>
+          <w:color w:val="1F2933"/>
+          <w:sz w:val="20"/>
+          <w:szCs w:val="19"/>
+          <w:lang w:val="en"/>
+        </w:rPr>
+        <w:t xml:space="preserve">Engineered a credit and subscription system with </w:t>
+      </w:r>
+      <w:proofErr w:type="spellStart"/>
+      <w:r>
+        <w:rPr>
+          <w:rFonts w:ascii="Calibri" w:eastAsia="Times New Roman" w:hAnsi="Calibri" w:cs="Calibri"/>
+          <w:color w:val="1F2933"/>
+          <w:sz w:val="20"/>
+          <w:szCs w:val="19"/>
+          <w:lang w:val="en"/>
+        </w:rPr>
+        <w:t>NestJS</w:t>
+      </w:r>
+      <w:proofErr w:type="spellEnd"/>
+      <w:r>
+        <w:rPr>
+          <w:rFonts w:ascii="Calibri" w:eastAsia="Times New Roman" w:hAnsi="Calibri" w:cs="Calibri"/>
+          <w:color w:val="1F2933"/>
+          <w:sz w:val="20"/>
+          <w:szCs w:val="19"/>
+          <w:lang w:val="en"/>
+        </w:rPr>
+        <w:t>; integrated RabbitMQ for real-time email notifications and billing workflows.</w:t>
+      </w:r>
+    </w:p>
+    <w:p>
+      <w:pPr>
+        <w:numPr>
+          <w:ilvl w:val="0"/>
+          <w:numId w:val="6"/>
+        </w:numPr>
+        <w:spacing w:after="30" w:line="250" w:lineRule="auto"/>
+        <w:ind w:left="320" w:hanging="220"/>
+        <w:divId w:val="267548126"/>
+        <w:rPr>
+          <w:rFonts w:ascii="Calibri" w:eastAsia="Times New Roman" w:hAnsi="Calibri" w:cs="Calibri"/>
+          <w:color w:val="1F2933"/>
+          <w:sz w:val="20"/>
+          <w:szCs w:val="19"/>
+          <w:lang w:val="en"/>
+        </w:rPr>
+      </w:pPr>
+      <w:r>
+        <w:rPr>
+          <w:rFonts w:ascii="Calibri" w:eastAsia="Times New Roman" w:hAnsi="Calibri" w:cs="Calibri"/>
+          <w:color w:val="1F2933"/>
+          <w:sz w:val="20"/>
+          <w:szCs w:val="19"/>
+          <w:lang w:val="en"/>
+        </w:rPr>
+        <w:t>Deployed on GCP with Kubernetes auto-scaling to handle peak loads.</w:t>
+      </w:r>
+    </w:p>
+    <w:p>
+      <w:pPr>
+        <w:keepNext/>
+        <w:tabs>
+          <w:tab w:val="right" w:pos="10500"/>
+        </w:tabs>
+        <w:spacing w:before="160" w:after="20"/>
+        <w:divId w:val="1770345344"/>
+      </w:pPr>
+      <w:r>
+        <w:rPr>
+          <w:rFonts w:ascii="Calibri" w:hAnsi="Calibri" w:cs="Calibri"/>
+          <w:b/>
+          <w:bCs/>
+          <w:color w:val="102A43"/>
+          <w:sz w:val="21"/>
+          <w:szCs w:val="21"/>
+        </w:rPr>
+        <w:t>Money Manager</w:t>
+      </w:r>
+      <w:r>
+        <w:rPr>
+          <w:rFonts w:ascii="Calibri" w:hAnsi="Calibri" w:cs="Calibri"/>
+          <w:b/>
+          <w:bCs/>
+          <w:color w:val="334E68"/>
+          <w:sz w:val="21"/>
+          <w:szCs w:val="21"/>
+        </w:rPr>
+        <w:t xml:space="preserve"> — Personal Finance App (Backend Developer)</w:t>
+      </w:r>
+      <w:r>
+        <w:rPr>
+          <w:rFonts w:ascii="Calibri" w:hAnsi="Calibri" w:cs="Calibri"/>
+          <w:color w:val="486581"/>
+          <w:sz w:val="20"/>
+          <w:szCs w:val="20"/>
+        </w:rPr>
+        <w:tab/>
+        <w:t>2025</w:t>
+      </w:r>
+    </w:p>
+    <w:p>
+      <w:pPr>
+        <w:divId w:val="1770345344"/>
         <w:rPr>
           <w:rFonts w:ascii="Calibri" w:eastAsia="Times New Roman" w:hAnsi="Calibri" w:cs="Calibri"/>
           <w:b/>
@@ -1252,6 +2607,147 @@
       </w:pPr>
       <w:r>
         <w:rPr>
+          <w:rFonts w:ascii="Calibri" w:hAnsi="Calibri" w:cs="Calibri"/>
+          <w:i/>
+          <w:iCs/>
+          <w:color w:val="486581"/>
+          <w:sz w:val="19"/>
+          <w:szCs w:val="19"/>
+        </w:rPr>
+        <w:t xml:space="preserve">Tech: </w:t>
+      </w:r>
+      <w:proofErr w:type="spellStart"/>
+      <w:r>
+        <w:rPr>
+          <w:rFonts w:ascii="Calibri" w:hAnsi="Calibri" w:cs="Calibri"/>
+          <w:i/>
+          <w:iCs/>
+          <w:color w:val="486581"/>
+          <w:sz w:val="19"/>
+          <w:szCs w:val="19"/>
+        </w:rPr>
+        <w:t>NestJS</w:t>
+      </w:r>
+      <w:proofErr w:type="spellEnd"/>
+      <w:r>
+        <w:rPr>
+          <w:rFonts w:ascii="Calibri" w:hAnsi="Calibri" w:cs="Calibri"/>
+          <w:i/>
+          <w:iCs/>
+          <w:color w:val="486581"/>
+          <w:sz w:val="19"/>
+          <w:szCs w:val="19"/>
+        </w:rPr>
+        <w:t xml:space="preserve">, PostgreSQL, </w:t>
+      </w:r>
+      <w:proofErr w:type="spellStart"/>
+      <w:r>
+        <w:rPr>
+          <w:rFonts w:ascii="Calibri" w:hAnsi="Calibri" w:cs="Calibri"/>
+          <w:i/>
+          <w:iCs/>
+          <w:color w:val="486581"/>
+          <w:sz w:val="19"/>
+          <w:szCs w:val="19"/>
+        </w:rPr>
+        <w:t>TypeORM</w:t>
+      </w:r>
+      <w:proofErr w:type="spellEnd"/>
+      <w:r>
+        <w:rPr>
+          <w:rFonts w:ascii="Calibri" w:hAnsi="Calibri" w:cs="Calibri"/>
+          <w:i/>
+          <w:iCs/>
+          <w:color w:val="486581"/>
+          <w:sz w:val="19"/>
+          <w:szCs w:val="19"/>
+        </w:rPr>
+        <w:t>, RabbitMQ, Socket.io, GCP, Docker</w:t>
+      </w:r>
+    </w:p>
+    <w:p>
+      <w:pPr>
+        <w:numPr>
+          <w:ilvl w:val="0"/>
+          <w:numId w:val="7"/>
+        </w:numPr>
+        <w:spacing w:after="30" w:line="250" w:lineRule="auto"/>
+        <w:ind w:left="320" w:hanging="220"/>
+        <w:divId w:val="611127373"/>
+        <w:rPr>
+          <w:rFonts w:ascii="Calibri" w:eastAsia="Times New Roman" w:hAnsi="Calibri" w:cs="Calibri"/>
+          <w:color w:val="1F2933"/>
+          <w:sz w:val="20"/>
+          <w:szCs w:val="19"/>
+          <w:lang w:val="en"/>
+        </w:rPr>
+      </w:pPr>
+      <w:r>
+        <w:rPr>
+          <w:rFonts w:ascii="Calibri" w:eastAsia="Times New Roman" w:hAnsi="Calibri" w:cs="Calibri"/>
+          <w:color w:val="1F2933"/>
+          <w:sz w:val="20"/>
+          <w:szCs w:val="19"/>
+          <w:lang w:val="en"/>
+        </w:rPr>
+        <w:t>Created</w:t>
+      </w:r>
+      <w:r>
+        <w:rPr>
+          <w:rFonts w:ascii="Calibri" w:eastAsia="Times New Roman" w:hAnsi="Calibri" w:cs="Calibri"/>
+          <w:color w:val="1F2933"/>
+          <w:sz w:val="20"/>
+          <w:szCs w:val="19"/>
+          <w:lang w:val="en"/>
+        </w:rPr>
+        <w:t xml:space="preserve"> a finance tracker for managing expenses, setting budgets, and visualizing spending patterns through charts and reports, with real-time updates via Socket.io.</w:t>
+      </w:r>
+    </w:p>
+    <w:p>
+      <w:pPr>
+        <w:keepNext/>
+        <w:tabs>
+          <w:tab w:val="right" w:pos="10500"/>
+        </w:tabs>
+        <w:spacing w:before="160" w:after="20"/>
+        <w:divId w:val="1868640200"/>
+      </w:pPr>
+      <w:r>
+        <w:rPr>
+          <w:rFonts w:ascii="Calibri" w:hAnsi="Calibri" w:cs="Calibri"/>
+          <w:b/>
+          <w:bCs/>
+          <w:color w:val="102A43"/>
+          <w:sz w:val="21"/>
+          <w:szCs w:val="21"/>
+        </w:rPr>
+        <w:t>Online Learning Platform</w:t>
+      </w:r>
+      <w:r>
+        <w:rPr>
+          <w:rFonts w:ascii="Calibri" w:hAnsi="Calibri" w:cs="Calibri"/>
+          <w:b/>
+          <w:color w:val="334E68"/>
+          <w:sz w:val="21"/>
+          <w:szCs w:val="20"/>
+        </w:rPr>
+        <w:t xml:space="preserve"> — E-Learning Backend</w:t>
+      </w:r>
+      <w:r>
+        <w:rPr>
+          <w:rFonts w:ascii="Calibri" w:hAnsi="Calibri" w:cs="Calibri"/>
+          <w:color w:val="486581"/>
+          <w:sz w:val="20"/>
+          <w:szCs w:val="20"/>
+        </w:rPr>
+        <w:tab/>
+        <w:t>2024</w:t>
+      </w:r>
+    </w:p>
+    <w:p>
+      <w:pPr>
+        <w:divId w:val="1868640200"/>
+        <w:rPr>
           <w:rFonts w:ascii="Calibri" w:eastAsia="Times New Roman" w:hAnsi="Calibri" w:cs="Calibri"/>
           <w:b/>
           <w:bCs/>
@@ -1260,171 +2756,55 @@
           <w:szCs w:val="19"/>
           <w:lang w:val="en"/>
         </w:rPr>
-        <w:t xml:space="preserve">Yallapass — Studio Management Platform </w:t>
-      </w:r>
-      <w:r>
-        <w:rPr>
-          <w:rStyle w:val="meta2"/>
-          <w:rFonts w:ascii="Calibri" w:eastAsia="Times New Roman" w:hAnsi="Calibri" w:cs="Calibri"/>
+      </w:pPr>
+      <w:r>
+        <w:rPr>
+          <w:rFonts w:ascii="Calibri" w:hAnsi="Calibri" w:cs="Calibri"/>
+          <w:i/>
+          <w:iCs/>
+          <w:color w:val="486581"/>
           <w:sz w:val="19"/>
           <w:szCs w:val="19"/>
-          <w:lang w:val="en"/>
-        </w:rPr>
-        <w:t>| NestJS, Next.js, RabbitMQ, MongoDB, Socket.io, GCP, Docker | 2025</w:t>
-      </w:r>
-    </w:p>
-    <w:p>
-      <w:pPr>
-        <w:numPr>
-          <w:ilvl w:val="0"/>
-          <w:numId w:val="6"/>
-        </w:numPr>
-        <w:spacing w:before="15" w:after="15"/>
-        <w:divId w:val="267548126"/>
-        <w:rPr>
-          <w:rFonts w:ascii="Calibri" w:eastAsia="Times New Roman" w:hAnsi="Calibri" w:cs="Calibri"/>
-          <w:color w:val="1F2933"/>
+        </w:rPr>
+        <w:t xml:space="preserve">Tech: </w:t>
+      </w:r>
+      <w:proofErr w:type="spellStart"/>
+      <w:r>
+        <w:rPr>
+          <w:rFonts w:ascii="Calibri" w:hAnsi="Calibri" w:cs="Calibri"/>
+          <w:i/>
+          <w:iCs/>
+          <w:color w:val="486581"/>
           <w:sz w:val="19"/>
           <w:szCs w:val="19"/>
-          <w:lang w:val="en"/>
-        </w:rPr>
-      </w:pPr>
-      <w:r>
-        <w:rPr>
-          <w:rFonts w:ascii="Calibri" w:eastAsia="Times New Roman" w:hAnsi="Calibri" w:cs="Calibri"/>
-          <w:color w:val="1F2933"/>
+        </w:rPr>
+        <w:t>NestJS</w:t>
+      </w:r>
+      <w:proofErr w:type="spellEnd"/>
+      <w:r>
+        <w:rPr>
+          <w:rFonts w:ascii="Calibri" w:hAnsi="Calibri" w:cs="Calibri"/>
+          <w:i/>
+          <w:iCs/>
+          <w:color w:val="486581"/>
           <w:sz w:val="19"/>
           <w:szCs w:val="19"/>
-          <w:lang w:val="en"/>
-        </w:rPr>
-        <w:t>Engineered a credit and subscription system with NestJS; integrated RabbitMQ for real-time email notifications and billing workflows.</w:t>
-      </w:r>
-    </w:p>
-    <w:p>
-      <w:pPr>
-        <w:numPr>
-          <w:ilvl w:val="0"/>
-          <w:numId w:val="6"/>
-        </w:numPr>
-        <w:spacing w:before="15" w:after="15"/>
-        <w:divId w:val="267548126"/>
-        <w:rPr>
-          <w:rFonts w:ascii="Calibri" w:eastAsia="Times New Roman" w:hAnsi="Calibri" w:cs="Calibri"/>
-          <w:color w:val="1F2933"/>
+        </w:rPr>
+        <w:t xml:space="preserve">, MongoDB, </w:t>
+      </w:r>
+      <w:proofErr w:type="spellStart"/>
+      <w:r>
+        <w:rPr>
+          <w:rFonts w:ascii="Calibri" w:hAnsi="Calibri" w:cs="Calibri"/>
+          <w:i/>
+          <w:iCs/>
+          <w:color w:val="486581"/>
           <w:sz w:val="19"/>
           <w:szCs w:val="19"/>
-          <w:lang w:val="en"/>
-        </w:rPr>
-      </w:pPr>
-      <w:r>
-        <w:rPr>
-          <w:rFonts w:ascii="Calibri" w:eastAsia="Times New Roman" w:hAnsi="Calibri" w:cs="Calibri"/>
-          <w:color w:val="1F2933"/>
-          <w:sz w:val="19"/>
-          <w:szCs w:val="19"/>
-          <w:lang w:val="en"/>
-        </w:rPr>
-        <w:t>Deployed on GCP with Kubernetes auto-scaling to handle peak loads.</w:t>
-      </w:r>
-    </w:p>
-    <w:p>
-      <w:pPr>
-        <w:divId w:val="1770345344"/>
-        <w:rPr>
-          <w:rFonts w:ascii="Calibri" w:eastAsia="Times New Roman" w:hAnsi="Calibri" w:cs="Calibri"/>
-          <w:b/>
-          <w:bCs/>
-          <w:color w:val="243B53"/>
-          <w:sz w:val="19"/>
-          <w:szCs w:val="19"/>
-          <w:lang w:val="en"/>
-        </w:rPr>
-      </w:pPr>
-      <w:r>
-        <w:rPr>
-          <w:rFonts w:ascii="Calibri" w:eastAsia="Times New Roman" w:hAnsi="Calibri" w:cs="Calibri"/>
-          <w:b/>
-          <w:bCs/>
-          <w:color w:val="243B53"/>
-          <w:sz w:val="19"/>
-          <w:szCs w:val="19"/>
-          <w:lang w:val="en"/>
-        </w:rPr>
-        <w:t xml:space="preserve">Money Manager — Personal Finance App (Backend Developer) </w:t>
-      </w:r>
-      <w:r>
-        <w:rPr>
-          <w:rStyle w:val="meta2"/>
-          <w:rFonts w:ascii="Calibri" w:eastAsia="Times New Roman" w:hAnsi="Calibri" w:cs="Calibri"/>
-          <w:sz w:val="19"/>
-          <w:szCs w:val="19"/>
-          <w:lang w:val="en"/>
-        </w:rPr>
-        <w:t>| NestJS, PostgreSQL, TypeORM, RabbitMQ, Socket.io, GCP, Docker | 2025</w:t>
-      </w:r>
-    </w:p>
-    <w:p>
-      <w:pPr>
-        <w:numPr>
-          <w:ilvl w:val="0"/>
-          <w:numId w:val="7"/>
-        </w:numPr>
-        <w:spacing w:before="15" w:after="15"/>
-        <w:divId w:val="611127373"/>
-        <w:rPr>
-          <w:rFonts w:ascii="Calibri" w:eastAsia="Times New Roman" w:hAnsi="Calibri" w:cs="Calibri"/>
-          <w:color w:val="1F2933"/>
-          <w:sz w:val="19"/>
-          <w:szCs w:val="19"/>
-          <w:lang w:val="en"/>
-        </w:rPr>
-      </w:pPr>
-      <w:r>
-        <w:rPr>
-          <w:rFonts w:ascii="Calibri" w:eastAsia="Times New Roman" w:hAnsi="Calibri" w:cs="Calibri"/>
-          <w:color w:val="1F2933"/>
-          <w:sz w:val="19"/>
-          <w:szCs w:val="19"/>
-          <w:lang w:val="en"/>
-        </w:rPr>
-        <w:t>Built a finance tracker for managing expenses, setting budgets, and visualizing spending patterns through charts and reports, with real-time updates via Socket.io.</w:t>
-      </w:r>
-    </w:p>
-    <w:p>
-      <w:pPr>
-        <w:divId w:val="1868640200"/>
-        <w:rPr>
-          <w:rFonts w:ascii="Calibri" w:eastAsia="Times New Roman" w:hAnsi="Calibri" w:cs="Calibri"/>
-          <w:b/>
-          <w:bCs/>
-          <w:color w:val="243B53"/>
-          <w:sz w:val="19"/>
-          <w:szCs w:val="19"/>
-          <w:lang w:val="en"/>
-        </w:rPr>
-      </w:pPr>
-      <w:r>
-        <w:rPr>
-          <w:rFonts w:ascii="Calibri" w:eastAsia="Times New Roman" w:hAnsi="Calibri" w:cs="Calibri"/>
-          <w:b/>
-          <w:bCs/>
-          <w:color w:val="243B53"/>
-          <w:sz w:val="19"/>
-          <w:szCs w:val="19"/>
-          <w:lang w:val="en"/>
-        </w:rPr>
-        <w:t xml:space="preserve">Online Learning Platform </w:t>
-      </w:r>
-      <w:r>
-        <w:rPr>
-          <w:rStyle w:val="meta2"/>
-          <w:rFonts w:ascii="Calibri" w:eastAsia="Times New Roman" w:hAnsi="Calibri" w:cs="Calibri"/>
-          <w:sz w:val="19"/>
-          <w:szCs w:val="19"/>
-          <w:lang w:val="en"/>
-        </w:rPr>
-        <w:t>| NestJS, MongoDB, Paymob | 2024</w:t>
-      </w:r>
+        </w:rPr>
+        <w:t>Paymob</w:t>
+      </w:r>
+      <w:proofErr w:type="spellEnd"/>
     </w:p>
     <w:p>
       <w:pPr>
@@ -1432,25 +2812,58 @@
           <w:ilvl w:val="0"/>
           <w:numId w:val="8"/>
         </w:numPr>
-        <w:spacing w:before="15" w:after="15"/>
+        <w:spacing w:after="30" w:line="250" w:lineRule="auto"/>
+        <w:ind w:left="320" w:hanging="220"/>
         <w:divId w:val="1618870409"/>
         <w:rPr>
           <w:rFonts w:ascii="Calibri" w:eastAsia="Times New Roman" w:hAnsi="Calibri" w:cs="Calibri"/>
           <w:color w:val="1F2933"/>
-          <w:sz w:val="19"/>
-          <w:szCs w:val="19"/>
-          <w:lang w:val="en"/>
-        </w:rPr>
-      </w:pPr>
-      <w:r>
-        <w:rPr>
-          <w:rFonts w:ascii="Calibri" w:eastAsia="Times New Roman" w:hAnsi="Calibri" w:cs="Calibri"/>
-          <w:color w:val="1F2933"/>
-          <w:sz w:val="19"/>
-          <w:szCs w:val="19"/>
-          <w:lang w:val="en"/>
-        </w:rPr>
-        <w:t>Implemented JWT authentication and integrated Paymob for online course payments.</w:t>
+          <w:sz w:val="20"/>
+          <w:szCs w:val="19"/>
+          <w:lang w:val="en"/>
+        </w:rPr>
+      </w:pPr>
+      <w:r>
+        <w:rPr>
+          <w:rFonts w:ascii="Calibri" w:eastAsia="Times New Roman" w:hAnsi="Calibri" w:cs="Calibri"/>
+          <w:color w:val="1F2933"/>
+          <w:sz w:val="20"/>
+          <w:szCs w:val="19"/>
+          <w:lang w:val="en"/>
+        </w:rPr>
+        <w:t>Secured the platform with</w:t>
+      </w:r>
+      <w:r>
+        <w:rPr>
+          <w:rFonts w:ascii="Calibri" w:eastAsia="Times New Roman" w:hAnsi="Calibri" w:cs="Calibri"/>
+          <w:color w:val="1F2933"/>
+          <w:sz w:val="20"/>
+          <w:szCs w:val="19"/>
+          <w:lang w:val="en"/>
+        </w:rPr>
+        <w:t xml:space="preserve"> JWT authentication and integrated </w:t>
+      </w:r>
+      <w:proofErr w:type="spellStart"/>
+      <w:r>
+        <w:rPr>
+          <w:rFonts w:ascii="Calibri" w:eastAsia="Times New Roman" w:hAnsi="Calibri" w:cs="Calibri"/>
+          <w:color w:val="1F2933"/>
+          <w:sz w:val="20"/>
+          <w:szCs w:val="19"/>
+          <w:lang w:val="en"/>
+        </w:rPr>
+        <w:t>Paymob</w:t>
+      </w:r>
+      <w:proofErr w:type="spellEnd"/>
+      <w:r>
+        <w:rPr>
+          <w:rFonts w:ascii="Calibri" w:eastAsia="Times New Roman" w:hAnsi="Calibri" w:cs="Calibri"/>
+          <w:color w:val="1F2933"/>
+          <w:sz w:val="20"/>
+          <w:szCs w:val="19"/>
+          <w:lang w:val="en"/>
+        </w:rPr>
+        <w:t xml:space="preserve"> for online course payments.</w:t>
       </w:r>
     </w:p>
     <w:p>
@@ -1459,160 +2872,289 @@
           <w:ilvl w:val="0"/>
           <w:numId w:val="8"/>
         </w:numPr>
-        <w:spacing w:before="15" w:after="15"/>
+        <w:spacing w:after="30" w:line="250" w:lineRule="auto"/>
+        <w:ind w:left="320" w:hanging="220"/>
         <w:divId w:val="1618870409"/>
         <w:rPr>
           <w:rFonts w:ascii="Calibri" w:eastAsia="Times New Roman" w:hAnsi="Calibri" w:cs="Calibri"/>
           <w:color w:val="1F2933"/>
-          <w:sz w:val="19"/>
-          <w:szCs w:val="19"/>
-          <w:lang w:val="en"/>
-        </w:rPr>
-      </w:pPr>
-      <w:r>
-        <w:rPr>
-          <w:rFonts w:ascii="Calibri" w:eastAsia="Times New Roman" w:hAnsi="Calibri" w:cs="Calibri"/>
-          <w:color w:val="1F2933"/>
-          <w:sz w:val="19"/>
+          <w:sz w:val="20"/>
+          <w:szCs w:val="19"/>
+          <w:lang w:val="en"/>
+        </w:rPr>
+      </w:pPr>
+      <w:r>
+        <w:rPr>
+          <w:rFonts w:ascii="Calibri" w:eastAsia="Times New Roman" w:hAnsi="Calibri" w:cs="Calibri"/>
+          <w:color w:val="1F2933"/>
+          <w:sz w:val="20"/>
           <w:szCs w:val="19"/>
           <w:lang w:val="en"/>
         </w:rPr>
         <w:t xml:space="preserve">GitHub: </w:t>
       </w:r>
-      <w:hyperlink r:id="rId12" w:history="1">
+      <w:hyperlink r:id="rId14" w:history="1">
         <w:r>
           <w:rPr>
             <w:rStyle w:val="Hyperlink"/>
             <w:rFonts w:ascii="Calibri" w:eastAsia="Times New Roman" w:hAnsi="Calibri" w:cs="Calibri"/>
-            <w:sz w:val="19"/>
+            <w:sz w:val="20"/>
             <w:szCs w:val="19"/>
             <w:lang w:val="en"/>
           </w:rPr>
-          <w:t>View repository</w:t>
+          <w:t>github.com/AKira0169/</w:t>
         </w:r>
+        <w:proofErr w:type="spellStart"/>
+        <w:r>
+          <w:rPr>
+            <w:rStyle w:val="Hyperlink"/>
+            <w:rFonts w:ascii="Calibri" w:eastAsia="Times New Roman" w:hAnsi="Calibri" w:cs="Calibri"/>
+            <w:sz w:val="20"/>
+            <w:szCs w:val="19"/>
+            <w:lang w:val="en"/>
+          </w:rPr>
+          <w:t>onlineLearningPlatFrom</w:t>
+        </w:r>
+        <w:proofErr w:type="spellEnd"/>
       </w:hyperlink>
     </w:p>
     <w:p>
       <w:pPr>
         <w:pStyle w:val="Heading2"/>
-        <w:rPr>
-          <w:rFonts w:ascii="Calibri" w:eastAsia="Times New Roman" w:hAnsi="Calibri" w:cs="Calibri"/>
-          <w:lang w:val="en"/>
-        </w:rPr>
-      </w:pPr>
-      <w:r>
-        <w:rPr>
-          <w:rFonts w:ascii="Calibri" w:eastAsia="Times New Roman" w:hAnsi="Calibri" w:cs="Calibri"/>
-          <w:lang w:val="en"/>
-        </w:rPr>
-        <w:t>Education</w:t>
-      </w:r>
-    </w:p>
-    <w:p>
-      <w:pPr>
+        <w:spacing w:before="200" w:after="80"/>
+        <w:rPr>
+          <w:rFonts w:ascii="Calibri" w:eastAsia="Times New Roman" w:hAnsi="Calibri" w:cs="Calibri"/>
+          <w:sz w:val="24"/>
+          <w:lang w:val="en"/>
+        </w:rPr>
+      </w:pPr>
+      <w:r>
+        <w:rPr>
+          <w:rFonts w:ascii="Calibri" w:hAnsi="Calibri" w:cs="Calibri"/>
+          <w:spacing w:val="10"/>
+          <w:sz w:val="23"/>
+          <w:szCs w:val="23"/>
+        </w:rPr>
+        <w:t>EDUCATION</w:t>
+      </w:r>
+    </w:p>
+    <w:p>
+      <w:pPr>
+        <w:keepNext/>
+        <w:tabs>
+          <w:tab w:val="right" w:pos="10500"/>
+        </w:tabs>
+        <w:spacing w:before="160" w:after="20"/>
         <w:divId w:val="354354429"/>
-        <w:rPr>
-          <w:rFonts w:ascii="Calibri" w:eastAsia="Times New Roman" w:hAnsi="Calibri" w:cs="Calibri"/>
-          <w:color w:val="1F2933"/>
-          <w:sz w:val="19"/>
-          <w:szCs w:val="19"/>
-          <w:lang w:val="en"/>
-        </w:rPr>
-      </w:pPr>
-      <w:r>
-        <w:rPr>
-          <w:rStyle w:val="company2"/>
-          <w:rFonts w:ascii="Calibri" w:eastAsia="Times New Roman" w:hAnsi="Calibri" w:cs="Calibri"/>
-          <w:color w:val="243B53"/>
+      </w:pPr>
+      <w:r>
+        <w:rPr>
+          <w:rFonts w:ascii="Calibri" w:hAnsi="Calibri" w:cs="Calibri"/>
+          <w:b/>
+          <w:bCs/>
+          <w:color w:val="102A43"/>
+          <w:sz w:val="21"/>
+          <w:szCs w:val="21"/>
+        </w:rPr>
+        <w:t>Ain Shams University</w:t>
+      </w:r>
+      <w:r>
+        <w:rPr>
+          <w:rFonts w:ascii="Calibri" w:hAnsi="Calibri" w:cs="Calibri"/>
+          <w:b/>
+          <w:bCs/>
+          <w:color w:val="334E68"/>
+          <w:sz w:val="21"/>
+          <w:szCs w:val="21"/>
+        </w:rPr>
+        <w:t xml:space="preserve"> — B.Sc. in Computer Science</w:t>
+      </w:r>
+      <w:r>
+        <w:rPr>
+          <w:rFonts w:ascii="Calibri" w:hAnsi="Calibri" w:cs="Calibri"/>
+          <w:color w:val="486581"/>
           <w:sz w:val="20"/>
           <w:szCs w:val="20"/>
-          <w:lang w:val="en"/>
-        </w:rPr>
-        <w:t>Ain Shams University</w:t>
-      </w:r>
-      <w:r>
-        <w:rPr>
-          <w:rStyle w:val="role1"/>
-          <w:rFonts w:ascii="Calibri" w:eastAsia="Times New Roman" w:hAnsi="Calibri" w:cs="Calibri"/>
-          <w:lang w:val="en"/>
-        </w:rPr>
-        <w:t xml:space="preserve"> — B.Sc. in Computer Science</w:t>
-      </w:r>
-      <w:r>
-        <w:rPr>
-          <w:rFonts w:ascii="Calibri" w:eastAsia="Times New Roman" w:hAnsi="Calibri" w:cs="Calibri"/>
-          <w:color w:val="1F2933"/>
-          <w:sz w:val="19"/>
-          <w:szCs w:val="19"/>
-          <w:lang w:val="en"/>
-        </w:rPr>
-        <w:t xml:space="preserve"> </w:t>
-      </w:r>
-      <w:r>
-        <w:rPr>
-          <w:rStyle w:val="dates1"/>
-          <w:rFonts w:ascii="Calibri" w:eastAsia="Times New Roman" w:hAnsi="Calibri" w:cs="Calibri"/>
-          <w:lang w:val="en"/>
-        </w:rPr>
+        </w:rPr>
+        <w:tab/>
         <w:t>Oct 2020 – May 2024</w:t>
       </w:r>
-      <w:r>
-        <w:rPr>
-          <w:rFonts w:ascii="Calibri" w:eastAsia="Times New Roman" w:hAnsi="Calibri" w:cs="Calibri"/>
-          <w:color w:val="1F2933"/>
-          <w:sz w:val="19"/>
-          <w:szCs w:val="19"/>
-          <w:lang w:val="en"/>
-        </w:rPr>
-        <w:t xml:space="preserve"> </w:t>
-      </w:r>
     </w:p>
     <w:p>
       <w:pPr>
         <w:pStyle w:val="Heading2"/>
-        <w:rPr>
-          <w:rFonts w:ascii="Calibri" w:eastAsia="Times New Roman" w:hAnsi="Calibri" w:cs="Calibri"/>
-          <w:lang w:val="en"/>
-        </w:rPr>
-      </w:pPr>
-      <w:r>
-        <w:rPr>
-          <w:rFonts w:ascii="Calibri" w:eastAsia="Times New Roman" w:hAnsi="Calibri" w:cs="Calibri"/>
-          <w:lang w:val="en"/>
-        </w:rPr>
-        <w:t>Languages</w:t>
+        <w:spacing w:before="200" w:after="80"/>
+        <w:rPr>
+          <w:rFonts w:ascii="Calibri" w:eastAsia="Times New Roman" w:hAnsi="Calibri" w:cs="Calibri"/>
+          <w:sz w:val="24"/>
+          <w:lang w:val="en"/>
+        </w:rPr>
+      </w:pPr>
+      <w:r>
+        <w:rPr>
+          <w:rFonts w:ascii="Calibri" w:hAnsi="Calibri" w:cs="Calibri"/>
+          <w:spacing w:val="10"/>
+          <w:sz w:val="23"/>
+          <w:szCs w:val="23"/>
+        </w:rPr>
+        <w:t>LANGUAGES</w:t>
       </w:r>
     </w:p>
     <w:p>
       <w:pPr>
         <w:pStyle w:val="NormalWeb"/>
-        <w:rPr>
-          <w:rFonts w:ascii="Calibri" w:hAnsi="Calibri" w:cs="Calibri"/>
-          <w:color w:val="1F2933"/>
-          <w:sz w:val="19"/>
-          <w:szCs w:val="19"/>
-          <w:lang w:val="en"/>
-        </w:rPr>
-      </w:pPr>
-      <w:r>
-        <w:rPr>
-          <w:rFonts w:ascii="Calibri" w:hAnsi="Calibri" w:cs="Calibri"/>
-          <w:color w:val="1F2933"/>
-          <w:sz w:val="19"/>
-          <w:szCs w:val="19"/>
-          <w:lang w:val="en"/>
-        </w:rPr>
-        <w:t>Arabic: Native   |   English: Professional Proficiency</w:t>
+        <w:spacing w:after="30" w:line="250" w:lineRule="auto"/>
+        <w:rPr>
+          <w:rFonts w:ascii="Calibri" w:hAnsi="Calibri" w:cs="Calibri"/>
+          <w:color w:val="1F2933"/>
+          <w:sz w:val="20"/>
+          <w:szCs w:val="19"/>
+          <w:lang w:val="en"/>
+        </w:rPr>
+      </w:pPr>
+      <w:r>
+        <w:rPr>
+          <w:rFonts w:ascii="Calibri" w:hAnsi="Calibri" w:cs="Calibri"/>
+          <w:color w:val="1F2933"/>
+          <w:sz w:val="20"/>
+          <w:szCs w:val="19"/>
+          <w:lang w:val="en"/>
+        </w:rPr>
+        <w:t xml:space="preserve">Arabic: Native </w:t>
+      </w:r>
+      <w:r>
+        <w:rPr>
+          <w:rFonts w:ascii="Calibri" w:hAnsi="Calibri" w:cs="Calibri"/>
+          <w:color w:val="1F2933"/>
+          <w:sz w:val="20"/>
+          <w:szCs w:val="19"/>
+          <w:lang w:val="en"/>
+        </w:rPr>
+        <w:t>|</w:t>
+      </w:r>
+      <w:r>
+        <w:rPr>
+          <w:rFonts w:ascii="Calibri" w:hAnsi="Calibri" w:cs="Calibri"/>
+          <w:color w:val="1F2933"/>
+          <w:sz w:val="20"/>
+          <w:szCs w:val="19"/>
+          <w:lang w:val="en"/>
+        </w:rPr>
+        <w:t xml:space="preserve"> English: Professional Proficiency</w:t>
       </w:r>
     </w:p>
     <w:sectPr>
+      <w:headerReference w:type="even" r:id="rId15"/>
+      <w:headerReference w:type="default" r:id="rId16"/>
+      <w:footerReference w:type="even" r:id="rId17"/>
+      <w:footerReference w:type="default" r:id="rId18"/>
+      <w:headerReference w:type="first" r:id="rId19"/>
+      <w:footerReference w:type="first" r:id="rId20"/>
       <w:pgSz w:w="12240" w:h="15840"/>
-      <w:pgMar w:top="1440" w:right="1440" w:bottom="1440" w:left="1440" w:header="720" w:footer="720" w:gutter="0"/>
+      <w:pgMar w:top="720" w:right="860" w:bottom="720" w:left="860" w:header="720" w:footer="720" w:gutter="0"/>
       <w:cols w:space="720"/>
       <w:docGrid w:linePitch="360"/>
     </w:sectPr>
   </w:body>
 </w:document>
+</file>
+
+<file path=word/endnotes.xml><?xml version="1.0" encoding="utf-8"?>
+<w:endnotes xmlns:wpc="http://schemas.microsoft.com/office/word/2010/wordprocessingCanvas" xmlns:cx="http://schemas.microsoft.com/office/drawing/2014/chartex" xmlns:cx1="http://schemas.microsoft.com/office/drawing/2015/9/8/chartex" xmlns:cx2="http://schemas.microsoft.com/office/drawing/2015/10/21/chartex" xmlns:cx3="http://schemas.microsoft.com/office/drawing/2016/5/9/chartex" xmlns:cx4="http://schemas.microsoft.com/office/drawing/2016/5/10/chartex" xmlns:cx5="http://schemas.microsoft.com/office/drawing/2016/5/11/chartex" xmlns:cx6="http://schemas.microsoft.com/office/drawing/2016/5/12/chartex" xmlns:cx7="http://schemas.microsoft.com/office/drawing/2016/5/13/chartex" xmlns:cx8="http://schemas.microsoft.com/office/drawing/2016/5/14/chartex" xmlns:mc="http://schemas.openxmlformats.org/markup-compatibility/2006" xmlns:aink="http://schemas.microsoft.com/office/drawing/2016/ink" xmlns:am3d="http://schemas.microsoft.com/office/drawing/2017/model3d" xmlns:o="urn:schemas-microsoft-com:office:office" xmlns:oel="http://schemas.microsoft.com/office/2019/extlst" xmlns:r="http://schemas.openxmlformats.org/officeDocument/2006/relationships" xmlns:m="http://schemas.openxmlformats.org/officeDocument/2006/math" xmlns:v="urn:schemas-microsoft-com:vml" xmlns:wp14="http://schemas.microsoft.com/office/word/2010/wordprocessingDrawing" xmlns:wp="http://schemas.openxmlformats.org/drawingml/2006/wordprocessingDrawing" xmlns:w10="urn:schemas-microsoft-com:office:word" xmlns:w="http://schemas.openxmlformats.org/wordprocessingml/2006/main" xmlns:w14="http://schemas.microsoft.com/office/word/2010/wordml" xmlns:w15="http://schemas.microsoft.com/office/word/2012/wordml" xmlns:w16cex="http://schemas.microsoft.com/office/word/2018/wordml/cex" xmlns:w16cid="http://schemas.microsoft.com/office/word/2016/wordml/cid" xmlns:w16="http://schemas.microsoft.com/office/word/2018/wordml" xmlns:w16du="http://schemas.microsoft.com/office/word/2023/wordml/word16du" xmlns:w16sdtdh="http://schemas.microsoft.com/office/word/2020/wordml/sdtdatahash" xmlns:w16sdtfl="http://schemas.microsoft.com/office/word/2024/wordml/sdtformatlock" xmlns:w16se="http://schemas.microsoft.com/office/word/2015/wordml/symex" xmlns:wpg="http://schemas.microsoft.com/office/word/2010/wordprocessingGroup" xmlns:wpi="http://schemas.microsoft.com/office/word/2010/wordprocessingInk" xmlns:wne="http://schemas.microsoft.com/office/word/2006/wordml" xmlns:wps="http://schemas.microsoft.com/office/word/2010/wordprocessingShape" mc:Ignorable="w14 w15 w16se w16cid w16 w16cex w16sdtdh w16sdtfl w16du wp14">
+  <w:endnote w:type="separator" w:id="-1">
+    <w:p>
+      <w:r>
+        <w:separator/>
+      </w:r>
+    </w:p>
+  </w:endnote>
+  <w:endnote w:type="continuationSeparator" w:id="0">
+    <w:p>
+      <w:r>
+        <w:continuationSeparator/>
+      </w:r>
+    </w:p>
+  </w:endnote>
+</w:endnotes>
+</file>
+
+<file path=word/footer1.xml><?xml version="1.0" encoding="utf-8"?>
+<w:ftr xmlns:wpc="http://schemas.microsoft.com/office/word/2010/wordprocessingCanvas" xmlns:cx="http://schemas.microsoft.com/office/drawing/2014/chartex" xmlns:cx1="http://schemas.microsoft.com/office/drawing/2015/9/8/chartex" xmlns:cx2="http://schemas.microsoft.com/office/drawing/2015/10/21/chartex" xmlns:cx3="http://schemas.microsoft.com/office/drawing/2016/5/9/chartex" xmlns:cx4="http://schemas.microsoft.com/office/drawing/2016/5/10/chartex" xmlns:cx5="http://schemas.microsoft.com/office/drawing/2016/5/11/chartex" xmlns:cx6="http://schemas.microsoft.com/office/drawing/2016/5/12/chartex" xmlns:cx7="http://schemas.microsoft.com/office/drawing/2016/5/13/chartex" xmlns:cx8="http://schemas.microsoft.com/office/drawing/2016/5/14/chartex" xmlns:mc="http://schemas.openxmlformats.org/markup-compatibility/2006" xmlns:aink="http://schemas.microsoft.com/office/drawing/2016/ink" xmlns:am3d="http://schemas.microsoft.com/office/drawing/2017/model3d" xmlns:o="urn:schemas-microsoft-com:office:office" xmlns:oel="http://schemas.microsoft.com/office/2019/extlst" xmlns:r="http://schemas.openxmlformats.org/officeDocument/2006/relationships" xmlns:m="http://schemas.openxmlformats.org/officeDocument/2006/math" xmlns:v="urn:schemas-microsoft-com:vml" xmlns:wp14="http://schemas.microsoft.com/office/word/2010/wordprocessingDrawing" xmlns:wp="http://schemas.openxmlformats.org/drawingml/2006/wordprocessingDrawing" xmlns:w10="urn:schemas-microsoft-com:office:word" xmlns:w="http://schemas.openxmlformats.org/wordprocessingml/2006/main" xmlns:w14="http://schemas.microsoft.com/office/word/2010/wordml" xmlns:w15="http://schemas.microsoft.com/office/word/2012/wordml" xmlns:w16cex="http://schemas.microsoft.com/office/word/2018/wordml/cex" xmlns:w16cid="http://schemas.microsoft.com/office/word/2016/wordml/cid" xmlns:w16="http://schemas.microsoft.com/office/word/2018/wordml" xmlns:w16du="http://schemas.microsoft.com/office/word/2023/wordml/word16du" xmlns:w16sdtdh="http://schemas.microsoft.com/office/word/2020/wordml/sdtdatahash" xmlns:w16sdtfl="http://schemas.microsoft.com/office/word/2024/wordml/sdtformatlock" xmlns:w16se="http://schemas.microsoft.com/office/word/2015/wordml/symex" xmlns:wpg="http://schemas.microsoft.com/office/word/2010/wordprocessingGroup" xmlns:wpi="http://schemas.microsoft.com/office/word/2010/wordprocessingInk" xmlns:wne="http://schemas.microsoft.com/office/word/2006/wordml" xmlns:wps="http://schemas.microsoft.com/office/word/2010/wordprocessingShape" mc:Ignorable="w14 w15 w16se w16cid w16 w16cex w16sdtdh w16sdtfl w16du wp14">
+  <w:p>
+    <w:pPr>
+      <w:pStyle w:val="Footer"/>
+    </w:pPr>
+  </w:p>
+</w:ftr>
+</file>
+
+<file path=word/footer2.xml><?xml version="1.0" encoding="utf-8"?>
+<w:ftr xmlns:wpc="http://schemas.microsoft.com/office/word/2010/wordprocessingCanvas" xmlns:cx="http://schemas.microsoft.com/office/drawing/2014/chartex" xmlns:cx1="http://schemas.microsoft.com/office/drawing/2015/9/8/chartex" xmlns:cx2="http://schemas.microsoft.com/office/drawing/2015/10/21/chartex" xmlns:cx3="http://schemas.microsoft.com/office/drawing/2016/5/9/chartex" xmlns:cx4="http://schemas.microsoft.com/office/drawing/2016/5/10/chartex" xmlns:cx5="http://schemas.microsoft.com/office/drawing/2016/5/11/chartex" xmlns:cx6="http://schemas.microsoft.com/office/drawing/2016/5/12/chartex" xmlns:cx7="http://schemas.microsoft.com/office/drawing/2016/5/13/chartex" xmlns:cx8="http://schemas.microsoft.com/office/drawing/2016/5/14/chartex" xmlns:mc="http://schemas.openxmlformats.org/markup-compatibility/2006" xmlns:aink="http://schemas.microsoft.com/office/drawing/2016/ink" xmlns:am3d="http://schemas.microsoft.com/office/drawing/2017/model3d" xmlns:o="urn:schemas-microsoft-com:office:office" xmlns:oel="http://schemas.microsoft.com/office/2019/extlst" xmlns:r="http://schemas.openxmlformats.org/officeDocument/2006/relationships" xmlns:m="http://schemas.openxmlformats.org/officeDocument/2006/math" xmlns:v="urn:schemas-microsoft-com:vml" xmlns:wp14="http://schemas.microsoft.com/office/word/2010/wordprocessingDrawing" xmlns:wp="http://schemas.openxmlformats.org/drawingml/2006/wordprocessingDrawing" xmlns:w10="urn:schemas-microsoft-com:office:word" xmlns:w="http://schemas.openxmlformats.org/wordprocessingml/2006/main" xmlns:w14="http://schemas.microsoft.com/office/word/2010/wordml" xmlns:w15="http://schemas.microsoft.com/office/word/2012/wordml" xmlns:w16cex="http://schemas.microsoft.com/office/word/2018/wordml/cex" xmlns:w16cid="http://schemas.microsoft.com/office/word/2016/wordml/cid" xmlns:w16="http://schemas.microsoft.com/office/word/2018/wordml" xmlns:w16du="http://schemas.microsoft.com/office/word/2023/wordml/word16du" xmlns:w16sdtdh="http://schemas.microsoft.com/office/word/2020/wordml/sdtdatahash" xmlns:w16sdtfl="http://schemas.microsoft.com/office/word/2024/wordml/sdtformatlock" xmlns:w16se="http://schemas.microsoft.com/office/word/2015/wordml/symex" xmlns:wpg="http://schemas.microsoft.com/office/word/2010/wordprocessingGroup" xmlns:wpi="http://schemas.microsoft.com/office/word/2010/wordprocessingInk" xmlns:wne="http://schemas.microsoft.com/office/word/2006/wordml" xmlns:wps="http://schemas.microsoft.com/office/word/2010/wordprocessingShape" mc:Ignorable="w14 w15 w16se w16cid w16 w16cex w16sdtdh w16sdtfl w16du wp14">
+  <w:p>
+    <w:pPr>
+      <w:pStyle w:val="Footer"/>
+    </w:pPr>
+  </w:p>
+</w:ftr>
+</file>
+
+<file path=word/footer3.xml><?xml version="1.0" encoding="utf-8"?>
+<w:ftr xmlns:wpc="http://schemas.microsoft.com/office/word/2010/wordprocessingCanvas" xmlns:cx="http://schemas.microsoft.com/office/drawing/2014/chartex" xmlns:cx1="http://schemas.microsoft.com/office/drawing/2015/9/8/chartex" xmlns:cx2="http://schemas.microsoft.com/office/drawing/2015/10/21/chartex" xmlns:cx3="http://schemas.microsoft.com/office/drawing/2016/5/9/chartex" xmlns:cx4="http://schemas.microsoft.com/office/drawing/2016/5/10/chartex" xmlns:cx5="http://schemas.microsoft.com/office/drawing/2016/5/11/chartex" xmlns:cx6="http://schemas.microsoft.com/office/drawing/2016/5/12/chartex" xmlns:cx7="http://schemas.microsoft.com/office/drawing/2016/5/13/chartex" xmlns:cx8="http://schemas.microsoft.com/office/drawing/2016/5/14/chartex" xmlns:mc="http://schemas.openxmlformats.org/markup-compatibility/2006" xmlns:aink="http://schemas.microsoft.com/office/drawing/2016/ink" xmlns:am3d="http://schemas.microsoft.com/office/drawing/2017/model3d" xmlns:o="urn:schemas-microsoft-com:office:office" xmlns:oel="http://schemas.microsoft.com/office/2019/extlst" xmlns:r="http://schemas.openxmlformats.org/officeDocument/2006/relationships" xmlns:m="http://schemas.openxmlformats.org/officeDocument/2006/math" xmlns:v="urn:schemas-microsoft-com:vml" xmlns:wp14="http://schemas.microsoft.com/office/word/2010/wordprocessingDrawing" xmlns:wp="http://schemas.openxmlformats.org/drawingml/2006/wordprocessingDrawing" xmlns:w10="urn:schemas-microsoft-com:office:word" xmlns:w="http://schemas.openxmlformats.org/wordprocessingml/2006/main" xmlns:w14="http://schemas.microsoft.com/office/word/2010/wordml" xmlns:w15="http://schemas.microsoft.com/office/word/2012/wordml" xmlns:w16cex="http://schemas.microsoft.com/office/word/2018/wordml/cex" xmlns:w16cid="http://schemas.microsoft.com/office/word/2016/wordml/cid" xmlns:w16="http://schemas.microsoft.com/office/word/2018/wordml" xmlns:w16du="http://schemas.microsoft.com/office/word/2023/wordml/word16du" xmlns:w16sdtdh="http://schemas.microsoft.com/office/word/2020/wordml/sdtdatahash" xmlns:w16sdtfl="http://schemas.microsoft.com/office/word/2024/wordml/sdtformatlock" xmlns:w16se="http://schemas.microsoft.com/office/word/2015/wordml/symex" xmlns:wpg="http://schemas.microsoft.com/office/word/2010/wordprocessingGroup" xmlns:wpi="http://schemas.microsoft.com/office/word/2010/wordprocessingInk" xmlns:wne="http://schemas.microsoft.com/office/word/2006/wordml" xmlns:wps="http://schemas.microsoft.com/office/word/2010/wordprocessingShape" mc:Ignorable="w14 w15 w16se w16cid w16 w16cex w16sdtdh w16sdtfl w16du wp14">
+  <w:p>
+    <w:pPr>
+      <w:pStyle w:val="Footer"/>
+    </w:pPr>
+  </w:p>
+</w:ftr>
+</file>
+
+<file path=word/footnotes.xml><?xml version="1.0" encoding="utf-8"?>
+<w:footnotes xmlns:wpc="http://schemas.microsoft.com/office/word/2010/wordprocessingCanvas" xmlns:cx="http://schemas.microsoft.com/office/drawing/2014/chartex" xmlns:cx1="http://schemas.microsoft.com/office/drawing/2015/9/8/chartex" xmlns:cx2="http://schemas.microsoft.com/office/drawing/2015/10/21/chartex" xmlns:cx3="http://schemas.microsoft.com/office/drawing/2016/5/9/chartex" xmlns:cx4="http://schemas.microsoft.com/office/drawing/2016/5/10/chartex" xmlns:cx5="http://schemas.microsoft.com/office/drawing/2016/5/11/chartex" xmlns:cx6="http://schemas.microsoft.com/office/drawing/2016/5/12/chartex" xmlns:cx7="http://schemas.microsoft.com/office/drawing/2016/5/13/chartex" xmlns:cx8="http://schemas.microsoft.com/office/drawing/2016/5/14/chartex" xmlns:mc="http://schemas.openxmlformats.org/markup-compatibility/2006" xmlns:aink="http://schemas.microsoft.com/office/drawing/2016/ink" xmlns:am3d="http://schemas.microsoft.com/office/drawing/2017/model3d" xmlns:o="urn:schemas-microsoft-com:office:office" xmlns:oel="http://schemas.microsoft.com/office/2019/extlst" xmlns:r="http://schemas.openxmlformats.org/officeDocument/2006/relationships" xmlns:m="http://schemas.openxmlformats.org/officeDocument/2006/math" xmlns:v="urn:schemas-microsoft-com:vml" xmlns:wp14="http://schemas.microsoft.com/office/word/2010/wordprocessingDrawing" xmlns:wp="http://schemas.openxmlformats.org/drawingml/2006/wordprocessingDrawing" xmlns:w10="urn:schemas-microsoft-com:office:word" xmlns:w="http://schemas.openxmlformats.org/wordprocessingml/2006/main" xmlns:w14="http://schemas.microsoft.com/office/word/2010/wordml" xmlns:w15="http://schemas.microsoft.com/office/word/2012/wordml" xmlns:w16cex="http://schemas.microsoft.com/office/word/2018/wordml/cex" xmlns:w16cid="http://schemas.microsoft.com/office/word/2016/wordml/cid" xmlns:w16="http://schemas.microsoft.com/office/word/2018/wordml" xmlns:w16du="http://schemas.microsoft.com/office/word/2023/wordml/word16du" xmlns:w16sdtdh="http://schemas.microsoft.com/office/word/2020/wordml/sdtdatahash" xmlns:w16sdtfl="http://schemas.microsoft.com/office/word/2024/wordml/sdtformatlock" xmlns:w16se="http://schemas.microsoft.com/office/word/2015/wordml/symex" xmlns:wpg="http://schemas.microsoft.com/office/word/2010/wordprocessingGroup" xmlns:wpi="http://schemas.microsoft.com/office/word/2010/wordprocessingInk" xmlns:wne="http://schemas.microsoft.com/office/word/2006/wordml" xmlns:wps="http://schemas.microsoft.com/office/word/2010/wordprocessingShape" mc:Ignorable="w14 w15 w16se w16cid w16 w16cex w16sdtdh w16sdtfl w16du wp14">
+  <w:footnote w:type="separator" w:id="-1">
+    <w:p>
+      <w:r>
+        <w:separator/>
+      </w:r>
+    </w:p>
+  </w:footnote>
+  <w:footnote w:type="continuationSeparator" w:id="0">
+    <w:p>
+      <w:r>
+        <w:continuationSeparator/>
+      </w:r>
+    </w:p>
+  </w:footnote>
+</w:footnotes>
+</file>
+
+<file path=word/header1.xml><?xml version="1.0" encoding="utf-8"?>
+<w:hdr xmlns:wpc="http://schemas.microsoft.com/office/word/2010/wordprocessingCanvas" xmlns:cx="http://schemas.microsoft.com/office/drawing/2014/chartex" xmlns:cx1="http://schemas.microsoft.com/office/drawing/2015/9/8/chartex" xmlns:cx2="http://schemas.microsoft.com/office/drawing/2015/10/21/chartex" xmlns:cx3="http://schemas.microsoft.com/office/drawing/2016/5/9/chartex" xmlns:cx4="http://schemas.microsoft.com/office/drawing/2016/5/10/chartex" xmlns:cx5="http://schemas.microsoft.com/office/drawing/2016/5/11/chartex" xmlns:cx6="http://schemas.microsoft.com/office/drawing/2016/5/12/chartex" xmlns:cx7="http://schemas.microsoft.com/office/drawing/2016/5/13/chartex" xmlns:cx8="http://schemas.microsoft.com/office/drawing/2016/5/14/chartex" xmlns:mc="http://schemas.openxmlformats.org/markup-compatibility/2006" xmlns:aink="http://schemas.microsoft.com/office/drawing/2016/ink" xmlns:am3d="http://schemas.microsoft.com/office/drawing/2017/model3d" xmlns:o="urn:schemas-microsoft-com:office:office" xmlns:oel="http://schemas.microsoft.com/office/2019/extlst" xmlns:r="http://schemas.openxmlformats.org/officeDocument/2006/relationships" xmlns:m="http://schemas.openxmlformats.org/officeDocument/2006/math" xmlns:v="urn:schemas-microsoft-com:vml" xmlns:wp14="http://schemas.microsoft.com/office/word/2010/wordprocessingDrawing" xmlns:wp="http://schemas.openxmlformats.org/drawingml/2006/wordprocessingDrawing" xmlns:w10="urn:schemas-microsoft-com:office:word" xmlns:w="http://schemas.openxmlformats.org/wordprocessingml/2006/main" xmlns:w14="http://schemas.microsoft.com/office/word/2010/wordml" xmlns:w15="http://schemas.microsoft.com/office/word/2012/wordml" xmlns:w16cex="http://schemas.microsoft.com/office/word/2018/wordml/cex" xmlns:w16cid="http://schemas.microsoft.com/office/word/2016/wordml/cid" xmlns:w16="http://schemas.microsoft.com/office/word/2018/wordml" xmlns:w16du="http://schemas.microsoft.com/office/word/2023/wordml/word16du" xmlns:w16sdtdh="http://schemas.microsoft.com/office/word/2020/wordml/sdtdatahash" xmlns:w16sdtfl="http://schemas.microsoft.com/office/word/2024/wordml/sdtformatlock" xmlns:w16se="http://schemas.microsoft.com/office/word/2015/wordml/symex" xmlns:wpg="http://schemas.microsoft.com/office/word/2010/wordprocessingGroup" xmlns:wpi="http://schemas.microsoft.com/office/word/2010/wordprocessingInk" xmlns:wne="http://schemas.microsoft.com/office/word/2006/wordml" xmlns:wps="http://schemas.microsoft.com/office/word/2010/wordprocessingShape" mc:Ignorable="w14 w15 w16se w16cid w16 w16cex w16sdtdh w16sdtfl w16du wp14">
+  <w:p>
+    <w:pPr>
+      <w:pStyle w:val="Header"/>
+    </w:pPr>
+  </w:p>
+</w:hdr>
+</file>
+
+<file path=word/header2.xml><?xml version="1.0" encoding="utf-8"?>
+<w:hdr xmlns:wpc="http://schemas.microsoft.com/office/word/2010/wordprocessingCanvas" xmlns:cx="http://schemas.microsoft.com/office/drawing/2014/chartex" xmlns:cx1="http://schemas.microsoft.com/office/drawing/2015/9/8/chartex" xmlns:cx2="http://schemas.microsoft.com/office/drawing/2015/10/21/chartex" xmlns:cx3="http://schemas.microsoft.com/office/drawing/2016/5/9/chartex" xmlns:cx4="http://schemas.microsoft.com/office/drawing/2016/5/10/chartex" xmlns:cx5="http://schemas.microsoft.com/office/drawing/2016/5/11/chartex" xmlns:cx6="http://schemas.microsoft.com/office/drawing/2016/5/12/chartex" xmlns:cx7="http://schemas.microsoft.com/office/drawing/2016/5/13/chartex" xmlns:cx8="http://schemas.microsoft.com/office/drawing/2016/5/14/chartex" xmlns:mc="http://schemas.openxmlformats.org/markup-compatibility/2006" xmlns:aink="http://schemas.microsoft.com/office/drawing/2016/ink" xmlns:am3d="http://schemas.microsoft.com/office/drawing/2017/model3d" xmlns:o="urn:schemas-microsoft-com:office:office" xmlns:oel="http://schemas.microsoft.com/office/2019/extlst" xmlns:r="http://schemas.openxmlformats.org/officeDocument/2006/relationships" xmlns:m="http://schemas.openxmlformats.org/officeDocument/2006/math" xmlns:v="urn:schemas-microsoft-com:vml" xmlns:wp14="http://schemas.microsoft.com/office/word/2010/wordprocessingDrawing" xmlns:wp="http://schemas.openxmlformats.org/drawingml/2006/wordprocessingDrawing" xmlns:w10="urn:schemas-microsoft-com:office:word" xmlns:w="http://schemas.openxmlformats.org/wordprocessingml/2006/main" xmlns:w14="http://schemas.microsoft.com/office/word/2010/wordml" xmlns:w15="http://schemas.microsoft.com/office/word/2012/wordml" xmlns:w16cex="http://schemas.microsoft.com/office/word/2018/wordml/cex" xmlns:w16cid="http://schemas.microsoft.com/office/word/2016/wordml/cid" xmlns:w16="http://schemas.microsoft.com/office/word/2018/wordml" xmlns:w16du="http://schemas.microsoft.com/office/word/2023/wordml/word16du" xmlns:w16sdtdh="http://schemas.microsoft.com/office/word/2020/wordml/sdtdatahash" xmlns:w16sdtfl="http://schemas.microsoft.com/office/word/2024/wordml/sdtformatlock" xmlns:w16se="http://schemas.microsoft.com/office/word/2015/wordml/symex" xmlns:wpg="http://schemas.microsoft.com/office/word/2010/wordprocessingGroup" xmlns:wpi="http://schemas.microsoft.com/office/word/2010/wordprocessingInk" xmlns:wne="http://schemas.microsoft.com/office/word/2006/wordml" xmlns:wps="http://schemas.microsoft.com/office/word/2010/wordprocessingShape" mc:Ignorable="w14 w15 w16se w16cid w16 w16cex w16sdtdh w16sdtfl w16du wp14">
+  <w:p>
+    <w:pPr>
+      <w:pStyle w:val="Header"/>
+    </w:pPr>
+  </w:p>
+</w:hdr>
+</file>
+
+<file path=word/header3.xml><?xml version="1.0" encoding="utf-8"?>
+<w:hdr xmlns:wpc="http://schemas.microsoft.com/office/word/2010/wordprocessingCanvas" xmlns:cx="http://schemas.microsoft.com/office/drawing/2014/chartex" xmlns:cx1="http://schemas.microsoft.com/office/drawing/2015/9/8/chartex" xmlns:cx2="http://schemas.microsoft.com/office/drawing/2015/10/21/chartex" xmlns:cx3="http://schemas.microsoft.com/office/drawing/2016/5/9/chartex" xmlns:cx4="http://schemas.microsoft.com/office/drawing/2016/5/10/chartex" xmlns:cx5="http://schemas.microsoft.com/office/drawing/2016/5/11/chartex" xmlns:cx6="http://schemas.microsoft.com/office/drawing/2016/5/12/chartex" xmlns:cx7="http://schemas.microsoft.com/office/drawing/2016/5/13/chartex" xmlns:cx8="http://schemas.microsoft.com/office/drawing/2016/5/14/chartex" xmlns:mc="http://schemas.openxmlformats.org/markup-compatibility/2006" xmlns:aink="http://schemas.microsoft.com/office/drawing/2016/ink" xmlns:am3d="http://schemas.microsoft.com/office/drawing/2017/model3d" xmlns:o="urn:schemas-microsoft-com:office:office" xmlns:oel="http://schemas.microsoft.com/office/2019/extlst" xmlns:r="http://schemas.openxmlformats.org/officeDocument/2006/relationships" xmlns:m="http://schemas.openxmlformats.org/officeDocument/2006/math" xmlns:v="urn:schemas-microsoft-com:vml" xmlns:wp14="http://schemas.microsoft.com/office/word/2010/wordprocessingDrawing" xmlns:wp="http://schemas.openxmlformats.org/drawingml/2006/wordprocessingDrawing" xmlns:w10="urn:schemas-microsoft-com:office:word" xmlns:w="http://schemas.openxmlformats.org/wordprocessingml/2006/main" xmlns:w14="http://schemas.microsoft.com/office/word/2010/wordml" xmlns:w15="http://schemas.microsoft.com/office/word/2012/wordml" xmlns:w16cex="http://schemas.microsoft.com/office/word/2018/wordml/cex" xmlns:w16cid="http://schemas.microsoft.com/office/word/2016/wordml/cid" xmlns:w16="http://schemas.microsoft.com/office/word/2018/wordml" xmlns:w16du="http://schemas.microsoft.com/office/word/2023/wordml/word16du" xmlns:w16sdtdh="http://schemas.microsoft.com/office/word/2020/wordml/sdtdatahash" xmlns:w16sdtfl="http://schemas.microsoft.com/office/word/2024/wordml/sdtformatlock" xmlns:w16se="http://schemas.microsoft.com/office/word/2015/wordml/symex" xmlns:wpg="http://schemas.microsoft.com/office/word/2010/wordprocessingGroup" xmlns:wpi="http://schemas.microsoft.com/office/word/2010/wordprocessingInk" xmlns:wne="http://schemas.microsoft.com/office/word/2006/wordml" xmlns:wps="http://schemas.microsoft.com/office/word/2010/wordprocessingShape" mc:Ignorable="w14 w15 w16se w16cid w16 w16cex w16sdtdh w16sdtfl w16du wp14">
+  <w:p>
+    <w:pPr>
+      <w:pStyle w:val="Header"/>
+    </w:pPr>
+  </w:p>
+</w:hdr>
 </file>
 
 <file path=word/numbering.xml><?xml version="1.0" encoding="utf-8"?>
@@ -3261,7 +4803,7 @@
     <w:qFormat/>
     <w:pPr>
       <w:pBdr>
-        <w:bottom w:val="single" w:sz="8" w:space="2" w:color="102A43"/>
+        <w:bottom w:val="single" w:sz="4" w:space="2" w:color="102A43"/>
       </w:pBdr>
       <w:spacing w:after="60"/>
       <w:outlineLvl w:val="1"/>
@@ -3279,7 +4821,6 @@
   <w:style w:type="character" w:default="1" w:styleId="DefaultParagraphFont">
     <w:name w:val="Default Paragraph Font"/>
     <w:uiPriority w:val="1"/>
-    <w:semiHidden/>
     <w:unhideWhenUsed/>
   </w:style>
   <w:style w:type="table" w:default="1" w:styleId="TableNormal">
@@ -3307,7 +4848,6 @@
     <w:name w:val="Hyperlink"/>
     <w:basedOn w:val="DefaultParagraphFont"/>
     <w:uiPriority w:val="99"/>
-    <w:semiHidden/>
     <w:unhideWhenUsed/>
     <w:rPr>
       <w:strike w:val="0"/>
@@ -3348,12 +4888,15 @@
     <w:basedOn w:val="DefaultParagraphFont"/>
     <w:link w:val="Heading2"/>
     <w:uiPriority w:val="9"/>
-    <w:semiHidden/>
     <w:rPr>
-      <w:rFonts w:asciiTheme="majorHAnsi" w:eastAsiaTheme="majorEastAsia" w:hAnsiTheme="majorHAnsi" w:cstheme="majorBidi"/>
-      <w:color w:val="2F5496" w:themeColor="accent1" w:themeShade="BF"/>
-      <w:sz w:val="32"/>
-      <w:szCs w:val="32"/>
+      <w:rFonts w:eastAsiaTheme="minorEastAsia"/>
+      <w:b/>
+      <w:bCs/>
+      <w:caps/>
+      <w:color w:val="102A43"/>
+      <w:spacing w:val="15"/>
+      <w:sz w:val="21"/>
+      <w:szCs w:val="21"/>
     </w:rPr>
   </w:style>
   <w:style w:type="paragraph" w:customStyle="1" w:styleId="msonormal0">
@@ -3367,8 +4910,8 @@
     <w:semiHidden/>
     <w:unhideWhenUsed/>
   </w:style>
-  <w:style w:type="paragraph" w:customStyle="1" w:styleId="title">
-    <w:name w:val="title"/>
+  <w:style w:type="paragraph" w:customStyle="1" w:styleId="Title1">
+    <w:name w:val="Title1"/>
     <w:basedOn w:val="Normal"/>
     <w:pPr>
       <w:spacing w:before="15" w:after="75"/>
@@ -3592,6 +5135,81 @@
       <w:i/>
       <w:iCs/>
       <w:color w:val="52606D"/>
+    </w:rPr>
+  </w:style>
+  <w:style w:type="paragraph" w:styleId="Header">
+    <w:name w:val="header"/>
+    <w:basedOn w:val="Normal"/>
+    <w:link w:val="HeaderChar"/>
+    <w:uiPriority w:val="99"/>
+    <w:unhideWhenUsed/>
+    <w:rsid w:val="00C06BDB"/>
+    <w:pPr>
+      <w:tabs>
+        <w:tab w:val="center" w:pos="4680"/>
+        <w:tab w:val="right" w:pos="9360"/>
+      </w:tabs>
+    </w:pPr>
+  </w:style>
+  <w:style w:type="character" w:customStyle="1" w:styleId="HeaderChar">
+    <w:name w:val="Header Char"/>
+    <w:basedOn w:val="DefaultParagraphFont"/>
+    <w:link w:val="Header"/>
+    <w:uiPriority w:val="99"/>
+    <w:rsid w:val="00C06BDB"/>
+    <w:rPr>
+      <w:rFonts w:eastAsiaTheme="minorEastAsia"/>
+      <w:sz w:val="24"/>
+      <w:szCs w:val="24"/>
+    </w:rPr>
+  </w:style>
+  <w:style w:type="paragraph" w:styleId="Footer">
+    <w:name w:val="footer"/>
+    <w:basedOn w:val="Normal"/>
+    <w:link w:val="FooterChar"/>
+    <w:uiPriority w:val="99"/>
+    <w:unhideWhenUsed/>
+    <w:rsid w:val="00C06BDB"/>
+    <w:pPr>
+      <w:tabs>
+        <w:tab w:val="center" w:pos="4680"/>
+        <w:tab w:val="right" w:pos="9360"/>
+      </w:tabs>
+    </w:pPr>
+  </w:style>
+  <w:style w:type="character" w:customStyle="1" w:styleId="FooterChar">
+    <w:name w:val="Footer Char"/>
+    <w:basedOn w:val="DefaultParagraphFont"/>
+    <w:link w:val="Footer"/>
+    <w:uiPriority w:val="99"/>
+    <w:rsid w:val="00C06BDB"/>
+    <w:rPr>
+      <w:rFonts w:eastAsiaTheme="minorEastAsia"/>
+      <w:sz w:val="24"/>
+      <w:szCs w:val="24"/>
+    </w:rPr>
+  </w:style>
+  <w:style w:type="paragraph" w:styleId="ListParagraph">
+    <w:name w:val="List Paragraph"/>
+    <w:basedOn w:val="Normal"/>
+    <w:uiPriority w:val="34"/>
+    <w:qFormat/>
+    <w:rsid w:val="00C06BDB"/>
+    <w:pPr>
+      <w:ind w:left="720"/>
+      <w:contextualSpacing/>
+    </w:pPr>
+  </w:style>
+  <w:style w:type="character" w:styleId="UnresolvedMention">
+    <w:name w:val="Unresolved Mention"/>
+    <w:basedOn w:val="DefaultParagraphFont"/>
+    <w:uiPriority w:val="99"/>
+    <w:semiHidden/>
+    <w:unhideWhenUsed/>
+    <w:rsid w:val="00E06290"/>
+    <w:rPr>
+      <w:color w:val="605E5C"/>
+      <w:shd w:val="clear" w:color="auto" w:fill="E1DFDD"/>
     </w:rPr>
   </w:style>
 </w:styles>
@@ -3890,4 +5508,26 @@
     </a:ext>
   </a:extLst>
 </a:theme>
+</file>
+
+<file path=word/webextensions/taskpanes.xml><?xml version="1.0" encoding="utf-8"?>
+<wetp:taskpanes xmlns:wetp="http://schemas.microsoft.com/office/webextensions/taskpanes/2010/11">
+  <wetp:taskpane dockstate="right" visibility="0" width="366" row="0">
+    <wetp:webextensionref xmlns:r="http://schemas.openxmlformats.org/officeDocument/2006/relationships" r:id="rId1"/>
+  </wetp:taskpane>
+</wetp:taskpanes>
+</file>
+
+<file path=word/webextensions/webextension1.xml><?xml version="1.0" encoding="utf-8"?>
+<we:webextension xmlns:we="http://schemas.microsoft.com/office/webextensions/webextension/2010/11" id="{EB9B1C62-66AB-4CDB-8141-2744820EC7F7}">
+  <we:reference id="wa200010453" version="1.0.0.1" store="en-US" storeType="OMEX"/>
+  <we:alternateReferences>
+    <we:reference id="wa200010453" version="1.0.0.1" store="wa200010453" storeType="OMEX"/>
+  </we:alternateReferences>
+  <we:properties>
+    <we:property name="claude.fileId" value="&quot;acc42169-dd26-4bf4-bb1c-d1d61df3df3f&quot;"/>
+  </we:properties>
+  <we:bindings/>
+  <we:snapshot xmlns:r="http://schemas.openxmlformats.org/officeDocument/2006/relationships"/>
+</we:webextension>
 </file>
</xml_diff>